<commit_message>
S6-S7 (preliminary): in-context panel review, revision round analyses (trend-adjusted, pre-growth, leave-one-market-out), Internet Appendix; export blinded review copy
Co-Authored-By: Claude Opus 5.5 <noreply@anthropic.com>
Claude-Session: https://claude.ai/code/session_01Ka6Duc4zGYgPZcHc3gHgFv
</commit_message>
<xml_diff>
--- a/manuscript/Manuscript_Anonymized.docx
+++ b/manuscript/Manuscript_Anonymized.docx
@@ -12,7 +12,7 @@
           <w:b/>
           <w:sz w:val="28"/>
         </w:rPr>
-        <w:t>ESG Rating Coverage Follows Firm Value: Evidence from Five Southeast Asian Equity Markets</w:t>
+        <w:t>Rated Firms Gain Value Before, Not After, Their First ESG Score: Evidence from Five Southeast Asian Markets</w:t>
       </w:r>
     </w:p>
     <w:p>
@@ -45,7 +45,7 @@
       </w:pPr>
       <w:r>
         <w:rPr/>
-        <w:t>Environmental, social, and governance (ESG) rating providers extended coverage to hundreds of listed firms in Indonesia, Malaysia, the Philippines, Singapore, and Thailand after 2018. Using the staggered first appearance of London Stock Exchange Group (LSEG) ESG scores for 675 non-financial firms and 2,613 never-rated firms, we estimate heterogeneity-robust difference-in-differences effects. Rated firms' market capitalization grew 14.1 percent faster than that of comparable firms over the five years before their first score. After the first score, market-to-book ratios did not change (estimate 0.002; 95% confidence interval −0.046 to 0.048). Coverage follows firm value rather than raising it.</w:t>
+        <w:t>Environmental, social, and governance (ESG) rating providers extended coverage to hundreds of listed firms in Indonesia, Malaysia, the Philippines, Singapore, and Thailand after 2018. Using the staggered first appearance of London Stock Exchange Group (LSEG) ESG scores for 675 non-financial firms and 2,613 never-rated firms, we estimate heterogeneity-robust difference-in-differences effects. Rated firms' market capitalization grew 14.1 percent faster than that of comparable firms over the five years before their first score. After the first score, market-to-book ratios did not change (estimate 0.002; 95% confidence interval −0.046 to 0.048). Rated firms gained value before, not after, their first score.</w:t>
       </w:r>
     </w:p>
     <w:p>
@@ -115,7 +115,7 @@
       </w:pPr>
       <w:r>
         <w:rPr/>
-        <w:t>The opposite prediction is also plausible. Rating providers choose which firms to cover, and they tend to add firms that have become large or liquid enough to enter the indices their clients track. If coverage responds to past growth in market value, rated firms will look more valuable than unrated firms without coverage having caused any change. Evidence on coverage initiation so far comes from U.S. firms and concerns firm conduct rather than valuation. Tsang, Wang, Xiang, and Yu (2024) find that firms covered by more ESG rating agencies commit fewer ESG violations, and Bikmetova and Pirinsky (2026) find that coverage is followed by lower toxic emissions, better ratings, and higher ownership by ESG-oriented institutions.</w:t>
+        <w:t>The opposite prediction is also plausible. Rating providers choose which firms to cover, and they tend to add firms that have become large or liquid enough to enter the indices their clients track. If coverage responds to past growth in market value, rated firms will look more valuable than unrated firms without coverage having caused any change. Coverage decisions of this kind resemble index additions, and additions to a major index raise prices around the announcement (Shleifer, 1986; Harris and Gurel, 1986); a first ESG score that arrives with index membership could therefore coincide with price effects that have little to do with the score itself. Evidence on coverage initiation so far comes from U.S. firms and concerns firm conduct rather than valuation. Tsang, Wang, Xiang, and Yu (2024) find that firms covered by more ESG rating agencies commit fewer ESG violations, and Bikmetova and Pirinsky (2026) find that coverage is followed by lower toxic emissions, better ratings, and higher ownership by ESG-oriented institutions.</w:t>
       </w:r>
     </w:p>
     <w:p>
@@ -148,7 +148,7 @@
       </w:pPr>
       <w:r>
         <w:rPr/>
-        <w:t>We report two findings. First, coverage does not change valuation. The average effect on log MTB over the first four years of coverage is 0.002 (standard error 0.024), and the 95% confidence interval rules out effects larger than about 4.9 percent in either direction. Second, coverage arrives after a period of fast growth. Relative to never-rated firms with similar size, country, and industry, rated firms' market capitalization grew 14.1 percent and their MTB ratio 10.0 percent over the five years before the first score. After the first score, the valuation gap stops widening. The pattern fits a provider that follows market value rather than a rating that creates it.</w:t>
+        <w:t>We report two findings. First, coverage does not change valuation. The average effect on log MTB over the first four years of coverage is 0.002 (standard error 0.024), and the 95% confidence interval excludes changes in the MTB ratio outside the range from −4.5 to 4.9 percent. Second, coverage arrives after a period of fast growth. Relative to never-rated firms with similar size, country, and industry, rated firms' market capitalization grew 14.1 percent and their MTB ratio 10.0 percent over the five years before the first score. After the first score, the valuation gap stops widening. When we remove a linear extrapolation of the pre-coverage trend, the post-coverage MTB effect becomes −0.052 and remains insignificant, and excluding any one of the five markets leaves it between −0.007 and 0.017. The evidence is consistent with coverage that arrives after firms have grown, and it gives no support to a valuation gain from the first score.</w:t>
       </w:r>
     </w:p>
     <w:p>
@@ -208,7 +208,7 @@
       </w:pPr>
       <w:r>
         <w:rPr/>
-        <w:t>The data set covers all 3,709 firms listed in Indonesia, Malaysia, the Philippines, Singapore, and Thailand from 2014 to 2024 (40,799 firm-years). It combines annual LSEG ESG scores (LSEG, 2025) with accounting and market data from Compustat Global (S&amp;P Global Market Intelligence, 2025). This data set also underlies a companion study with a different research question (details withheld for anonymous review). That study uses only firm-years with ESG and governance data and asks how reporting standards and board structure relate to the gap between ESG scores and controversy scores. The present paper uses the full listed universe, treats the first appearance of an ESG score as an event, and studies market valuation and financing. No variable, estimate, table, or figure is shared between the two papers.</w:t>
+        <w:t>The data set covers all 3,709 firms listed in Indonesia, Malaysia, the Philippines, Singapore, and Thailand from 2014 to 2024 (40,799 firm-years). It combines annual LSEG ESG scores (LSEG, 2025), which were distributed as Refinitiv ESG scores and earlier as ASSET4 scores, with accounting and market data from Compustat Global (S&amp;P Global Market Intelligence, 2025). This data set also underlies a companion study with a different research question (details withheld for anonymous review). That study uses only firm-years with ESG and governance data and asks how reporting standards and board structure relate to the gap between ESG scores and controversy scores. The present paper uses the full listed universe, treats the first appearance of an ESG score as an event, and studies market valuation and financing. No variable, estimate, table, or figure is shared between the two papers.</w:t>
       </w:r>
     </w:p>
     <w:p>
@@ -219,7 +219,18 @@
       </w:pPr>
       <w:r>
         <w:rPr/>
-        <w:t>We drop financial firms, which leaves 3,423 firms. A firm's treatment year is the first fiscal year with a non-missing LSEG ESG score. Once a firm is scored, it almost always remains scored, so we treat coverage as permanent. We drop the 135 firms already scored in 2014 because they have no pre-coverage year. The estimation sample has 3,288 firms and 36,168 firm-years: 675 firms first scored between 2015 and 2024 and 2,613 firms never scored. Coverage expanded in waves that differ by market. Thailand and Singapore account for 108 first scores in 2019 and 2020, and Malaysia for 289 first scores in 2021 and 2022.</w:t>
+        <w:t>We drop financial firms, which leaves 3,423 firms. A firm's treatment year is the first fiscal year with a non-missing LSEG ESG score. Once a firm is scored, it almost always remains scored (17 of the 675 scored firms have a later year without a score), so we treat coverage as permanent. We drop the 135 firms already scored in 2014 because they have no pre-coverage year. The estimation sample has 3,288 firms and 36,168 firm-years: 675 firms first scored between 2015 and 2024 and 2,613 firms never scored. Coverage expanded in waves that differ by market (Table IA2 of the Internet Appendix). Thailand and Singapore account for 108 first scores in 2019 and 2020, and Malaysia for 289 first scores in 2021 and 2022. The data do not record why the provider expanded coverage in a given market and year.</w:t>
+      </w:r>
+    </w:p>
+    <w:p>
+      <w:pPr>
+        <w:spacing w:line="360" w:lineRule="auto" w:after="120" w:before="0"/>
+        <w:ind w:firstLine="432"/>
+        <w:jc w:val="both"/>
+      </w:pPr>
+      <w:r>
+        <w:rPr/>
+        <w:t>The treatment year is the first year for which the downloaded data contain a score, which need not be the year in which a score was first published. Berg, Fabisik, and Sautner (2020) document that the provider rewrote historical scores on a large scale. If historical years were filled in when a firm entered coverage, our treatment year precedes the first published score. Post-coverage estimates would then mix years before and after publication, and the initial scores that we use to split the sample could be revised values. Backfilling cannot, however, move any recorded score into the years before the treatment year, so it does not create the pre-coverage run-up that we report.</w:t>
       </w:r>
     </w:p>
     <w:p>
@@ -335,7 +346,27 @@
       </w:r>
       <w:r>
         <w:rPr/>
-        <w:t>ATT(g,t) = mean over scored firms of [ΔY</w:t>
+        <w:t>ATT(g,t) = (1/N</w:t>
+      </w:r>
+      <w:r>
+        <w:rPr>
+          <w:vertAlign w:val="subscript"/>
+        </w:rPr>
+        <w:t>g</w:t>
+      </w:r>
+      <w:r>
+        <w:rPr/>
+        <w:t>) Σ</w:t>
+      </w:r>
+      <w:r>
+        <w:rPr>
+          <w:vertAlign w:val="subscript"/>
+        </w:rPr>
+        <w:t>i∈g</w:t>
+      </w:r>
+      <w:r>
+        <w:rPr/>
+        <w:t xml:space="preserve"> (ΔY</w:t>
       </w:r>
       <w:r>
         <w:rPr>
@@ -355,7 +386,7 @@
       </w:r>
       <w:r>
         <w:rPr/>
-        <w:t>]</w:t>
+        <w:t>)</w:t>
       </w:r>
       <w:r>
         <w:tab/>
@@ -370,7 +401,27 @@
       </w:pPr>
       <w:r>
         <w:rPr/>
-        <w:t>where ΔY</w:t>
+        <w:t>where the sum runs over the N</w:t>
+      </w:r>
+      <w:r>
+        <w:rPr>
+          <w:vertAlign w:val="subscript"/>
+        </w:rPr>
+        <w:t>g</w:t>
+      </w:r>
+      <w:r>
+        <w:rPr/>
+        <w:t xml:space="preserve"> firms first scored in year </w:t>
+      </w:r>
+      <w:r>
+        <w:rPr>
+          <w:i/>
+        </w:rPr>
+        <w:t>g</w:t>
+      </w:r>
+      <w:r>
+        <w:rPr/>
+        <w:t>, ΔY</w:t>
       </w:r>
       <w:r>
         <w:rPr>
@@ -410,7 +461,7 @@
       </w:r>
       <w:r>
         <w:rPr/>
-        <w:t xml:space="preserve"> and ΔŶ</w:t>
+        <w:t>, and ΔŶ</w:t>
       </w:r>
       <w:r>
         <w:rPr>
@@ -476,6 +527,37 @@
     </w:p>
     <w:p>
       <w:pPr>
+        <w:spacing w:line="360" w:lineRule="auto" w:after="120" w:before="0"/>
+        <w:ind w:firstLine="432"/>
+        <w:jc w:val="both"/>
+      </w:pPr>
+      <w:r>
+        <w:rPr/>
+        <w:t xml:space="preserve">After the first round of review we added three exploratory checks that the plan did not contain. First, we fit a line through the pre-coverage event-time estimates (constrained to pass through zero in the base year), extrapolate it to the post-coverage years, and subtract it; this is a simple member of the family of trend-robust approaches formalized by Rambachan and Roth (2023). Second, we add the growth in log market capitalization from year </w:t>
+      </w:r>
+      <w:r>
+        <w:rPr>
+          <w:i/>
+        </w:rPr>
+        <w:t>g</w:t>
+      </w:r>
+      <w:r>
+        <w:rPr/>
+        <w:t xml:space="preserve"> − 3 to year </w:t>
+      </w:r>
+      <w:r>
+        <w:rPr>
+          <w:i/>
+        </w:rPr>
+        <w:t>g</w:t>
+      </w:r>
+      <w:r>
+        <w:rPr/>
+        <w:t xml:space="preserve"> − 1 to the covariates, which compares scored firms with never-scored firms that grew at a similar rate before coverage. Third, we re-estimate the model five times, each time excluding one market. All three use the same bootstrap draws as the main estimates.</w:t>
+      </w:r>
+    </w:p>
+    <w:p>
+      <w:pPr>
         <w:keepNext/>
         <w:spacing w:line="360" w:lineRule="auto" w:after="120" w:before="120"/>
       </w:pPr>
@@ -496,7 +578,7 @@
       </w:pPr>
       <w:r>
         <w:rPr/>
-        <w:t>The authors used Claude (Anthropic), accessed through Claude Code in September 2026, to write and debug the R code, draft and edit the text, and search for and check references. The authors specified the research question and the pre-analysis plan, reviewed every output of the tool, checked each reported number against the R output files, and take full responsibility for the content.</w:t>
+        <w:t>The authors used Claude (Anthropic), accessed through Claude Code in September 2026, to write and debug the R code, draft and edit the text, and search for and check references. The tool also screened candidate research questions and drafted the pre-analysis plan. The authors reviewed and approved the research question and the plan before any estimation, reviewed every output of the tool, checked each reported number against the R output files, and take full responsibility for the content.</w:t>
       </w:r>
     </w:p>
     <w:p>
@@ -559,7 +641,7 @@
       </w:pPr>
       <w:r>
         <w:rPr/>
-        <w:t xml:space="preserve">Table 2 reports the average effects over the first four years of coverage. The effect on log MTB is 0.002 with a 95% confidence interval from −0.046 to 0.048. The minimum detectable effect is 0.067, or about 7.0 percent of the MTB ratio, so the design has the power to detect valuation effects of the size implied by a meaningful shift in the investor base. The effect on log market capitalization is −0.055 (Holm-adjusted </w:t>
+        <w:t xml:space="preserve">Table 2 reports the average effects over the first four years of coverage. The effect on log MTB is 0.002 with a 95% confidence interval from −0.046 to 0.048. The minimum detectable effect is 0.067, so an effect of about 7.0 percent on the MTB ratio would be detected with 80% probability. The effect on log market capitalization is −0.055 (Holm-adjusted </w:t>
       </w:r>
       <w:r>
         <w:rPr>
@@ -610,7 +692,7 @@
       </w:pPr>
       <w:r>
         <w:rPr/>
-        <w:t xml:space="preserve">Figure 1 shows the dynamics. Before the first score, the coefficients for market capitalization and MTB are negative and increase toward zero: relative to the year before coverage, scored firms' market capitalization was −0.132 log points lower five years earlier and −0.125 log points lower four years earlier than the counterfactual path implied by never-scored firms. For MTB the corresponding estimates are −0.095 and −0.082. Scored firms therefore gained value faster than comparable firms before they were rated. The joint test that all pre-coverage coefficients are zero gives </w:t>
+        <w:t xml:space="preserve">Figure 1 shows the dynamics. Before the first score, the coefficients for market capitalization and MTB are negative and rise toward zero. For market capitalization, the estimates are −0.132 five years and −0.125 four years before the base year; for MTB, they are −0.095 and −0.082. A negative pre-coverage coefficient means that the scored firms' outcome was lower, relative to its base-year level, than the path of comparable never-scored firms implies. Scored firms therefore gained value faster than comparable firms before they were rated. The joint test that all pre-coverage coefficients are zero gives </w:t>
       </w:r>
       <w:r>
         <w:rPr>
@@ -630,7 +712,7 @@
       </w:r>
       <w:r>
         <w:rPr/>
-        <w:t xml:space="preserve"> = 0.074 for MTB. After the first score, the MTB coefficients stay between −0.044 and 0.017 and none differs from zero at the 5% level. Leverage shows a different profile: it is higher before coverage relative to the base year (pre-trend </w:t>
+        <w:t xml:space="preserve"> = 0.074 for MTB. From the year of the first score to three years later, the MTB coefficients lie between −0.044 and 0.017, and none differs from zero at the 5% level. Leverage shows a different profile: it is higher before coverage relative to the base year (pre-trend </w:t>
       </w:r>
       <w:r>
         <w:rPr>
@@ -717,6 +799,47 @@
       </w:pPr>
       <w:r>
         <w:rPr/>
+        <w:t>Rows R7 to R9 report the exploratory checks. Removing the linear pre-trend changes the MTB effect to −0.052 (95% confidence interval −0.118 to 0.014); the point estimate is negative because the pre-coverage run-up would have continued under a linear trend, but the interval includes zero. For market capitalization the same adjustment gives −0.134 (</w:t>
+      </w:r>
+      <w:r>
+        <w:rPr>
+          <w:i/>
+        </w:rPr>
+        <w:t>p</w:t>
+      </w:r>
+      <w:r>
+        <w:rPr/>
+        <w:t xml:space="preserve"> = 0.001): relative to a continued linear run-up, rated firms' market value grew more slowly after coverage. Conditioning on pre-coverage growth gives 0.028 (</w:t>
+      </w:r>
+      <w:r>
+        <w:rPr>
+          <w:i/>
+        </w:rPr>
+        <w:t>p</w:t>
+      </w:r>
+      <w:r>
+        <w:rPr/>
+        <w:t xml:space="preserve"> = 0.265), and excluding Malaysia gives −0.003 (</w:t>
+      </w:r>
+      <w:r>
+        <w:rPr>
+          <w:i/>
+        </w:rPr>
+        <w:t>p</w:t>
+      </w:r>
+      <w:r>
+        <w:rPr/>
+        <w:t xml:space="preserve"> = 0.940). Across all five leave-one-market-out samples (Table IA1 of the Internet Appendix), the MTB effect ranges from −0.007 to 0.017. The market capitalization effect is less stable: it turns to 0.037 when Malaysian firms are excluded, so the negative baseline estimate for market capitalization reflects the large Malaysian cohorts of 2021 and 2022.</w:t>
+      </w:r>
+    </w:p>
+    <w:p>
+      <w:pPr>
+        <w:spacing w:line="360" w:lineRule="auto" w:after="120" w:before="0"/>
+        <w:ind w:firstLine="432"/>
+        <w:jc w:val="both"/>
+      </w:pPr>
+      <w:r>
+        <w:rPr/>
         <w:t xml:space="preserve">The last three rows of Table 3 split scored firms at the median of the first ESG score within their cohort. The MTB effect is −0.019 for firms that enter coverage with a high score and 0.022 for firms with a low score. The difference of −0.041 (standard error 0.040, </w:t>
       </w:r>
       <w:r>
@@ -765,7 +888,7 @@
       </w:pPr>
       <w:r>
         <w:rPr/>
-        <w:t>The event study supports two readings of the flat valuation path after the first score. If scored and never-scored firms would have followed parallel paths from the base year onward, coverage had no effect on valuation, and the confidence interval excludes effects larger than about 4.9 percent. If instead the run-up in Figure 1 would have continued without coverage, the flat path implies that coverage lowered valuations relative to that trend. Neither reading supports the prediction that a first rating raises firm value. The more robust result is the ordering of events: rating coverage arrives after a period in which scored firms' market capitalization and MTB ratios grew faster than those of comparable firms.</w:t>
+        <w:t>The event study supports two readings of the flat valuation path after the first score. If scored and never-scored firms would have followed parallel paths from the base year onward, coverage had no effect on valuation, and the confidence interval excludes changes outside the range from −4.5 to 4.9 percent. If instead the run-up in Figure 1 would have continued without coverage, the flat path implies that coverage lowered valuations relative to that trend. Neither reading supports the prediction that a first rating raises firm value. The more robust result is the ordering of events: rating coverage arrives after a period in which scored firms' market capitalization and MTB ratios grew faster than those of comparable firms.</w:t>
       </w:r>
     </w:p>
     <w:p>
@@ -776,7 +899,7 @@
       </w:pPr>
       <w:r>
         <w:rPr/>
-        <w:t>This ordering fits a provider that adds firms once they become large or visible enough to matter to its clients. Table 1 shows that scored firms were already much larger than unscored firms before their first score, so they were probably known to many investors before coverage began. In Merton's (1987) framework, a first rating then adds little to the investor base. The result differs from the evidence of Kelly and Ljungqvist (2012), who show that losing analyst coverage lowers prices, and from the fund-level response to sustainability ratings documented by Hartzmark and Sussman (2019). One explanation consistent with our data is that an ESG score is a weaker information event than analyst coverage for these firms, especially given the disagreement among rating providers (Berg, Kölbel, and Rigobon, 2022). The U.S. evidence that coverage changes firm conduct (Tsang et al., 2024; Bikmetova and Pirinsky, 2026) concerns outcomes we do not observe, and our leverage and asset estimates do not show a stable financing response.</w:t>
+        <w:t>This ordering is consistent with a provider that adds firms once they become large or visible enough to matter to its clients, although the data do not reveal the provider's selection rule, and backfilled scores could make the recorded treatment year earlier than publication (Berg, Fabisik, and Sautner, 2020). Table 1 shows that scored firms were already much larger than unscored firms before their first score, so they were probably known to many investors before coverage began. In Merton's (1987) framework, a first rating then adds little to the investor base. The result differs from the evidence of Kelly and Ljungqvist (2012), who show that losing analyst coverage lowers prices, and from the fund-level response to sustainability ratings documented by Hartzmark and Sussman (2019). One explanation consistent with our data is that an ESG score is a weaker information event than analyst coverage for these firms, especially given the disagreement among rating providers (Berg, Kölbel, and Rigobon, 2022). The U.S. evidence that coverage changes firm conduct (Tsang et al., 2024; Bikmetova and Pirinsky, 2026) concerns outcomes we do not observe, and our leverage and asset estimates do not show a stable financing response.</w:t>
       </w:r>
     </w:p>
     <w:p>
@@ -787,7 +910,7 @@
       </w:pPr>
       <w:r>
         <w:rPr/>
-        <w:t>The results carry a methodological implication for studies that compare rated and unrated firms. A cross-sectional valuation premium of rated firms, or a static two-way fixed effects estimate, can reflect the selection of firms into coverage rather than an effect of ratings. In our sample, the static regression suggests that coverage raises MTB by 6.6 percent, while the heterogeneity-robust estimator and its event-time profile attribute the gap to growth that precedes coverage (Callaway and Sant'Anna, 2021; Roth, 2022). Whether the same ordering holds in other emerging markets, or for other rating providers, is a hypothesis that our data cannot test.</w:t>
+        <w:t>The results carry a methodological implication for studies that compare rated and unrated firms. A cross-sectional valuation premium of rated firms, or a static two-way fixed effects estimate, can reflect the selection of firms into coverage rather than an effect of ratings. In our sample, the static regression suggests that coverage raises MTB by 6.6 percent, while the heterogeneity-robust estimator and its event-time profile attribute the gap to growth that precedes coverage (Callaway and Sant'Anna, 2021; Roth, 2022). Whether the same ordering holds in other emerging markets, or for other rating providers, is a hypothesis that our data cannot test. For listed firms, the evidence gives no reason to expect a first ESG score to raise the market value of their shares. For investors and exchanges, it implies that comparisons between rated and unrated firms in these markets mix the effect of a rating with the growth that preceded it.</w:t>
       </w:r>
     </w:p>
     <w:p>
@@ -812,7 +935,7 @@
       </w:pPr>
       <w:r>
         <w:rPr/>
-        <w:t>The study has six limitations. First, the rating provider chooses when to cover a firm, and we have no source of variation in coverage that is unrelated to firm performance. The post-coverage estimates rely on conditional parallel trends from the base year, an assumption that the pre-coverage estimates call into question; the pre-analysis plan did not include sensitivity bounds for violations of parallel trends. Second, the data are annual, so we observe neither the date on which a first score was published nor announcement returns. Third, we observe coverage by LSEG only; some firms may have received scores from other providers earlier, which would bias the estimates toward zero. Fourth, a small number of market capitalization values in the source data are implausibly large; winsorization limits their influence but does not correct them, and return on assets is available for a minority of firm-years. Fifth, Malaysian firms account for most first scores in 2021 and 2022, so the average effect weights that market heavily. Sixth, the minimum detectable effect on log MTB is 0.067, so the design cannot rule out valuation effects smaller than about 7.0 percent.</w:t>
+        <w:t>The study has six limitations. First, the rating provider chooses when to cover a firm, and we have no source of variation in coverage that is unrelated to firm performance. The post-coverage estimates rely on conditional parallel trends from the base year, an assumption that the pre-coverage estimates call into question; our trend adjustment is linear and exploratory, and we do not report the full sensitivity bounds of Rambachan and Roth (2023). Second, the data are annual and may contain backfilled scores, so we observe neither the date on which a first score was published nor announcement returns. Third, we observe coverage by LSEG only; some firms may have received scores from other providers earlier, which would bias the estimates toward zero. Fourth, a small number of market capitalization values in the source data are implausibly large; winsorization limits their influence but does not correct them, and return on assets is available for a minority of firm-years. Fifth, Malaysian firms account for most first scores in 2021 and 2022, so the average effect weights that market heavily. Sixth, the minimum detectable effect on log MTB is 0.067, so the design cannot rule out valuation effects smaller than about 7.0 percent.</w:t>
       </w:r>
     </w:p>
     <w:p>
@@ -837,7 +960,7 @@
       </w:pPr>
       <w:r>
         <w:rPr/>
-        <w:t>Using the staggered first appearance of LSEG ESG scores for 675 non-financial firms in Indonesia, Malaysia, the Philippines, Singapore, and Thailand, we find no change in market-to-book ratios after a firm is first rated. Rated firms had instead gained market value faster than comparable firms during the five years before their first score. Rating coverage in these markets follows firm value rather than creating it, and analyses that ignore this ordering will overstate the valuation benefit of being rated.</w:t>
+        <w:t>Using the staggered first appearance of LSEG ESG scores for 675 non-financial firms in Indonesia, Malaysia, the Philippines, Singapore, and Thailand, we find no change in market-to-book ratios after a firm is first rated. Rated firms had instead gained market value faster than comparable firms during the five years before their first score. In these markets, rated firms gained value before, not after, their first score, and analyses that ignore this ordering will overstate the valuation benefit of being rated.</w:t>
       </w:r>
     </w:p>
     <w:p>
@@ -871,6 +994,16 @@
       <w:r>
         <w:rPr/>
         <w:t xml:space="preserve"> 144(2), 370–395. https://doi.org/10.1016/j.jfineco.2022.01.004</w:t>
+      </w:r>
+    </w:p>
+    <w:p>
+      <w:pPr>
+        <w:spacing w:line="360" w:lineRule="auto" w:after="80" w:before="0"/>
+        <w:ind w:left="432" w:hanging="432"/>
+      </w:pPr>
+      <w:r>
+        <w:rPr/>
+        <w:t>Berg, Florian, Kornelia Fabisik, and Zacharias Sautner, 2020, Is history repeating itself? The (un)predictable past of ESG ratings, European Corporate Governance Institute Finance Working Paper No. 708/2020. https://ssrn.com/abstract=3722087</w:t>
       </w:r>
     </w:p>
     <w:p>
@@ -951,6 +1084,26 @@
       <w:r>
         <w:rPr/>
         <w:t xml:space="preserve"> 225(2), 254–277. https://doi.org/10.1016/j.jeconom.2021.03.014</w:t>
+      </w:r>
+    </w:p>
+    <w:p>
+      <w:pPr>
+        <w:spacing w:line="360" w:lineRule="auto" w:after="80" w:before="0"/>
+        <w:ind w:left="432" w:hanging="432"/>
+      </w:pPr>
+      <w:r>
+        <w:rPr/>
+        <w:t xml:space="preserve">Harris, Lawrence, and Eitan Gurel, 1986, Price and volume effects associated with changes in the S&amp;P 500 list: New evidence for the existence of price pressures, </w:t>
+      </w:r>
+      <w:r>
+        <w:rPr>
+          <w:i/>
+        </w:rPr>
+        <w:t>Journal of Finance</w:t>
+      </w:r>
+      <w:r>
+        <w:rPr/>
+        <w:t xml:space="preserve"> 41(4), 815–829. https://doi.org/10.1111/j.1540-6261.1986.tb04550.x</w:t>
       </w:r>
     </w:p>
     <w:p>
@@ -1070,6 +1223,26 @@
       </w:pPr>
       <w:r>
         <w:rPr/>
+        <w:t xml:space="preserve">Rambachan, Ashesh, and Jonathan Roth, 2023, A more credible approach to parallel trends, </w:t>
+      </w:r>
+      <w:r>
+        <w:rPr>
+          <w:i/>
+        </w:rPr>
+        <w:t>Review of Economic Studies</w:t>
+      </w:r>
+      <w:r>
+        <w:rPr/>
+        <w:t xml:space="preserve"> 90(5), 2555–2591. https://doi.org/10.1093/restud/rdad018</w:t>
+      </w:r>
+    </w:p>
+    <w:p>
+      <w:pPr>
+        <w:spacing w:line="360" w:lineRule="auto" w:after="80" w:before="0"/>
+        <w:ind w:left="432" w:hanging="432"/>
+      </w:pPr>
+      <w:r>
+        <w:rPr/>
         <w:t xml:space="preserve">Roth, Jonathan, 2022, Pretest with caution: Event-study estimates after testing for parallel trends, </w:t>
       </w:r>
       <w:r>
@@ -1120,6 +1293,26 @@
       </w:pPr>
       <w:r>
         <w:rPr/>
+        <w:t xml:space="preserve">Shleifer, Andrei, 1986, Do demand curves for stocks slope down?, </w:t>
+      </w:r>
+      <w:r>
+        <w:rPr>
+          <w:i/>
+        </w:rPr>
+        <w:t>Journal of Finance</w:t>
+      </w:r>
+      <w:r>
+        <w:rPr/>
+        <w:t xml:space="preserve"> 41(3), 579–590. https://doi.org/10.1111/j.1540-6261.1986.tb04518.x</w:t>
+      </w:r>
+    </w:p>
+    <w:p>
+      <w:pPr>
+        <w:spacing w:line="360" w:lineRule="auto" w:after="80" w:before="0"/>
+        <w:ind w:left="432" w:hanging="432"/>
+      </w:pPr>
+      <w:r>
+        <w:rPr/>
         <w:t xml:space="preserve">Tsang, Albert, Yang Wang, Yan Xiang, and Li Yu, 2024, The rise of ESG rating agencies and management of corporate ESG violations, </w:t>
       </w:r>
       <w:r>
@@ -1160,22 +1353,24 @@
       <w:tblPr>
         <w:tblW w:type="auto" w:w="0"/>
         <w:jc w:val="center"/>
+        <w:tblLayout w:type="fixed"/>
         <w:tblLook w:firstColumn="1" w:firstRow="1" w:lastColumn="0" w:lastRow="0" w:noHBand="0" w:noVBand="1" w:val="04A0"/>
+        <w:tblLayout w:type="fixed"/>
       </w:tblPr>
       <w:tblGrid>
-        <w:gridCol w:w="1170"/>
-        <w:gridCol w:w="1170"/>
-        <w:gridCol w:w="1170"/>
-        <w:gridCol w:w="1170"/>
-        <w:gridCol w:w="1170"/>
-        <w:gridCol w:w="1170"/>
-        <w:gridCol w:w="1170"/>
-        <w:gridCol w:w="1170"/>
+        <w:gridCol w:w="2448"/>
+        <w:gridCol w:w="936"/>
+        <w:gridCol w:w="936"/>
+        <w:gridCol w:w="792"/>
+        <w:gridCol w:w="1007"/>
+        <w:gridCol w:w="1007"/>
+        <w:gridCol w:w="936"/>
+        <w:gridCol w:w="1152"/>
       </w:tblGrid>
       <w:tr>
         <w:tc>
           <w:tcPr>
-            <w:tcW w:type="dxa" w:w="1170"/>
+            <w:tcW w:type="dxa" w:w="2448"/>
             <w:tcBorders>
               <w:top w:val="single" w:sz="6" w:color="000000"/>
               <w:bottom w:val="single" w:sz="6" w:color="000000"/>
@@ -1197,7 +1392,7 @@
         </w:tc>
         <w:tc>
           <w:tcPr>
-            <w:tcW w:type="dxa" w:w="1170"/>
+            <w:tcW w:type="dxa" w:w="936"/>
             <w:tcBorders>
               <w:top w:val="single" w:sz="6" w:color="000000"/>
               <w:bottom w:val="single" w:sz="6" w:color="000000"/>
@@ -1220,7 +1415,7 @@
         </w:tc>
         <w:tc>
           <w:tcPr>
-            <w:tcW w:type="dxa" w:w="1170"/>
+            <w:tcW w:type="dxa" w:w="936"/>
             <w:tcBorders>
               <w:top w:val="single" w:sz="6" w:color="000000"/>
               <w:bottom w:val="single" w:sz="6" w:color="000000"/>
@@ -1243,7 +1438,7 @@
         </w:tc>
         <w:tc>
           <w:tcPr>
-            <w:tcW w:type="dxa" w:w="1170"/>
+            <w:tcW w:type="dxa" w:w="792"/>
             <w:tcBorders>
               <w:top w:val="single" w:sz="6" w:color="000000"/>
               <w:bottom w:val="single" w:sz="6" w:color="000000"/>
@@ -1266,7 +1461,7 @@
         </w:tc>
         <w:tc>
           <w:tcPr>
-            <w:tcW w:type="dxa" w:w="1170"/>
+            <w:tcW w:type="dxa" w:w="1008"/>
             <w:tcBorders>
               <w:top w:val="single" w:sz="6" w:color="000000"/>
               <w:bottom w:val="single" w:sz="6" w:color="000000"/>
@@ -1289,7 +1484,7 @@
         </w:tc>
         <w:tc>
           <w:tcPr>
-            <w:tcW w:type="dxa" w:w="1170"/>
+            <w:tcW w:type="dxa" w:w="1008"/>
             <w:tcBorders>
               <w:top w:val="single" w:sz="6" w:color="000000"/>
               <w:bottom w:val="single" w:sz="6" w:color="000000"/>
@@ -1312,7 +1507,7 @@
         </w:tc>
         <w:tc>
           <w:tcPr>
-            <w:tcW w:type="dxa" w:w="1170"/>
+            <w:tcW w:type="dxa" w:w="936"/>
             <w:tcBorders>
               <w:top w:val="single" w:sz="6" w:color="000000"/>
               <w:bottom w:val="single" w:sz="6" w:color="000000"/>
@@ -1335,7 +1530,7 @@
         </w:tc>
         <w:tc>
           <w:tcPr>
-            <w:tcW w:type="dxa" w:w="1170"/>
+            <w:tcW w:type="dxa" w:w="1152"/>
             <w:tcBorders>
               <w:top w:val="single" w:sz="6" w:color="000000"/>
               <w:bottom w:val="single" w:sz="6" w:color="000000"/>
@@ -1360,7 +1555,7 @@
       <w:tr>
         <w:tc>
           <w:tcPr>
-            <w:tcW w:type="dxa" w:w="1170"/>
+            <w:tcW w:type="dxa" w:w="2448"/>
           </w:tcPr>
           <w:p>
             <w:pPr>
@@ -1377,7 +1572,7 @@
         </w:tc>
         <w:tc>
           <w:tcPr>
-            <w:tcW w:type="dxa" w:w="1170"/>
+            <w:tcW w:type="dxa" w:w="936"/>
           </w:tcPr>
           <w:p>
             <w:pPr>
@@ -1395,7 +1590,7 @@
         </w:tc>
         <w:tc>
           <w:tcPr>
-            <w:tcW w:type="dxa" w:w="1170"/>
+            <w:tcW w:type="dxa" w:w="936"/>
           </w:tcPr>
           <w:p>
             <w:pPr>
@@ -1413,7 +1608,7 @@
         </w:tc>
         <w:tc>
           <w:tcPr>
-            <w:tcW w:type="dxa" w:w="1170"/>
+            <w:tcW w:type="dxa" w:w="792"/>
           </w:tcPr>
           <w:p>
             <w:pPr>
@@ -1431,7 +1626,7 @@
         </w:tc>
         <w:tc>
           <w:tcPr>
-            <w:tcW w:type="dxa" w:w="1170"/>
+            <w:tcW w:type="dxa" w:w="1008"/>
           </w:tcPr>
           <w:p>
             <w:pPr>
@@ -1449,7 +1644,7 @@
         </w:tc>
         <w:tc>
           <w:tcPr>
-            <w:tcW w:type="dxa" w:w="1170"/>
+            <w:tcW w:type="dxa" w:w="1008"/>
           </w:tcPr>
           <w:p>
             <w:pPr>
@@ -1467,7 +1662,7 @@
         </w:tc>
         <w:tc>
           <w:tcPr>
-            <w:tcW w:type="dxa" w:w="1170"/>
+            <w:tcW w:type="dxa" w:w="936"/>
           </w:tcPr>
           <w:p>
             <w:pPr>
@@ -1485,7 +1680,7 @@
         </w:tc>
         <w:tc>
           <w:tcPr>
-            <w:tcW w:type="dxa" w:w="1170"/>
+            <w:tcW w:type="dxa" w:w="1152"/>
           </w:tcPr>
           <w:p>
             <w:pPr>
@@ -1505,7 +1700,7 @@
       <w:tr>
         <w:tc>
           <w:tcPr>
-            <w:tcW w:type="dxa" w:w="1170"/>
+            <w:tcW w:type="dxa" w:w="2448"/>
           </w:tcPr>
           <w:p>
             <w:pPr>
@@ -1522,7 +1717,7 @@
         </w:tc>
         <w:tc>
           <w:tcPr>
-            <w:tcW w:type="dxa" w:w="1170"/>
+            <w:tcW w:type="dxa" w:w="936"/>
           </w:tcPr>
           <w:p>
             <w:pPr>
@@ -1540,7 +1735,7 @@
         </w:tc>
         <w:tc>
           <w:tcPr>
-            <w:tcW w:type="dxa" w:w="1170"/>
+            <w:tcW w:type="dxa" w:w="936"/>
           </w:tcPr>
           <w:p>
             <w:pPr>
@@ -1558,7 +1753,7 @@
         </w:tc>
         <w:tc>
           <w:tcPr>
-            <w:tcW w:type="dxa" w:w="1170"/>
+            <w:tcW w:type="dxa" w:w="792"/>
           </w:tcPr>
           <w:p>
             <w:pPr>
@@ -1576,7 +1771,7 @@
         </w:tc>
         <w:tc>
           <w:tcPr>
-            <w:tcW w:type="dxa" w:w="1170"/>
+            <w:tcW w:type="dxa" w:w="1008"/>
           </w:tcPr>
           <w:p>
             <w:pPr>
@@ -1594,7 +1789,7 @@
         </w:tc>
         <w:tc>
           <w:tcPr>
-            <w:tcW w:type="dxa" w:w="1170"/>
+            <w:tcW w:type="dxa" w:w="1008"/>
           </w:tcPr>
           <w:p>
             <w:pPr>
@@ -1612,7 +1807,7 @@
         </w:tc>
         <w:tc>
           <w:tcPr>
-            <w:tcW w:type="dxa" w:w="1170"/>
+            <w:tcW w:type="dxa" w:w="936"/>
           </w:tcPr>
           <w:p>
             <w:pPr>
@@ -1630,7 +1825,7 @@
         </w:tc>
         <w:tc>
           <w:tcPr>
-            <w:tcW w:type="dxa" w:w="1170"/>
+            <w:tcW w:type="dxa" w:w="1152"/>
           </w:tcPr>
           <w:p>
             <w:pPr>
@@ -1650,7 +1845,7 @@
       <w:tr>
         <w:tc>
           <w:tcPr>
-            <w:tcW w:type="dxa" w:w="1170"/>
+            <w:tcW w:type="dxa" w:w="2448"/>
           </w:tcPr>
           <w:p>
             <w:pPr>
@@ -1667,7 +1862,7 @@
         </w:tc>
         <w:tc>
           <w:tcPr>
-            <w:tcW w:type="dxa" w:w="1170"/>
+            <w:tcW w:type="dxa" w:w="936"/>
           </w:tcPr>
           <w:p>
             <w:pPr>
@@ -1685,7 +1880,7 @@
         </w:tc>
         <w:tc>
           <w:tcPr>
-            <w:tcW w:type="dxa" w:w="1170"/>
+            <w:tcW w:type="dxa" w:w="936"/>
           </w:tcPr>
           <w:p>
             <w:pPr>
@@ -1703,7 +1898,7 @@
         </w:tc>
         <w:tc>
           <w:tcPr>
-            <w:tcW w:type="dxa" w:w="1170"/>
+            <w:tcW w:type="dxa" w:w="792"/>
           </w:tcPr>
           <w:p>
             <w:pPr>
@@ -1721,7 +1916,7 @@
         </w:tc>
         <w:tc>
           <w:tcPr>
-            <w:tcW w:type="dxa" w:w="1170"/>
+            <w:tcW w:type="dxa" w:w="1008"/>
           </w:tcPr>
           <w:p>
             <w:pPr>
@@ -1739,7 +1934,7 @@
         </w:tc>
         <w:tc>
           <w:tcPr>
-            <w:tcW w:type="dxa" w:w="1170"/>
+            <w:tcW w:type="dxa" w:w="1008"/>
           </w:tcPr>
           <w:p>
             <w:pPr>
@@ -1757,7 +1952,7 @@
         </w:tc>
         <w:tc>
           <w:tcPr>
-            <w:tcW w:type="dxa" w:w="1170"/>
+            <w:tcW w:type="dxa" w:w="936"/>
           </w:tcPr>
           <w:p>
             <w:pPr>
@@ -1775,7 +1970,7 @@
         </w:tc>
         <w:tc>
           <w:tcPr>
-            <w:tcW w:type="dxa" w:w="1170"/>
+            <w:tcW w:type="dxa" w:w="1152"/>
           </w:tcPr>
           <w:p>
             <w:pPr>
@@ -1795,7 +1990,7 @@
       <w:tr>
         <w:tc>
           <w:tcPr>
-            <w:tcW w:type="dxa" w:w="1170"/>
+            <w:tcW w:type="dxa" w:w="2448"/>
           </w:tcPr>
           <w:p>
             <w:pPr>
@@ -1812,7 +2007,7 @@
         </w:tc>
         <w:tc>
           <w:tcPr>
-            <w:tcW w:type="dxa" w:w="1170"/>
+            <w:tcW w:type="dxa" w:w="936"/>
           </w:tcPr>
           <w:p>
             <w:pPr>
@@ -1830,7 +2025,7 @@
         </w:tc>
         <w:tc>
           <w:tcPr>
-            <w:tcW w:type="dxa" w:w="1170"/>
+            <w:tcW w:type="dxa" w:w="936"/>
           </w:tcPr>
           <w:p>
             <w:pPr>
@@ -1848,7 +2043,7 @@
         </w:tc>
         <w:tc>
           <w:tcPr>
-            <w:tcW w:type="dxa" w:w="1170"/>
+            <w:tcW w:type="dxa" w:w="792"/>
           </w:tcPr>
           <w:p>
             <w:pPr>
@@ -1866,7 +2061,7 @@
         </w:tc>
         <w:tc>
           <w:tcPr>
-            <w:tcW w:type="dxa" w:w="1170"/>
+            <w:tcW w:type="dxa" w:w="1008"/>
           </w:tcPr>
           <w:p>
             <w:pPr>
@@ -1884,7 +2079,7 @@
         </w:tc>
         <w:tc>
           <w:tcPr>
-            <w:tcW w:type="dxa" w:w="1170"/>
+            <w:tcW w:type="dxa" w:w="1008"/>
           </w:tcPr>
           <w:p>
             <w:pPr>
@@ -1902,7 +2097,7 @@
         </w:tc>
         <w:tc>
           <w:tcPr>
-            <w:tcW w:type="dxa" w:w="1170"/>
+            <w:tcW w:type="dxa" w:w="936"/>
           </w:tcPr>
           <w:p>
             <w:pPr>
@@ -1920,7 +2115,7 @@
         </w:tc>
         <w:tc>
           <w:tcPr>
-            <w:tcW w:type="dxa" w:w="1170"/>
+            <w:tcW w:type="dxa" w:w="1152"/>
           </w:tcPr>
           <w:p>
             <w:pPr>
@@ -1940,7 +2135,7 @@
       <w:tr>
         <w:tc>
           <w:tcPr>
-            <w:tcW w:type="dxa" w:w="1170"/>
+            <w:tcW w:type="dxa" w:w="2448"/>
             <w:tcBorders>
               <w:bottom w:val="single" w:sz="6" w:color="000000"/>
             </w:tcBorders>
@@ -1960,7 +2155,7 @@
         </w:tc>
         <w:tc>
           <w:tcPr>
-            <w:tcW w:type="dxa" w:w="1170"/>
+            <w:tcW w:type="dxa" w:w="936"/>
             <w:tcBorders>
               <w:bottom w:val="single" w:sz="6" w:color="000000"/>
             </w:tcBorders>
@@ -1981,7 +2176,7 @@
         </w:tc>
         <w:tc>
           <w:tcPr>
-            <w:tcW w:type="dxa" w:w="1170"/>
+            <w:tcW w:type="dxa" w:w="936"/>
             <w:tcBorders>
               <w:bottom w:val="single" w:sz="6" w:color="000000"/>
             </w:tcBorders>
@@ -2002,7 +2197,7 @@
         </w:tc>
         <w:tc>
           <w:tcPr>
-            <w:tcW w:type="dxa" w:w="1170"/>
+            <w:tcW w:type="dxa" w:w="792"/>
             <w:tcBorders>
               <w:bottom w:val="single" w:sz="6" w:color="000000"/>
             </w:tcBorders>
@@ -2023,7 +2218,7 @@
         </w:tc>
         <w:tc>
           <w:tcPr>
-            <w:tcW w:type="dxa" w:w="1170"/>
+            <w:tcW w:type="dxa" w:w="1008"/>
             <w:tcBorders>
               <w:bottom w:val="single" w:sz="6" w:color="000000"/>
             </w:tcBorders>
@@ -2044,7 +2239,7 @@
         </w:tc>
         <w:tc>
           <w:tcPr>
-            <w:tcW w:type="dxa" w:w="1170"/>
+            <w:tcW w:type="dxa" w:w="1008"/>
             <w:tcBorders>
               <w:bottom w:val="single" w:sz="6" w:color="000000"/>
             </w:tcBorders>
@@ -2065,7 +2260,7 @@
         </w:tc>
         <w:tc>
           <w:tcPr>
-            <w:tcW w:type="dxa" w:w="1170"/>
+            <w:tcW w:type="dxa" w:w="936"/>
             <w:tcBorders>
               <w:bottom w:val="single" w:sz="6" w:color="000000"/>
             </w:tcBorders>
@@ -2086,7 +2281,7 @@
         </w:tc>
         <w:tc>
           <w:tcPr>
-            <w:tcW w:type="dxa" w:w="1170"/>
+            <w:tcW w:type="dxa" w:w="1152"/>
             <w:tcBorders>
               <w:bottom w:val="single" w:sz="6" w:color="000000"/>
             </w:tcBorders>
@@ -2156,23 +2351,25 @@
       <w:tblPr>
         <w:tblW w:type="auto" w:w="0"/>
         <w:jc w:val="center"/>
+        <w:tblLayout w:type="fixed"/>
         <w:tblLook w:firstColumn="1" w:firstRow="1" w:lastColumn="0" w:lastRow="0" w:noHBand="0" w:noVBand="1" w:val="04A0"/>
+        <w:tblLayout w:type="fixed"/>
       </w:tblPr>
       <w:tblGrid>
-        <w:gridCol w:w="1040"/>
-        <w:gridCol w:w="1040"/>
-        <w:gridCol w:w="1040"/>
-        <w:gridCol w:w="1040"/>
-        <w:gridCol w:w="1040"/>
-        <w:gridCol w:w="1040"/>
-        <w:gridCol w:w="1040"/>
-        <w:gridCol w:w="1040"/>
-        <w:gridCol w:w="1040"/>
+        <w:gridCol w:w="2232"/>
+        <w:gridCol w:w="864"/>
+        <w:gridCol w:w="720"/>
+        <w:gridCol w:w="1655"/>
+        <w:gridCol w:w="864"/>
+        <w:gridCol w:w="720"/>
+        <w:gridCol w:w="864"/>
+        <w:gridCol w:w="792"/>
+        <w:gridCol w:w="864"/>
       </w:tblGrid>
       <w:tr>
         <w:tc>
           <w:tcPr>
-            <w:tcW w:type="dxa" w:w="1040"/>
+            <w:tcW w:type="dxa" w:w="2232"/>
             <w:tcBorders>
               <w:top w:val="single" w:sz="6" w:color="000000"/>
               <w:bottom w:val="single" w:sz="6" w:color="000000"/>
@@ -2194,7 +2391,7 @@
         </w:tc>
         <w:tc>
           <w:tcPr>
-            <w:tcW w:type="dxa" w:w="1040"/>
+            <w:tcW w:type="dxa" w:w="864"/>
             <w:tcBorders>
               <w:top w:val="single" w:sz="6" w:color="000000"/>
               <w:bottom w:val="single" w:sz="6" w:color="000000"/>
@@ -2217,7 +2414,7 @@
         </w:tc>
         <w:tc>
           <w:tcPr>
-            <w:tcW w:type="dxa" w:w="1040"/>
+            <w:tcW w:type="dxa" w:w="720"/>
             <w:tcBorders>
               <w:top w:val="single" w:sz="6" w:color="000000"/>
               <w:bottom w:val="single" w:sz="6" w:color="000000"/>
@@ -2240,7 +2437,7 @@
         </w:tc>
         <w:tc>
           <w:tcPr>
-            <w:tcW w:type="dxa" w:w="1040"/>
+            <w:tcW w:type="dxa" w:w="1656"/>
             <w:tcBorders>
               <w:top w:val="single" w:sz="6" w:color="000000"/>
               <w:bottom w:val="single" w:sz="6" w:color="000000"/>
@@ -2263,7 +2460,7 @@
         </w:tc>
         <w:tc>
           <w:tcPr>
-            <w:tcW w:type="dxa" w:w="1040"/>
+            <w:tcW w:type="dxa" w:w="864"/>
             <w:tcBorders>
               <w:top w:val="single" w:sz="6" w:color="000000"/>
               <w:bottom w:val="single" w:sz="6" w:color="000000"/>
@@ -2286,7 +2483,7 @@
         </w:tc>
         <w:tc>
           <w:tcPr>
-            <w:tcW w:type="dxa" w:w="1040"/>
+            <w:tcW w:type="dxa" w:w="720"/>
             <w:tcBorders>
               <w:top w:val="single" w:sz="6" w:color="000000"/>
               <w:bottom w:val="single" w:sz="6" w:color="000000"/>
@@ -2309,7 +2506,7 @@
         </w:tc>
         <w:tc>
           <w:tcPr>
-            <w:tcW w:type="dxa" w:w="1040"/>
+            <w:tcW w:type="dxa" w:w="864"/>
             <w:tcBorders>
               <w:top w:val="single" w:sz="6" w:color="000000"/>
               <w:bottom w:val="single" w:sz="6" w:color="000000"/>
@@ -2332,7 +2529,7 @@
         </w:tc>
         <w:tc>
           <w:tcPr>
-            <w:tcW w:type="dxa" w:w="1040"/>
+            <w:tcW w:type="dxa" w:w="792"/>
             <w:tcBorders>
               <w:top w:val="single" w:sz="6" w:color="000000"/>
               <w:bottom w:val="single" w:sz="6" w:color="000000"/>
@@ -2355,7 +2552,7 @@
         </w:tc>
         <w:tc>
           <w:tcPr>
-            <w:tcW w:type="dxa" w:w="1040"/>
+            <w:tcW w:type="dxa" w:w="864"/>
             <w:tcBorders>
               <w:top w:val="single" w:sz="6" w:color="000000"/>
               <w:bottom w:val="single" w:sz="6" w:color="000000"/>
@@ -2380,7 +2577,7 @@
       <w:tr>
         <w:tc>
           <w:tcPr>
-            <w:tcW w:type="dxa" w:w="1040"/>
+            <w:tcW w:type="dxa" w:w="2232"/>
           </w:tcPr>
           <w:p>
             <w:pPr>
@@ -2397,7 +2594,7 @@
         </w:tc>
         <w:tc>
           <w:tcPr>
-            <w:tcW w:type="dxa" w:w="1040"/>
+            <w:tcW w:type="dxa" w:w="864"/>
           </w:tcPr>
           <w:p>
             <w:pPr>
@@ -2415,7 +2612,7 @@
         </w:tc>
         <w:tc>
           <w:tcPr>
-            <w:tcW w:type="dxa" w:w="1040"/>
+            <w:tcW w:type="dxa" w:w="720"/>
           </w:tcPr>
           <w:p>
             <w:pPr>
@@ -2433,7 +2630,7 @@
         </w:tc>
         <w:tc>
           <w:tcPr>
-            <w:tcW w:type="dxa" w:w="1040"/>
+            <w:tcW w:type="dxa" w:w="1656"/>
           </w:tcPr>
           <w:p>
             <w:pPr>
@@ -2451,7 +2648,7 @@
         </w:tc>
         <w:tc>
           <w:tcPr>
-            <w:tcW w:type="dxa" w:w="1040"/>
+            <w:tcW w:type="dxa" w:w="864"/>
           </w:tcPr>
           <w:p>
             <w:pPr>
@@ -2469,7 +2666,7 @@
         </w:tc>
         <w:tc>
           <w:tcPr>
-            <w:tcW w:type="dxa" w:w="1040"/>
+            <w:tcW w:type="dxa" w:w="720"/>
           </w:tcPr>
           <w:p>
             <w:pPr>
@@ -2487,7 +2684,7 @@
         </w:tc>
         <w:tc>
           <w:tcPr>
-            <w:tcW w:type="dxa" w:w="1040"/>
+            <w:tcW w:type="dxa" w:w="864"/>
           </w:tcPr>
           <w:p>
             <w:pPr>
@@ -2505,7 +2702,7 @@
         </w:tc>
         <w:tc>
           <w:tcPr>
-            <w:tcW w:type="dxa" w:w="1040"/>
+            <w:tcW w:type="dxa" w:w="792"/>
           </w:tcPr>
           <w:p>
             <w:pPr>
@@ -2523,7 +2720,7 @@
         </w:tc>
         <w:tc>
           <w:tcPr>
-            <w:tcW w:type="dxa" w:w="1040"/>
+            <w:tcW w:type="dxa" w:w="864"/>
           </w:tcPr>
           <w:p>
             <w:pPr>
@@ -2543,7 +2740,7 @@
       <w:tr>
         <w:tc>
           <w:tcPr>
-            <w:tcW w:type="dxa" w:w="1040"/>
+            <w:tcW w:type="dxa" w:w="2232"/>
           </w:tcPr>
           <w:p>
             <w:pPr>
@@ -2560,7 +2757,7 @@
         </w:tc>
         <w:tc>
           <w:tcPr>
-            <w:tcW w:type="dxa" w:w="1040"/>
+            <w:tcW w:type="dxa" w:w="864"/>
           </w:tcPr>
           <w:p>
             <w:pPr>
@@ -2578,7 +2775,7 @@
         </w:tc>
         <w:tc>
           <w:tcPr>
-            <w:tcW w:type="dxa" w:w="1040"/>
+            <w:tcW w:type="dxa" w:w="720"/>
           </w:tcPr>
           <w:p>
             <w:pPr>
@@ -2596,7 +2793,7 @@
         </w:tc>
         <w:tc>
           <w:tcPr>
-            <w:tcW w:type="dxa" w:w="1040"/>
+            <w:tcW w:type="dxa" w:w="1656"/>
           </w:tcPr>
           <w:p>
             <w:pPr>
@@ -2614,7 +2811,7 @@
         </w:tc>
         <w:tc>
           <w:tcPr>
-            <w:tcW w:type="dxa" w:w="1040"/>
+            <w:tcW w:type="dxa" w:w="864"/>
           </w:tcPr>
           <w:p>
             <w:pPr>
@@ -2632,7 +2829,7 @@
         </w:tc>
         <w:tc>
           <w:tcPr>
-            <w:tcW w:type="dxa" w:w="1040"/>
+            <w:tcW w:type="dxa" w:w="720"/>
           </w:tcPr>
           <w:p>
             <w:pPr>
@@ -2650,7 +2847,7 @@
         </w:tc>
         <w:tc>
           <w:tcPr>
-            <w:tcW w:type="dxa" w:w="1040"/>
+            <w:tcW w:type="dxa" w:w="864"/>
           </w:tcPr>
           <w:p>
             <w:pPr>
@@ -2668,7 +2865,7 @@
         </w:tc>
         <w:tc>
           <w:tcPr>
-            <w:tcW w:type="dxa" w:w="1040"/>
+            <w:tcW w:type="dxa" w:w="792"/>
           </w:tcPr>
           <w:p>
             <w:pPr>
@@ -2686,7 +2883,7 @@
         </w:tc>
         <w:tc>
           <w:tcPr>
-            <w:tcW w:type="dxa" w:w="1040"/>
+            <w:tcW w:type="dxa" w:w="864"/>
           </w:tcPr>
           <w:p>
             <w:pPr>
@@ -2706,7 +2903,7 @@
       <w:tr>
         <w:tc>
           <w:tcPr>
-            <w:tcW w:type="dxa" w:w="1040"/>
+            <w:tcW w:type="dxa" w:w="2232"/>
           </w:tcPr>
           <w:p>
             <w:pPr>
@@ -2723,7 +2920,7 @@
         </w:tc>
         <w:tc>
           <w:tcPr>
-            <w:tcW w:type="dxa" w:w="1040"/>
+            <w:tcW w:type="dxa" w:w="864"/>
           </w:tcPr>
           <w:p>
             <w:pPr>
@@ -2741,7 +2938,7 @@
         </w:tc>
         <w:tc>
           <w:tcPr>
-            <w:tcW w:type="dxa" w:w="1040"/>
+            <w:tcW w:type="dxa" w:w="720"/>
           </w:tcPr>
           <w:p>
             <w:pPr>
@@ -2759,7 +2956,7 @@
         </w:tc>
         <w:tc>
           <w:tcPr>
-            <w:tcW w:type="dxa" w:w="1040"/>
+            <w:tcW w:type="dxa" w:w="1656"/>
           </w:tcPr>
           <w:p>
             <w:pPr>
@@ -2777,7 +2974,7 @@
         </w:tc>
         <w:tc>
           <w:tcPr>
-            <w:tcW w:type="dxa" w:w="1040"/>
+            <w:tcW w:type="dxa" w:w="864"/>
           </w:tcPr>
           <w:p>
             <w:pPr>
@@ -2795,7 +2992,7 @@
         </w:tc>
         <w:tc>
           <w:tcPr>
-            <w:tcW w:type="dxa" w:w="1040"/>
+            <w:tcW w:type="dxa" w:w="720"/>
           </w:tcPr>
           <w:p>
             <w:pPr>
@@ -2813,7 +3010,7 @@
         </w:tc>
         <w:tc>
           <w:tcPr>
-            <w:tcW w:type="dxa" w:w="1040"/>
+            <w:tcW w:type="dxa" w:w="864"/>
           </w:tcPr>
           <w:p>
             <w:pPr>
@@ -2831,7 +3028,7 @@
         </w:tc>
         <w:tc>
           <w:tcPr>
-            <w:tcW w:type="dxa" w:w="1040"/>
+            <w:tcW w:type="dxa" w:w="792"/>
           </w:tcPr>
           <w:p>
             <w:pPr>
@@ -2849,7 +3046,7 @@
         </w:tc>
         <w:tc>
           <w:tcPr>
-            <w:tcW w:type="dxa" w:w="1040"/>
+            <w:tcW w:type="dxa" w:w="864"/>
           </w:tcPr>
           <w:p>
             <w:pPr>
@@ -2869,7 +3066,7 @@
       <w:tr>
         <w:tc>
           <w:tcPr>
-            <w:tcW w:type="dxa" w:w="1040"/>
+            <w:tcW w:type="dxa" w:w="2232"/>
             <w:tcBorders>
               <w:bottom w:val="single" w:sz="6" w:color="000000"/>
             </w:tcBorders>
@@ -2889,7 +3086,7 @@
         </w:tc>
         <w:tc>
           <w:tcPr>
-            <w:tcW w:type="dxa" w:w="1040"/>
+            <w:tcW w:type="dxa" w:w="864"/>
             <w:tcBorders>
               <w:bottom w:val="single" w:sz="6" w:color="000000"/>
             </w:tcBorders>
@@ -2910,7 +3107,7 @@
         </w:tc>
         <w:tc>
           <w:tcPr>
-            <w:tcW w:type="dxa" w:w="1040"/>
+            <w:tcW w:type="dxa" w:w="720"/>
             <w:tcBorders>
               <w:bottom w:val="single" w:sz="6" w:color="000000"/>
             </w:tcBorders>
@@ -2931,7 +3128,7 @@
         </w:tc>
         <w:tc>
           <w:tcPr>
-            <w:tcW w:type="dxa" w:w="1040"/>
+            <w:tcW w:type="dxa" w:w="1656"/>
             <w:tcBorders>
               <w:bottom w:val="single" w:sz="6" w:color="000000"/>
             </w:tcBorders>
@@ -2952,7 +3149,7 @@
         </w:tc>
         <w:tc>
           <w:tcPr>
-            <w:tcW w:type="dxa" w:w="1040"/>
+            <w:tcW w:type="dxa" w:w="864"/>
             <w:tcBorders>
               <w:bottom w:val="single" w:sz="6" w:color="000000"/>
             </w:tcBorders>
@@ -2973,7 +3170,7 @@
         </w:tc>
         <w:tc>
           <w:tcPr>
-            <w:tcW w:type="dxa" w:w="1040"/>
+            <w:tcW w:type="dxa" w:w="720"/>
             <w:tcBorders>
               <w:bottom w:val="single" w:sz="6" w:color="000000"/>
             </w:tcBorders>
@@ -2994,7 +3191,7 @@
         </w:tc>
         <w:tc>
           <w:tcPr>
-            <w:tcW w:type="dxa" w:w="1040"/>
+            <w:tcW w:type="dxa" w:w="864"/>
             <w:tcBorders>
               <w:bottom w:val="single" w:sz="6" w:color="000000"/>
             </w:tcBorders>
@@ -3015,7 +3212,7 @@
         </w:tc>
         <w:tc>
           <w:tcPr>
-            <w:tcW w:type="dxa" w:w="1040"/>
+            <w:tcW w:type="dxa" w:w="792"/>
             <w:tcBorders>
               <w:bottom w:val="single" w:sz="6" w:color="000000"/>
             </w:tcBorders>
@@ -3036,7 +3233,7 @@
         </w:tc>
         <w:tc>
           <w:tcPr>
-            <w:tcW w:type="dxa" w:w="1040"/>
+            <w:tcW w:type="dxa" w:w="864"/>
             <w:tcBorders>
               <w:bottom w:val="single" w:sz="6" w:color="000000"/>
             </w:tcBorders>
@@ -3065,27 +3262,7 @@
         <w:rPr>
           <w:sz w:val="20"/>
         </w:rPr>
-        <w:t xml:space="preserve">ATT is the average treatment effect on the treated with 95% bootstrap confidence intervals; p-values for the three secondary outcomes are Holm-adjusted. MDE is the minimum detectable effect at 80% power, and pre-trend p is the joint test that event-time effects −5 to −2 are zero; </w:t>
-      </w:r>
-      <w:r>
-        <w:rPr>
-          <w:i/>
-          <w:sz w:val="20"/>
-        </w:rPr>
-        <w:t xml:space="preserve">, </w:t>
-      </w:r>
-      <w:r>
-        <w:rPr>
-          <w:i/>
-          <w:sz w:val="20"/>
-        </w:rPr>
-        <w:t xml:space="preserve">, and </w:t>
-      </w:r>
-      <w:r>
-        <w:rPr>
-          <w:sz w:val="20"/>
-        </w:rPr>
-        <w:t>** denote significance at the 10%, 5%, and 1% levels.</w:t>
+        <w:t>ATT is the average treatment effect on the treated with 95% bootstrap confidence intervals; p-values for the three secondary outcomes are Holm-adjusted. MDE is the minimum detectable effect at 80% power, and pre-trend p is the joint test that event-time effects −5 to −2 are zero; *, **, and *** denote significance at the 10%, 5%, and 1% levels.</w:t>
       </w:r>
     </w:p>
     <w:p>
@@ -3184,6 +3361,11 @@
       </w:r>
     </w:p>
     <w:p>
+      <w:r>
+        <w:br w:type="page"/>
+      </w:r>
+    </w:p>
+    <w:p>
       <w:pPr>
         <w:spacing w:line="240" w:lineRule="auto" w:after="120" w:before="0"/>
       </w:pPr>
@@ -3205,19 +3387,21 @@
       <w:tblPr>
         <w:tblW w:type="auto" w:w="0"/>
         <w:jc w:val="center"/>
+        <w:tblLayout w:type="fixed"/>
         <w:tblLook w:firstColumn="1" w:firstRow="1" w:lastColumn="0" w:lastRow="0" w:noHBand="0" w:noVBand="1" w:val="04A0"/>
+        <w:tblLayout w:type="fixed"/>
       </w:tblPr>
       <w:tblGrid>
-        <w:gridCol w:w="1872"/>
-        <w:gridCol w:w="1872"/>
-        <w:gridCol w:w="1872"/>
-        <w:gridCol w:w="1872"/>
-        <w:gridCol w:w="1872"/>
+        <w:gridCol w:w="3311"/>
+        <w:gridCol w:w="1512"/>
+        <w:gridCol w:w="1512"/>
+        <w:gridCol w:w="1512"/>
+        <w:gridCol w:w="1512"/>
       </w:tblGrid>
       <w:tr>
         <w:tc>
           <w:tcPr>
-            <w:tcW w:type="dxa" w:w="1872"/>
+            <w:tcW w:type="dxa" w:w="3312"/>
             <w:tcBorders>
               <w:top w:val="single" w:sz="6" w:color="000000"/>
               <w:bottom w:val="single" w:sz="6" w:color="000000"/>
@@ -3239,7 +3423,7 @@
         </w:tc>
         <w:tc>
           <w:tcPr>
-            <w:tcW w:type="dxa" w:w="1872"/>
+            <w:tcW w:type="dxa" w:w="1512"/>
             <w:tcBorders>
               <w:top w:val="single" w:sz="6" w:color="000000"/>
               <w:bottom w:val="single" w:sz="6" w:color="000000"/>
@@ -3262,7 +3446,7 @@
         </w:tc>
         <w:tc>
           <w:tcPr>
-            <w:tcW w:type="dxa" w:w="1872"/>
+            <w:tcW w:type="dxa" w:w="1512"/>
             <w:tcBorders>
               <w:top w:val="single" w:sz="6" w:color="000000"/>
               <w:bottom w:val="single" w:sz="6" w:color="000000"/>
@@ -3285,7 +3469,7 @@
         </w:tc>
         <w:tc>
           <w:tcPr>
-            <w:tcW w:type="dxa" w:w="1872"/>
+            <w:tcW w:type="dxa" w:w="1512"/>
             <w:tcBorders>
               <w:top w:val="single" w:sz="6" w:color="000000"/>
               <w:bottom w:val="single" w:sz="6" w:color="000000"/>
@@ -3308,7 +3492,7 @@
         </w:tc>
         <w:tc>
           <w:tcPr>
-            <w:tcW w:type="dxa" w:w="1872"/>
+            <w:tcW w:type="dxa" w:w="1512"/>
             <w:tcBorders>
               <w:top w:val="single" w:sz="6" w:color="000000"/>
               <w:bottom w:val="single" w:sz="6" w:color="000000"/>
@@ -3333,7 +3517,7 @@
       <w:tr>
         <w:tc>
           <w:tcPr>
-            <w:tcW w:type="dxa" w:w="1872"/>
+            <w:tcW w:type="dxa" w:w="3312"/>
           </w:tcPr>
           <w:p>
             <w:pPr>
@@ -3350,7 +3534,7 @@
         </w:tc>
         <w:tc>
           <w:tcPr>
-            <w:tcW w:type="dxa" w:w="1872"/>
+            <w:tcW w:type="dxa" w:w="1512"/>
           </w:tcPr>
           <w:p>
             <w:pPr>
@@ -3368,7 +3552,7 @@
         </w:tc>
         <w:tc>
           <w:tcPr>
-            <w:tcW w:type="dxa" w:w="1872"/>
+            <w:tcW w:type="dxa" w:w="1512"/>
           </w:tcPr>
           <w:p>
             <w:pPr>
@@ -3386,7 +3570,7 @@
         </w:tc>
         <w:tc>
           <w:tcPr>
-            <w:tcW w:type="dxa" w:w="1872"/>
+            <w:tcW w:type="dxa" w:w="1512"/>
           </w:tcPr>
           <w:p>
             <w:pPr>
@@ -3404,7 +3588,7 @@
         </w:tc>
         <w:tc>
           <w:tcPr>
-            <w:tcW w:type="dxa" w:w="1872"/>
+            <w:tcW w:type="dxa" w:w="1512"/>
           </w:tcPr>
           <w:p>
             <w:pPr>
@@ -3424,7 +3608,7 @@
       <w:tr>
         <w:tc>
           <w:tcPr>
-            <w:tcW w:type="dxa" w:w="1872"/>
+            <w:tcW w:type="dxa" w:w="3312"/>
           </w:tcPr>
           <w:p>
             <w:pPr>
@@ -3441,7 +3625,7 @@
         </w:tc>
         <w:tc>
           <w:tcPr>
-            <w:tcW w:type="dxa" w:w="1872"/>
+            <w:tcW w:type="dxa" w:w="1512"/>
           </w:tcPr>
           <w:p>
             <w:pPr>
@@ -3459,7 +3643,7 @@
         </w:tc>
         <w:tc>
           <w:tcPr>
-            <w:tcW w:type="dxa" w:w="1872"/>
+            <w:tcW w:type="dxa" w:w="1512"/>
           </w:tcPr>
           <w:p>
             <w:pPr>
@@ -3477,7 +3661,7 @@
         </w:tc>
         <w:tc>
           <w:tcPr>
-            <w:tcW w:type="dxa" w:w="1872"/>
+            <w:tcW w:type="dxa" w:w="1512"/>
           </w:tcPr>
           <w:p>
             <w:pPr>
@@ -3495,7 +3679,7 @@
         </w:tc>
         <w:tc>
           <w:tcPr>
-            <w:tcW w:type="dxa" w:w="1872"/>
+            <w:tcW w:type="dxa" w:w="1512"/>
           </w:tcPr>
           <w:p>
             <w:pPr>
@@ -3515,7 +3699,7 @@
       <w:tr>
         <w:tc>
           <w:tcPr>
-            <w:tcW w:type="dxa" w:w="1872"/>
+            <w:tcW w:type="dxa" w:w="3312"/>
           </w:tcPr>
           <w:p>
             <w:pPr>
@@ -3532,7 +3716,7 @@
         </w:tc>
         <w:tc>
           <w:tcPr>
-            <w:tcW w:type="dxa" w:w="1872"/>
+            <w:tcW w:type="dxa" w:w="1512"/>
           </w:tcPr>
           <w:p>
             <w:pPr>
@@ -3550,7 +3734,7 @@
         </w:tc>
         <w:tc>
           <w:tcPr>
-            <w:tcW w:type="dxa" w:w="1872"/>
+            <w:tcW w:type="dxa" w:w="1512"/>
           </w:tcPr>
           <w:p>
             <w:pPr>
@@ -3568,7 +3752,7 @@
         </w:tc>
         <w:tc>
           <w:tcPr>
-            <w:tcW w:type="dxa" w:w="1872"/>
+            <w:tcW w:type="dxa" w:w="1512"/>
           </w:tcPr>
           <w:p>
             <w:pPr>
@@ -3586,7 +3770,7 @@
         </w:tc>
         <w:tc>
           <w:tcPr>
-            <w:tcW w:type="dxa" w:w="1872"/>
+            <w:tcW w:type="dxa" w:w="1512"/>
           </w:tcPr>
           <w:p>
             <w:pPr>
@@ -3606,7 +3790,7 @@
       <w:tr>
         <w:tc>
           <w:tcPr>
-            <w:tcW w:type="dxa" w:w="1872"/>
+            <w:tcW w:type="dxa" w:w="3312"/>
           </w:tcPr>
           <w:p>
             <w:pPr>
@@ -3623,7 +3807,7 @@
         </w:tc>
         <w:tc>
           <w:tcPr>
-            <w:tcW w:type="dxa" w:w="1872"/>
+            <w:tcW w:type="dxa" w:w="1512"/>
           </w:tcPr>
           <w:p>
             <w:pPr>
@@ -3641,7 +3825,7 @@
         </w:tc>
         <w:tc>
           <w:tcPr>
-            <w:tcW w:type="dxa" w:w="1872"/>
+            <w:tcW w:type="dxa" w:w="1512"/>
           </w:tcPr>
           <w:p>
             <w:pPr>
@@ -3659,7 +3843,7 @@
         </w:tc>
         <w:tc>
           <w:tcPr>
-            <w:tcW w:type="dxa" w:w="1872"/>
+            <w:tcW w:type="dxa" w:w="1512"/>
           </w:tcPr>
           <w:p>
             <w:pPr>
@@ -3677,7 +3861,7 @@
         </w:tc>
         <w:tc>
           <w:tcPr>
-            <w:tcW w:type="dxa" w:w="1872"/>
+            <w:tcW w:type="dxa" w:w="1512"/>
           </w:tcPr>
           <w:p>
             <w:pPr>
@@ -3697,7 +3881,7 @@
       <w:tr>
         <w:tc>
           <w:tcPr>
-            <w:tcW w:type="dxa" w:w="1872"/>
+            <w:tcW w:type="dxa" w:w="3312"/>
           </w:tcPr>
           <w:p>
             <w:pPr>
@@ -3714,7 +3898,7 @@
         </w:tc>
         <w:tc>
           <w:tcPr>
-            <w:tcW w:type="dxa" w:w="1872"/>
+            <w:tcW w:type="dxa" w:w="1512"/>
           </w:tcPr>
           <w:p>
             <w:pPr>
@@ -3732,7 +3916,7 @@
         </w:tc>
         <w:tc>
           <w:tcPr>
-            <w:tcW w:type="dxa" w:w="1872"/>
+            <w:tcW w:type="dxa" w:w="1512"/>
           </w:tcPr>
           <w:p>
             <w:pPr>
@@ -3750,7 +3934,7 @@
         </w:tc>
         <w:tc>
           <w:tcPr>
-            <w:tcW w:type="dxa" w:w="1872"/>
+            <w:tcW w:type="dxa" w:w="1512"/>
           </w:tcPr>
           <w:p>
             <w:pPr>
@@ -3768,7 +3952,7 @@
         </w:tc>
         <w:tc>
           <w:tcPr>
-            <w:tcW w:type="dxa" w:w="1872"/>
+            <w:tcW w:type="dxa" w:w="1512"/>
           </w:tcPr>
           <w:p>
             <w:pPr>
@@ -3788,7 +3972,7 @@
       <w:tr>
         <w:tc>
           <w:tcPr>
-            <w:tcW w:type="dxa" w:w="1872"/>
+            <w:tcW w:type="dxa" w:w="3312"/>
           </w:tcPr>
           <w:p>
             <w:pPr>
@@ -3805,7 +3989,7 @@
         </w:tc>
         <w:tc>
           <w:tcPr>
-            <w:tcW w:type="dxa" w:w="1872"/>
+            <w:tcW w:type="dxa" w:w="1512"/>
           </w:tcPr>
           <w:p>
             <w:pPr>
@@ -3823,7 +4007,7 @@
         </w:tc>
         <w:tc>
           <w:tcPr>
-            <w:tcW w:type="dxa" w:w="1872"/>
+            <w:tcW w:type="dxa" w:w="1512"/>
           </w:tcPr>
           <w:p>
             <w:pPr>
@@ -3841,7 +4025,7 @@
         </w:tc>
         <w:tc>
           <w:tcPr>
-            <w:tcW w:type="dxa" w:w="1872"/>
+            <w:tcW w:type="dxa" w:w="1512"/>
           </w:tcPr>
           <w:p>
             <w:pPr>
@@ -3859,7 +4043,7 @@
         </w:tc>
         <w:tc>
           <w:tcPr>
-            <w:tcW w:type="dxa" w:w="1872"/>
+            <w:tcW w:type="dxa" w:w="1512"/>
           </w:tcPr>
           <w:p>
             <w:pPr>
@@ -3879,7 +4063,7 @@
       <w:tr>
         <w:tc>
           <w:tcPr>
-            <w:tcW w:type="dxa" w:w="1872"/>
+            <w:tcW w:type="dxa" w:w="3312"/>
           </w:tcPr>
           <w:p>
             <w:pPr>
@@ -3896,7 +4080,7 @@
         </w:tc>
         <w:tc>
           <w:tcPr>
-            <w:tcW w:type="dxa" w:w="1872"/>
+            <w:tcW w:type="dxa" w:w="1512"/>
           </w:tcPr>
           <w:p>
             <w:pPr>
@@ -3914,7 +4098,7 @@
         </w:tc>
         <w:tc>
           <w:tcPr>
-            <w:tcW w:type="dxa" w:w="1872"/>
+            <w:tcW w:type="dxa" w:w="1512"/>
           </w:tcPr>
           <w:p>
             <w:pPr>
@@ -3932,7 +4116,7 @@
         </w:tc>
         <w:tc>
           <w:tcPr>
-            <w:tcW w:type="dxa" w:w="1872"/>
+            <w:tcW w:type="dxa" w:w="1512"/>
           </w:tcPr>
           <w:p>
             <w:pPr>
@@ -3950,7 +4134,7 @@
         </w:tc>
         <w:tc>
           <w:tcPr>
-            <w:tcW w:type="dxa" w:w="1872"/>
+            <w:tcW w:type="dxa" w:w="1512"/>
           </w:tcPr>
           <w:p>
             <w:pPr>
@@ -3970,7 +4154,280 @@
       <w:tr>
         <w:tc>
           <w:tcPr>
-            <w:tcW w:type="dxa" w:w="1872"/>
+            <w:tcW w:type="dxa" w:w="3312"/>
+          </w:tcPr>
+          <w:p>
+            <w:pPr>
+              <w:spacing w:after="0" w:line="240" w:lineRule="auto"/>
+            </w:pPr>
+            <w:r/>
+            <w:r>
+              <w:rPr>
+                <w:sz w:val="18"/>
+              </w:rPr>
+              <w:t>R7 Linear pre-trend removed</w:t>
+            </w:r>
+          </w:p>
+        </w:tc>
+        <w:tc>
+          <w:tcPr>
+            <w:tcW w:type="dxa" w:w="1512"/>
+          </w:tcPr>
+          <w:p>
+            <w:pPr>
+              <w:spacing w:after="0" w:line="240" w:lineRule="auto"/>
+              <w:jc w:val="center"/>
+            </w:pPr>
+            <w:r/>
+            <w:r>
+              <w:rPr>
+                <w:sz w:val="18"/>
+              </w:rPr>
+              <w:t>−0.052 (0.034)</w:t>
+            </w:r>
+          </w:p>
+        </w:tc>
+        <w:tc>
+          <w:tcPr>
+            <w:tcW w:type="dxa" w:w="1512"/>
+          </w:tcPr>
+          <w:p>
+            <w:pPr>
+              <w:spacing w:after="0" w:line="240" w:lineRule="auto"/>
+              <w:jc w:val="center"/>
+            </w:pPr>
+            <w:r/>
+            <w:r>
+              <w:rPr>
+                <w:sz w:val="18"/>
+              </w:rPr>
+              <w:t>−0.134*** (0.042)</w:t>
+            </w:r>
+          </w:p>
+        </w:tc>
+        <w:tc>
+          <w:tcPr>
+            <w:tcW w:type="dxa" w:w="1512"/>
+          </w:tcPr>
+          <w:p>
+            <w:pPr>
+              <w:spacing w:after="0" w:line="240" w:lineRule="auto"/>
+              <w:jc w:val="center"/>
+            </w:pPr>
+            <w:r/>
+            <w:r>
+              <w:rPr>
+                <w:sz w:val="18"/>
+              </w:rPr>
+              <w:t>0.023*** (0.006)</w:t>
+            </w:r>
+          </w:p>
+        </w:tc>
+        <w:tc>
+          <w:tcPr>
+            <w:tcW w:type="dxa" w:w="1512"/>
+          </w:tcPr>
+          <w:p>
+            <w:pPr>
+              <w:spacing w:after="0" w:line="240" w:lineRule="auto"/>
+              <w:jc w:val="center"/>
+            </w:pPr>
+            <w:r/>
+            <w:r>
+              <w:rPr>
+                <w:sz w:val="18"/>
+              </w:rPr>
+              <w:t>0.011 (0.023)</w:t>
+            </w:r>
+          </w:p>
+        </w:tc>
+      </w:tr>
+      <w:tr>
+        <w:tc>
+          <w:tcPr>
+            <w:tcW w:type="dxa" w:w="3312"/>
+          </w:tcPr>
+          <w:p>
+            <w:pPr>
+              <w:spacing w:after="0" w:line="240" w:lineRule="auto"/>
+            </w:pPr>
+            <w:r/>
+            <w:r>
+              <w:rPr>
+                <w:sz w:val="18"/>
+              </w:rPr>
+              <w:t>R8 Controlling for pre-coverage growth</w:t>
+            </w:r>
+          </w:p>
+        </w:tc>
+        <w:tc>
+          <w:tcPr>
+            <w:tcW w:type="dxa" w:w="1512"/>
+          </w:tcPr>
+          <w:p>
+            <w:pPr>
+              <w:spacing w:after="0" w:line="240" w:lineRule="auto"/>
+              <w:jc w:val="center"/>
+            </w:pPr>
+            <w:r/>
+            <w:r>
+              <w:rPr>
+                <w:sz w:val="18"/>
+              </w:rPr>
+              <w:t>0.028 (0.025)</w:t>
+            </w:r>
+          </w:p>
+        </w:tc>
+        <w:tc>
+          <w:tcPr>
+            <w:tcW w:type="dxa" w:w="1512"/>
+          </w:tcPr>
+          <w:p>
+            <w:pPr>
+              <w:spacing w:after="0" w:line="240" w:lineRule="auto"/>
+              <w:jc w:val="center"/>
+            </w:pPr>
+            <w:r/>
+            <w:r>
+              <w:rPr>
+                <w:sz w:val="18"/>
+              </w:rPr>
+              <w:t>−0.034 (0.032)</w:t>
+            </w:r>
+          </w:p>
+        </w:tc>
+        <w:tc>
+          <w:tcPr>
+            <w:tcW w:type="dxa" w:w="1512"/>
+          </w:tcPr>
+          <w:p>
+            <w:pPr>
+              <w:spacing w:after="0" w:line="240" w:lineRule="auto"/>
+              <w:jc w:val="center"/>
+            </w:pPr>
+            <w:r/>
+            <w:r>
+              <w:rPr>
+                <w:sz w:val="18"/>
+              </w:rPr>
+              <w:t>0.008 (0.005)</w:t>
+            </w:r>
+          </w:p>
+        </w:tc>
+        <w:tc>
+          <w:tcPr>
+            <w:tcW w:type="dxa" w:w="1512"/>
+          </w:tcPr>
+          <w:p>
+            <w:pPr>
+              <w:spacing w:after="0" w:line="240" w:lineRule="auto"/>
+              <w:jc w:val="center"/>
+            </w:pPr>
+            <w:r/>
+            <w:r>
+              <w:rPr>
+                <w:sz w:val="18"/>
+              </w:rPr>
+              <w:t>0.043** (0.018)</w:t>
+            </w:r>
+          </w:p>
+        </w:tc>
+      </w:tr>
+      <w:tr>
+        <w:tc>
+          <w:tcPr>
+            <w:tcW w:type="dxa" w:w="3312"/>
+          </w:tcPr>
+          <w:p>
+            <w:pPr>
+              <w:spacing w:after="0" w:line="240" w:lineRule="auto"/>
+            </w:pPr>
+            <w:r/>
+            <w:r>
+              <w:rPr>
+                <w:sz w:val="18"/>
+              </w:rPr>
+              <w:t>R9 Excluding Malaysia</w:t>
+            </w:r>
+          </w:p>
+        </w:tc>
+        <w:tc>
+          <w:tcPr>
+            <w:tcW w:type="dxa" w:w="1512"/>
+          </w:tcPr>
+          <w:p>
+            <w:pPr>
+              <w:spacing w:after="0" w:line="240" w:lineRule="auto"/>
+              <w:jc w:val="center"/>
+            </w:pPr>
+            <w:r/>
+            <w:r>
+              <w:rPr>
+                <w:sz w:val="18"/>
+              </w:rPr>
+              <w:t>−0.003 (0.035)</w:t>
+            </w:r>
+          </w:p>
+        </w:tc>
+        <w:tc>
+          <w:tcPr>
+            <w:tcW w:type="dxa" w:w="1512"/>
+          </w:tcPr>
+          <w:p>
+            <w:pPr>
+              <w:spacing w:after="0" w:line="240" w:lineRule="auto"/>
+              <w:jc w:val="center"/>
+            </w:pPr>
+            <w:r/>
+            <w:r>
+              <w:rPr>
+                <w:sz w:val="18"/>
+              </w:rPr>
+              <w:t>0.037 (0.038)</w:t>
+            </w:r>
+          </w:p>
+        </w:tc>
+        <w:tc>
+          <w:tcPr>
+            <w:tcW w:type="dxa" w:w="1512"/>
+          </w:tcPr>
+          <w:p>
+            <w:pPr>
+              <w:spacing w:after="0" w:line="240" w:lineRule="auto"/>
+              <w:jc w:val="center"/>
+            </w:pPr>
+            <w:r/>
+            <w:r>
+              <w:rPr>
+                <w:sz w:val="18"/>
+              </w:rPr>
+              <w:t>0.022*** (0.008)</w:t>
+            </w:r>
+          </w:p>
+        </w:tc>
+        <w:tc>
+          <w:tcPr>
+            <w:tcW w:type="dxa" w:w="1512"/>
+          </w:tcPr>
+          <w:p>
+            <w:pPr>
+              <w:spacing w:after="0" w:line="240" w:lineRule="auto"/>
+              <w:jc w:val="center"/>
+            </w:pPr>
+            <w:r/>
+            <w:r>
+              <w:rPr>
+                <w:sz w:val="18"/>
+              </w:rPr>
+              <w:t>0.046 (0.029)</w:t>
+            </w:r>
+          </w:p>
+        </w:tc>
+      </w:tr>
+      <w:tr>
+        <w:tc>
+          <w:tcPr>
+            <w:tcW w:type="dxa" w:w="3312"/>
           </w:tcPr>
           <w:p>
             <w:pPr>
@@ -3987,7 +4444,7 @@
         </w:tc>
         <w:tc>
           <w:tcPr>
-            <w:tcW w:type="dxa" w:w="1872"/>
+            <w:tcW w:type="dxa" w:w="1512"/>
           </w:tcPr>
           <w:p>
             <w:pPr>
@@ -4005,7 +4462,7 @@
         </w:tc>
         <w:tc>
           <w:tcPr>
-            <w:tcW w:type="dxa" w:w="1872"/>
+            <w:tcW w:type="dxa" w:w="1512"/>
           </w:tcPr>
           <w:p>
             <w:pPr>
@@ -4023,7 +4480,7 @@
         </w:tc>
         <w:tc>
           <w:tcPr>
-            <w:tcW w:type="dxa" w:w="1872"/>
+            <w:tcW w:type="dxa" w:w="1512"/>
           </w:tcPr>
           <w:p>
             <w:pPr>
@@ -4041,7 +4498,7 @@
         </w:tc>
         <w:tc>
           <w:tcPr>
-            <w:tcW w:type="dxa" w:w="1872"/>
+            <w:tcW w:type="dxa" w:w="1512"/>
           </w:tcPr>
           <w:p>
             <w:pPr>
@@ -4061,7 +4518,7 @@
       <w:tr>
         <w:tc>
           <w:tcPr>
-            <w:tcW w:type="dxa" w:w="1872"/>
+            <w:tcW w:type="dxa" w:w="3312"/>
           </w:tcPr>
           <w:p>
             <w:pPr>
@@ -4078,7 +4535,7 @@
         </w:tc>
         <w:tc>
           <w:tcPr>
-            <w:tcW w:type="dxa" w:w="1872"/>
+            <w:tcW w:type="dxa" w:w="1512"/>
           </w:tcPr>
           <w:p>
             <w:pPr>
@@ -4096,7 +4553,7 @@
         </w:tc>
         <w:tc>
           <w:tcPr>
-            <w:tcW w:type="dxa" w:w="1872"/>
+            <w:tcW w:type="dxa" w:w="1512"/>
           </w:tcPr>
           <w:p>
             <w:pPr>
@@ -4114,7 +4571,7 @@
         </w:tc>
         <w:tc>
           <w:tcPr>
-            <w:tcW w:type="dxa" w:w="1872"/>
+            <w:tcW w:type="dxa" w:w="1512"/>
           </w:tcPr>
           <w:p>
             <w:pPr>
@@ -4132,7 +4589,7 @@
         </w:tc>
         <w:tc>
           <w:tcPr>
-            <w:tcW w:type="dxa" w:w="1872"/>
+            <w:tcW w:type="dxa" w:w="1512"/>
           </w:tcPr>
           <w:p>
             <w:pPr>
@@ -4152,7 +4609,7 @@
       <w:tr>
         <w:tc>
           <w:tcPr>
-            <w:tcW w:type="dxa" w:w="1872"/>
+            <w:tcW w:type="dxa" w:w="3312"/>
             <w:tcBorders>
               <w:bottom w:val="single" w:sz="6" w:color="000000"/>
             </w:tcBorders>
@@ -4172,7 +4629,7 @@
         </w:tc>
         <w:tc>
           <w:tcPr>
-            <w:tcW w:type="dxa" w:w="1872"/>
+            <w:tcW w:type="dxa" w:w="1512"/>
             <w:tcBorders>
               <w:bottom w:val="single" w:sz="6" w:color="000000"/>
             </w:tcBorders>
@@ -4193,7 +4650,7 @@
         </w:tc>
         <w:tc>
           <w:tcPr>
-            <w:tcW w:type="dxa" w:w="1872"/>
+            <w:tcW w:type="dxa" w:w="1512"/>
             <w:tcBorders>
               <w:bottom w:val="single" w:sz="6" w:color="000000"/>
             </w:tcBorders>
@@ -4214,7 +4671,7 @@
         </w:tc>
         <w:tc>
           <w:tcPr>
-            <w:tcW w:type="dxa" w:w="1872"/>
+            <w:tcW w:type="dxa" w:w="1512"/>
             <w:tcBorders>
               <w:bottom w:val="single" w:sz="6" w:color="000000"/>
             </w:tcBorders>
@@ -4235,7 +4692,7 @@
         </w:tc>
         <w:tc>
           <w:tcPr>
-            <w:tcW w:type="dxa" w:w="1872"/>
+            <w:tcW w:type="dxa" w:w="1512"/>
             <w:tcBorders>
               <w:bottom w:val="single" w:sz="6" w:color="000000"/>
             </w:tcBorders>
@@ -4264,27 +4721,7 @@
         <w:rPr>
           <w:sz w:val="20"/>
         </w:rPr>
-        <w:t xml:space="preserve">Each cell reports the average effect over event years 0 to 3 with the bootstrap standard error in parentheses (firm-clustered standard error for the two-way fixed effects row). High and low initial scores split scored firms at the median first score of their cohort; </w:t>
-      </w:r>
-      <w:r>
-        <w:rPr>
-          <w:i/>
-          <w:sz w:val="20"/>
-        </w:rPr>
-        <w:t xml:space="preserve">, </w:t>
-      </w:r>
-      <w:r>
-        <w:rPr>
-          <w:i/>
-          <w:sz w:val="20"/>
-        </w:rPr>
-        <w:t xml:space="preserve">, and </w:t>
-      </w:r>
-      <w:r>
-        <w:rPr>
-          <w:sz w:val="20"/>
-        </w:rPr>
-        <w:t>** denote significance at the 10%, 5%, and 1% levels.</w:t>
+        <w:t>Each cell reports the average effect over event years 0 to 3 with the bootstrap standard error in parentheses (firm-clustered standard error in row R6). High and low initial scores split scored firms at the median first score of their cohort; *, **, and *** denote significance at the 10%, 5%, and 1% levels based on unadjusted p-values.</w:t>
       </w:r>
     </w:p>
     <w:p>

</xml_diff>

<commit_message>
Rebuild after Table 2 star removal; Stage 3' manuscript inputs (v1.1 vs v2 + diff)
Co-Authored-By: Claude Opus 5.5 <noreply@anthropic.com>
Claude-Session: https://claude.ai/code/session_01Ka6Duc4zGYgPZcHc3gHgFv
</commit_message>
<xml_diff>
--- a/manuscript/Manuscript_Anonymized.docx
+++ b/manuscript/Manuscript_Anonymized.docx
@@ -2673,12 +2673,21 @@
           </m:e>
           <m:sub>
             <m:r>
+              <m:rPr>
+                <m:sty m:val="p"/>
+              </m:rPr>
               <m:t>p</m:t>
             </m:r>
             <m:r>
+              <m:rPr>
+                <m:sty m:val="p"/>
+              </m:rPr>
               <m:t>r</m:t>
             </m:r>
             <m:r>
+              <m:rPr>
+                <m:sty m:val="p"/>
+              </m:rPr>
               <m:t>e</m:t>
             </m:r>
           </m:sub>
@@ -2707,12 +2716,21 @@
           </m:e>
           <m:sub>
             <m:r>
+              <m:rPr>
+                <m:sty m:val="p"/>
+              </m:rPr>
               <m:t>p</m:t>
             </m:r>
             <m:r>
+              <m:rPr>
+                <m:sty m:val="p"/>
+              </m:rPr>
               <m:t>r</m:t>
             </m:r>
             <m:r>
+              <m:rPr>
+                <m:sty m:val="p"/>
+              </m:rPr>
               <m:t>e</m:t>
             </m:r>
           </m:sub>
@@ -2746,12 +2764,21 @@
           </m:e>
           <m:sub>
             <m:r>
+              <m:rPr>
+                <m:sty m:val="p"/>
+              </m:rPr>
               <m:t>p</m:t>
             </m:r>
             <m:r>
+              <m:rPr>
+                <m:sty m:val="p"/>
+              </m:rPr>
               <m:t>r</m:t>
             </m:r>
             <m:r>
+              <m:rPr>
+                <m:sty m:val="p"/>
+              </m:rPr>
               <m:t>e</m:t>
             </m:r>
           </m:sub>
@@ -6807,7 +6834,7 @@
               <w:rPr>
                 <w:sz w:val="18"/>
               </w:rPr>
-              <w:t>0.044*</w:t>
+              <w:t>0.044</w:t>
             </w:r>
           </w:p>
         </w:tc>

</xml_diff>

<commit_message>
v2.1: citations in methods/results/discussion from existing references; citation compliance PASS; Stage 3' Phase 1 pre-commitment
Co-Authored-By: Claude Opus 5.5 <noreply@anthropic.com>
Claude-Session: https://claude.ai/code/session_01Ka6Duc4zGYgPZcHc3gHgFv
</commit_message>
<xml_diff>
--- a/manuscript/Manuscript_Anonymized.docx
+++ b/manuscript/Manuscript_Anonymized.docx
@@ -323,7 +323,7 @@
       </w:pPr>
       <w:r>
         <w:rPr/>
-        <w:t>H1 (primary): The initiation of LSEG ESG coverage changes the log MTB ratio of scored firms relative to comparable never-scored firms. The recognition and preference channels predict a positive effect. The selection view predicts no effect after coverage, together with relative growth before coverage.</w:t>
+        <w:t>H1 (primary): The initiation of LSEG ESG coverage changes the log MTB ratio of scored firms relative to comparable never-scored firms. The recognition and preference channels predict a positive effect (Merton, 1987; Pástor, Stambaugh, and Taylor, 2021; Pedersen, Fitzgibbons, and Pomorski, 2021). The selection view predicts no effect after coverage, together with relative growth before coverage, as for firms that are added to an index after a period of growth (Chen, Noronha, and Singal, 2004).</w:t>
       </w:r>
     </w:p>
     <w:p>
@@ -345,7 +345,7 @@
       </w:pPr>
       <w:r>
         <w:rPr/>
-        <w:t>H3 (heterogeneity): The effect on log MTB differs between firms that receive an initial score above and below the median of their cohort.</w:t>
+        <w:t>H3 (heterogeneity): The effect on log MTB differs between firms that receive an initial score above and below the median of their cohort, as the preference channel (Pedersen, Fitzgibbons, and Pomorski, 2021) and the evidence on favorable first coverage (Demiroglu and Ryngaert, 2010) suggest.</w:t>
       </w:r>
     </w:p>
     <w:p>
@@ -394,7 +394,7 @@
       </w:pPr>
       <w:r>
         <w:rPr/>
-        <w:t>Coverage entered the five markets in waves (Table IA2 and Figure IA1 of the Internet Appendix). Thailand and Singapore account for 108 first scores in 2019 and 2020, and Malaysia for 289 first scores in 2021 and 2022. Over the full period, Malaysian firms account for 404 of the 675 scored firms (59.9 percent), and Malaysian and Thai firms together for 84.3 percent; Indonesia contributes 42, Singapore 50, and the Philippines 14 scored firms. The pooled estimates are therefore weighted toward Malaysia and Thailand, and we report market-level estimates in the Internet Appendix. The data do not record why the provider expanded coverage in a given market and year.</w:t>
+        <w:t>Coverage entered the five markets in waves (Table IA2 and Figure IA1 of the Internet Appendix). Thailand and Singapore account for 108 first scores in 2019 and 2020, and Malaysia for 289 first scores in 2021 and 2022. Over the full period, Malaysian firms account for 404 of the 675 scored firms (59.9 percent), and Malaysian and Thai firms together for 84.3 percent; Indonesia contributes 42, Singapore 50, and the Philippines 14 scored firms. The pooled estimates are therefore weighted toward Malaysia and Thailand, and we report market-level estimates in the Internet Appendix. The data do not record why the provider expanded coverage in a given market and year; changes in disclosure rules (Singapore Exchange, 2016), which raise the information available about listed firms (Krueger, Sautner, Tang, and Zhong, 2024), and changes in index membership are possible reasons that we cannot observe.</w:t>
       </w:r>
     </w:p>
     <w:p>
@@ -430,7 +430,7 @@
       </w:pPr>
       <w:r>
         <w:rPr/>
-        <w:t>We drop financial firms, which leaves 3,423 firms. A firm's treatment year is the first fiscal year with a non-missing LSEG ESG score. Once a firm is scored, it almost always remains scored (17 of the 675 scored firms have a later year without a score), so we treat coverage as permanent. We drop the 135 firms that were already scored in 2014 because they have no pre-coverage year. The estimation sample has 3,288 firms and 36,168 firm-years: 675 firms first scored between 2015 and 2024 and 2,613 firms never scored. Table IA4 of the Internet Appendix reports the number of firm-years available for each outcome. Never-scored firms are, on average, much smaller than scored firms, and many of them are small firms with thin trading. They remain in the sample for all years in which their outcomes are observed and serve as the pool from which each cohort's counterfactual change is estimated. Because the comparison rests on changes adjusted for size, country, and industry, it does not require the two groups to have similar levels, but it does require enough never-scored firms of comparable size. The robustness check that drops never-scored firms below the size range of scored firms (Section 4.5) addresses this requirement.</w:t>
+        <w:t>We drop financial firms, which leaves 3,423 firms. A firm's treatment year is the first fiscal year with a non-missing LSEG ESG score. Once a firm is scored, it almost always remains scored (17 of the 675 scored firms have a later year without a score), so we treat coverage as permanent, which is the staggered-adoption setting of Callaway and Sant'Anna (2021). We drop the 135 firms that were already scored in 2014 because they have no pre-coverage year. The estimation sample has 3,288 firms and 36,168 firm-years: 675 firms first scored between 2015 and 2024 and 2,613 firms never scored. Table IA4 of the Internet Appendix reports the number of firm-years available for each outcome. Never-scored firms are, on average, much smaller than scored firms, and many of them are small firms with thin trading. They remain in the sample for all years in which their outcomes are observed and serve as the pool from which each cohort's counterfactual change is estimated. Because the comparison rests on changes adjusted for size, country, and industry, it does not require the two groups to have similar levels, but it does require enough never-scored firms of comparable size. The robustness check that drops never-scored firms below the size range of scored firms (Section 4.5) addresses this requirement.</w:t>
       </w:r>
     </w:p>
     <w:p>
@@ -534,7 +534,7 @@
       </w:pPr>
       <w:r>
         <w:rPr/>
-        <w:t xml:space="preserve">Let </w:t>
+        <w:t xml:space="preserve">We follow the notation of Callaway and Sant'Anna (2021). Let </w:t>
       </w:r>
       <w:r>
         <w:rPr>
@@ -1244,7 +1244,7 @@
       </w:r>
       <w:r>
         <w:rPr/>
-        <w:t xml:space="preserve"> as the outcome of never-scored firms did. The assumption concerns changes, not levels, so the large differences in size between scored and unscored firms in Table 1 do not violate it by themselves. It is violated when scored firms were on a different path before coverage, which we test.</w:t>
+        <w:t xml:space="preserve"> as the outcome of never-scored firms did. The assumption concerns changes, not levels, so the large differences in size between scored and unscored firms in Table 1 do not violate it by themselves. It is violated when scored firms were on a different path before coverage, as would happen if coverage followed a period of growth of the kind that precedes index additions (Chen, Noronha, and Singal, 2004). We test this implication with the pre-coverage estimates, and we do not rely on the test alone, because pre-trend tests can have low power and conditioning on them can distort inference (Roth, 2022).</w:t>
       </w:r>
     </w:p>
     <w:p>
@@ -1477,7 +1477,7 @@
       </w:pPr>
       <w:r>
         <w:rPr/>
-        <w:t>The fitted values from Eq. (3) give the counterfactual change for each scored firm, and the estimated group-time effect is</w:t>
+        <w:t>This is the outcome-regression version of the group-time estimator of Callaway and Sant'Anna (2021); the doubly robust version of Sant'Anna and Zhao (2020) adds a propensity-score model, which we do not use because scored and never-scored firms overlap poorly in size. The fitted values from Eq. (3) give the counterfactual change for each scored firm, and the estimated group-time effect is</w:t>
       </w:r>
     </w:p>
     <w:p>
@@ -1774,7 +1774,7 @@
       </w:r>
       <w:r>
         <w:rPr/>
-        <w:t xml:space="preserve">. We aggregate the group-time effects by years since coverage, </w:t>
+        <w:t xml:space="preserve">. Following the aggregation scheme of Callaway and Sant'Anna (2021), we average the group-time effects by years since coverage, </w:t>
       </w:r>
       <w:r>
         <w:rPr>
@@ -2030,7 +2030,7 @@
       </w:pPr>
       <w:r>
         <w:rPr/>
-        <w:t>The headline estimate averages all group-time effects from the year of the first score to three years later, again weighting each cell by its number of scored firms:</w:t>
+        <w:t>The headline estimate averages all group-time effects from the year of the first score to three years later, again weighting each cell by its number of scored firms, a variant of the simple aggregation in Callaway and Sant'Anna (2021):</w:t>
       </w:r>
     </w:p>
     <w:p>
@@ -2362,7 +2362,7 @@
       </w:pPr>
       <w:r>
         <w:rPr/>
-        <w:t>Cohorts first scored in 2022 or later are not observed for all four post-coverage years, so the composition of cohorts changes across event years. We therefore also report estimates restricted to cohorts first scored no later than 2021, which are observed through event year three.</w:t>
+        <w:t>Cohorts first scored in 2022 or later are not observed for all four post-coverage years, so the composition of cohorts changes across event years, a problem that Callaway and Sant'Anna (2021) and Baker, Larcker, and Wang (2022) discuss for event-study aggregations. We therefore also report estimates restricted to cohorts first scored no later than 2021, which are observed through event year three.</w:t>
       </w:r>
     </w:p>
     <w:p>
@@ -2373,7 +2373,7 @@
       </w:pPr>
       <w:r>
         <w:rPr/>
-        <w:t>Three design choices deserve comment. First, the baseline control group contains only firms that are never scored. Firms that are scored later are themselves likely to be growing toward the provider's universe, so using them as controls for earlier cohorts would compare two groups on similar upward paths; we report estimates that add them to the control group as a robustness check. Second, all comparisons use the year before coverage as the base year, including those for the years before coverage. The pre-coverage estimates θ̂(</w:t>
+        <w:t>Three design choices deserve comment. First, the baseline control group contains only firms that are never scored, one of the two comparison groups proposed by Callaway and Sant'Anna (2021). Firms that are scored later are themselves likely to be growing toward the provider's universe, so using them as controls for earlier cohorts would compare two groups on similar upward paths; we report estimates that add them to the control group as a robustness check. Second, all comparisons use the year before coverage as the base year, including those for the years before coverage, so that pre-coverage and post-coverage estimates are measured against the same reference point, as the pre-trend analysis of Roth (2022) presumes. The pre-coverage estimates θ̂(</w:t>
       </w:r>
       <w:r>
         <w:rPr>
@@ -2423,7 +2423,7 @@
       </w:r>
       <w:r>
         <w:rPr/>
-        <w:t xml:space="preserve"> − 1. A negative value means that scored firms grew faster over that interval. Third, the covariates are measured in the base year, at the end of any run-up. Conditioning on size at the end of a period of growth compares scored firms with never-scored firms that reached a similar size, which can absorb part of the run-up into the covariates. We therefore report estimates without covariates and estimates that condition explicitly on growth before the base year.</w:t>
+        <w:t xml:space="preserve"> − 1. A negative value means that scored firms grew faster over that interval. Third, the covariates are measured in the base year, at the end of any run-up. Because the provider's scores rise with firm size (Dobrick, Klein, and Zwergel, 2023), size is the covariate most closely related to selection into coverage. Conditioning on size at the end of a period of growth compares scored firms with never-scored firms that reached a similar size, which can absorb part of the run-up into the covariates. We therefore report estimates without covariates and estimates that condition explicitly on growth before the base year.</w:t>
       </w:r>
     </w:p>
     <w:p>
@@ -2448,7 +2448,7 @@
       </w:pPr>
       <w:r>
         <w:rPr/>
-        <w:t xml:space="preserve">Inference uses a bootstrap that resamples firms with replacement, which keeps each firm's time series intact. We draw 999 bootstrap samples with a fixed seed and use the same draws for every specification, so that differences between specifications have a valid joint distribution. We report the bootstrap standard error, the percentile 95% confidence interval, and a two-sided </w:t>
+        <w:t xml:space="preserve">Inference uses a bootstrap, as recommended by Callaway and Sant'Anna (2021) for aggregated group-time effects. We resample firms with replacement, which keeps each firm's time series intact. We draw 999 bootstrap samples with a fixed seed and use the same draws for every specification, so that differences between specifications have a valid joint distribution. We report the bootstrap standard error, the percentile 95% confidence interval, and a two-sided </w:t>
       </w:r>
       <w:r>
         <w:rPr>
@@ -2634,7 +2634,7 @@
       </w:r>
       <w:r>
         <w:rPr/>
-        <w:t xml:space="preserve"> = −5 to −2 and their bootstrap covariance matrix:</w:t>
+        <w:t xml:space="preserve"> = −5 to −2 and their bootstrap covariance matrix; following Roth (2022), we report it as a diagnostic and do not condition the analysis on its outcome:</w:t>
       </w:r>
     </w:p>
     <w:p>
@@ -2846,7 +2846,7 @@
       </w:r>
       <w:r>
         <w:rPr/>
-        <w:t xml:space="preserve"> within each cell, and we report leave-one-market-out estimates. With five markets, a bootstrap that resamples markets would rest on too few clusters to be reliable, and we do not use one.</w:t>
+        <w:t xml:space="preserve"> within each cell, and we report leave-one-market-out estimates. With five markets, a bootstrap that resamples markets would rest on too few clusters to be reliable, and we do not use one. Market-level differences in disclosure rules (Singapore Exchange, 2016; Krueger, Sautner, Tang, and Zhong, 2024) are one reason why common shocks within a market are plausible.</w:t>
       </w:r>
     </w:p>
     <w:p>
@@ -2871,7 +2871,7 @@
       </w:pPr>
       <w:r>
         <w:rPr/>
-        <w:t>Because the pre-coverage estimates cast doubt on Eq. (2), we add two exploratory checks that the pre-analysis plan did not contain. The first removes a linear trend fitted to the pre-coverage event-time estimates, with the line constrained to pass through zero in the base year:</w:t>
+        <w:t>Because the pre-coverage estimates cast doubt on Eq. (2), and because a pre-trend test that fails to reject is weak evidence for parallel trends (Roth, 2022), we add two exploratory checks that the pre-analysis plan did not contain. The first removes a linear trend fitted to the pre-coverage event-time estimates, with the line constrained to pass through zero in the base year:</w:t>
       </w:r>
     </w:p>
     <w:p>
@@ -3557,7 +3557,7 @@
       </w:pPr>
       <w:r>
         <w:rPr/>
-        <w:t>To show how a conventional design reads the same data, we estimate a static two-way fixed effects regression on scored and never-scored firms:</w:t>
+        <w:t>To show how a conventional design reads the same data, we estimate the static two-way fixed effects regression that Goodman-Bacon (2021) and Baker, Larcker, and Wang (2022) analyze, on scored and never-scored firms:</w:t>
       </w:r>
     </w:p>
     <w:p>
@@ -3796,7 +3796,7 @@
       </w:r>
       <w:r>
         <w:rPr/>
-        <w:t>, no covariates, all event years, and standard errors clustered by firm. The coefficient β compares all post-coverage years with all pre-coverage years and averages over any run-up before coverage (Goodman-Bacon, 2021).</w:t>
+        <w:t>, no covariates, all event years, and standard errors clustered by firm. The coefficient β compares all post-coverage years with all pre-coverage years and averages over any run-up before coverage; with staggered timing it also uses already-scored firms as controls for later cohorts, which biases β when effects change over time (Goodman-Bacon, 2021; Baker, Larcker, and Wang, 2022).</w:t>
       </w:r>
     </w:p>
     <w:p>
@@ -3807,7 +3807,7 @@
       </w:pPr>
       <w:r>
         <w:rPr/>
-        <w:t xml:space="preserve">The pre-analysis plan fixed five robustness checks: adding not-yet-scored firms to the controls, dropping the covariates, excluding the 2020 and 2021 cohorts, keeping only control firms whose log total assets in year </w:t>
+        <w:t xml:space="preserve">The pre-analysis plan fixed five robustness checks: adding not-yet-scored firms to the controls, the alternative comparison group of Callaway and Sant'Anna (2021), dropping the covariates, excluding the 2020 and 2021 cohorts, keeping only control firms whose log total assets in year </w:t>
       </w:r>
       <w:r>
         <w:rPr>
@@ -3880,7 +3880,7 @@
       </w:pPr>
       <w:r>
         <w:rPr/>
-        <w:t>Table 1 compares scored firms in the year before their first score with never-scored firm-years. Scored firms are much larger: their median market capitalization is 203.2 million U.S. dollars against 42.2 million for never-scored firm-years, and their median total assets are 4.3 times those of never-scored firms. Their mean MTB ratio is 2.37, compared with 1.84, and their mean return on assets is 0.064, compared with 0.045. The normalized differences are largest for size (0.69 for market capitalization and 0.61 for total assets) and small for leverage (−0.04). These differences in levels motivate the comparison of changes and the adjustment for size, country, and industry in Eq. (3).</w:t>
+        <w:t>Table 1 compares scored firms in the year before their first score with never-scored firm-years. Scored firms are much larger: their median market capitalization is 203.2 million U.S. dollars against 42.2 million for never-scored firm-years, and their median total assets are 4.3 times those of never-scored firms. Their mean MTB ratio is 2.37, compared with 1.84, and their mean return on assets is 0.064, compared with 0.045. The normalized differences are largest for size (0.69 for market capitalization and 0.61 for total assets) and small for leverage (−0.04). These differences in levels fit the view that providers extend coverage to large and visible firms (Section 2.2), and the size gap matters for the scores themselves, because larger firms receive higher scores from this provider (Dobrick, Klein, and Zwergel, 2023). They motivate the comparison of changes and the adjustment for size, country, and industry in Eq. (3).</w:t>
       </w:r>
     </w:p>
     <w:p>
@@ -3891,7 +3891,7 @@
       </w:pPr>
       <w:r>
         <w:rPr/>
-        <w:t>The medians tell a similar story. The median MTB ratio of scored firms in the year before coverage is 1.26, against 0.95 for never-scored firm-years, and the median leverage of the two groups is almost the same (0.217 and 0.205). Scored firms are therefore not more levered than unscored firms, but they are larger and valued more highly by the market in the year before coverage. Return on assets is available for far fewer firm-years than the other variables (Table 1), so we use it only descriptively and do not include it among the covariates or outcomes. The difference in MTB levels is consistent with the pre-coverage growth documented in Section 5.3: firms that enter coverage have recently gained market value relative to their book value.</w:t>
+        <w:t>The medians tell a similar story. The median MTB ratio of scored firms in the year before coverage is 1.26, against 0.95 for never-scored firm-years, and the median leverage of the two groups is almost the same (0.217 and 0.205). Scored firms are therefore not more levered than unscored firms, but they are larger and valued more highly by the market in the year before coverage. Return on assets is available for far fewer firm-years than the other variables (Table 1), so we use it only descriptively and do not include it among the covariates or outcomes. The difference in MTB levels is consistent with the pre-coverage growth documented in Section 5.3: firms that enter coverage have recently gained market value relative to their book value, as firms do before they are added to an index (Chen, Noronha, and Singal, 2004).</w:t>
       </w:r>
     </w:p>
     <w:p>
@@ -3956,7 +3956,7 @@
       </w:r>
       <w:r>
         <w:rPr/>
-        <w:t xml:space="preserve"> = 0.134). None of the four outcomes shows a significant change at the 5% level after the Holm adjustment.</w:t>
+        <w:t xml:space="preserve"> = 0.134). None of the four outcomes shows a significant change at the 5% level after the Holm adjustment. The MTB estimate is thus far from the positive effect that the recognition channel of Merton (1987) and the preference channel of Pástor, Stambaugh, and Taylor (2021) and Pedersen, Fitzgibbons, and Pomorski (2021) predict, and it contrasts with the strong response of fund flows to newly published sustainability ratings documented by Hartzmark and Sussman (2019). The absence of a significant change in leverage and assets also differs from the U.S. evidence that coverage is followed by changes in firm conduct and financial policy (Tsang et al., 2024; Tsang et al., 2025; Bikmetova and Pirinsky, 2026), although our outcomes are not the ones those studies examine.</w:t>
       </w:r>
     </w:p>
     <w:p>
@@ -3981,7 +3981,7 @@
       </w:pPr>
       <w:r>
         <w:rPr/>
-        <w:t>Figure 1 plots the event-time estimates of Eq. (5) for all four outcomes. Before the first score, the coefficients for market capitalization and MTB are negative and rise toward zero. For market capitalization, the estimates are −0.132 five years and −0.125 four years before the base year; for MTB, they are −0.095 and −0.082. A negative pre-coverage coefficient means that the scored firms' outcome was lower, relative to its base-year level, than the path of comparable never-scored firms implies; equivalently, scored firms grew faster than comparable firms in the years before the base year. Over the four years from event year −5 to the base year, scored firms' market capitalization grew 14.1 percent more than that of comparable firms, and their MTB ratio 10.0 percent more. The joint test of Eq. (8) rejects parallel pre-trends for market capitalization (</w:t>
+        <w:t>Figure 1 plots the event-time estimates of Eq. (5) for all four outcomes. Before the first score, the coefficients for market capitalization and MTB are negative and rise toward zero. For market capitalization, the estimates are −0.132 five years and −0.125 four years before the base year; for MTB, they are −0.095 and −0.082. A negative pre-coverage coefficient means that the scored firms' outcome was lower, relative to its base-year level, than the path of comparable never-scored firms implies; equivalently, scored firms grew faster than comparable firms in the years before the base year. This run-up resembles the growth that precedes additions to a major index (Shleifer, 1986; Harris and Gurel, 1986; Chen, Noronha, and Singal, 2004) and is the pattern the selection view in Section 2.2 predicts. Over the four years from event year −5 to the base year, scored firms' market capitalization grew 14.1 percent more than that of comparable firms, and their MTB ratio 10.0 percent more. The joint test of Eq. (8) rejects parallel pre-trends for market capitalization (</w:t>
       </w:r>
       <w:r>
         <w:rPr>
@@ -4031,7 +4031,7 @@
       </w:r>
       <w:r>
         <w:rPr/>
-        <w:t xml:space="preserve"> = 0.002).</w:t>
+        <w:t xml:space="preserve"> = 0.002). As Roth (2022) cautions, a joint test that does not reject at the 5% level, as for MTB, is not evidence that pre-trends are absent.</w:t>
       </w:r>
     </w:p>
     <w:p>
@@ -4062,7 +4062,7 @@
       </w:r>
       <w:r>
         <w:rPr/>
-        <w:t xml:space="preserve"> = 0.029), and the estimates for later years are not significant. Total assets rise after coverage, with an estimate of 0.090 in event year 3, and leverage returns toward its earlier level. The valuation gap between scored and comparable firms thus widens before coverage and stops widening afterwards. The paths of the balance-sheet outcomes are consistent with firms that raise equity or grow their assets before they enter coverage: leverage declines toward the base year, and total assets rise both before and after. Without data on share issuance, we cannot tell whether the growth in market capitalization before coverage reflects rising prices, new shares, or both, which is why we base statements about valuation on the MTB ratio.</w:t>
+        <w:t xml:space="preserve"> = 0.029), and the estimates for later years are not significant. Total assets rise after coverage, with an estimate of 0.090 in event year 3, and leverage returns toward its earlier level. The valuation gap between scored and comparable firms thus widens before coverage and stops widening afterwards. There is no sign of the price decline that follows a loss of analyst coverage (Kelly and Ljungqvist, 2012) or of a mirror-image increase after coverage begins. The paths of the balance-sheet outcomes are consistent with firms that raise equity or grow their assets before they enter coverage: leverage declines toward the base year, and total assets rise both before and after. Without data on share issuance, we cannot tell whether the growth in market capitalization before coverage reflects rising prices, new shares, or both, which is why we base statements about valuation on the MTB ratio.</w:t>
       </w:r>
     </w:p>
     <w:p>
@@ -4107,7 +4107,7 @@
       </w:r>
       <w:r>
         <w:rPr/>
-        <w:t xml:space="preserve"> = 0.016), and the asset effect is −0.006. Valuations therefore reach their relative peak in the first scored year and decline in the following years. This pattern is what one would expect if the provider selects firms after a period of unusually high valuation and part of that valuation later reverses, and it is also what one would expect if coverage lowered valuations. The two readings cannot be separated with these data, but neither implies a valuation gain.</w:t>
+        <w:t xml:space="preserve"> = 0.016), and the asset effect is −0.006. Valuations therefore reach their relative peak in the first scored year and decline in the following years. This pattern is what one would expect if the provider selects firms after a period of unusually high valuation and part of that valuation later reverses, and it is also what one would expect if coverage lowered valuations. The two readings cannot be separated with these data, but neither implies a valuation gain. The decline also fits the timing problems in the data: because historical scores were rewritten (Berg, Fabisik, and Sautner, 2020) and recent scores remain subject to revision (Sahin et al., 2023), the first scored fiscal year can lie before publication, and dating coverage later moves the base year closer to the end of the run-up.</w:t>
       </w:r>
     </w:p>
     <w:p>
@@ -4148,7 +4148,7 @@
       </w:r>
       <w:r>
         <w:rPr/>
-        <w:t xml:space="preserve"> = 0.265).</w:t>
+        <w:t xml:space="preserve"> = 0.265). If part of the pre-coverage growth reflected temporary demand of the kind documented around index additions, whose price effects partly reverse (Harris and Gurel, 1986), this comparison nets out the reversal and still shows no significant gain.</w:t>
       </w:r>
     </w:p>
     <w:p>
@@ -4159,7 +4159,7 @@
       </w:pPr>
       <w:r>
         <w:rPr/>
-        <w:t>Table IA5 of the Internet Appendix reports the bounds of Eq. (10). The largest change between consecutive pre-coverage MTB estimates is 0.046. With M̄ = 0.25, the robust interval for the MTB effect is −0.071 to 0.073; with M̄ = 0.5, it is −0.096 to 0.098; and with M̄ = 1, it is −0.147 to 0.148. Every interval includes zero, and none excludes effects of moderate size in either direction once departures from parallel trends of the size seen before coverage are allowed. The post-coverage null is therefore conditional on assumption (2), whereas the absence of a positive effect in every specification, including row R10, does not depend on that assumption holding exactly.</w:t>
+        <w:t>Table IA5 of the Internet Appendix reports the bounds of Eq. (10), which follow the logic of the relative-magnitudes restriction of Rambachan and Roth (2023). The largest change between consecutive pre-coverage MTB estimates is 0.046. With M̄ = 0.25, the robust interval for the MTB effect is −0.071 to 0.073; with M̄ = 0.5, it is −0.096 to 0.098; and with M̄ = 1, it is −0.147 to 0.148. Every interval includes zero, and none excludes effects of moderate size in either direction once departures from parallel trends of the size seen before coverage are allowed. The post-coverage null is therefore conditional on assumption (2), whereas the absence of a positive effect in every specification, including row R10, does not depend on that assumption holding exactly.</w:t>
       </w:r>
     </w:p>
     <w:p>
@@ -4184,7 +4184,7 @@
       </w:pPr>
       <w:r>
         <w:rPr/>
-        <w:t>The pre-specified checks in rows R1 to R4 of Table 3 leave the valuation result unchanged. The effect on log MTB is −0.001 when not-yet-scored firms join the control group, 0.025 without covariates, 0.031 without the 2020 and 2021 cohorts, and 0.016 when control firms below the size range of scored firms are dropped; none differs from zero at the 10% level. The size results are less stable. The market capitalization effect shrinks to −0.007 under the size restriction, and the asset effect falls to 0.011 without covariates and to 0.020 without the 2020 and 2021 cohorts but rises to 0.101 under the size restriction. We therefore do not read the asset estimate in Table 2 as evidence that coverage causes firms to grow.</w:t>
+        <w:t>The pre-specified checks in rows R1 to R4 of Table 3 leave the valuation result unchanged, including the change of comparison group proposed by Callaway and Sant'Anna (2021) and the removal of the outcome-regression covariates of Sant'Anna and Zhao (2020). The effect on log MTB is −0.001 when not-yet-scored firms join the control group, 0.025 without covariates, 0.031 without the 2020 and 2021 cohorts, and 0.016 when control firms below the size range of scored firms are dropped; none differs from zero at the 10% level. The size results are less stable. The market capitalization effect shrinks to −0.007 under the size restriction, and the asset effect falls to 0.011 without covariates and to 0.020 without the 2020 and 2021 cohorts but rises to 0.101 under the size restriction. We therefore do not read the asset estimate in Table 2 as evidence that coverage causes firms to grow.</w:t>
       </w:r>
     </w:p>
     <w:p>
@@ -4225,7 +4225,7 @@
       </w:r>
       <w:r>
         <w:rPr/>
-        <w:t xml:space="preserve"> = 0.014) and of 0.185 in log market capitalization to coverage. Because it compares all post-coverage years with all earlier years, it counts part of the pre-coverage growth as an effect of the rating.</w:t>
+        <w:t xml:space="preserve"> = 0.014) and of 0.185 in log market capitalization to coverage. Because it compares all post-coverage years with all earlier years, it counts part of the pre-coverage growth as an effect of the rating. The gap between rows R6 and the baseline is an example of the biases of static two-way fixed effects regressions under staggered timing described by Goodman-Bacon (2021) and Baker, Larcker, and Wang (2022).</w:t>
       </w:r>
     </w:p>
     <w:p>
@@ -4246,7 +4246,7 @@
       </w:r>
       <w:r>
         <w:rPr/>
-        <w:t xml:space="preserve"> = 0.940). The market capitalization effect is less stable: it turns to 0.037 when Malaysian firms are excluded, so the negative baseline estimate for market capitalization reflects the large Malaysian cohorts of 2021 and 2022. Estimated market by market (Table IA3), the MTB effect is 0.009 in Malaysia (372 scored firms) and 0.027 in Thailand (157 scored firms); the estimates for Indonesia, the Philippines, and Singapore rest on few scored firms and have wide confidence intervals.</w:t>
+        <w:t xml:space="preserve"> = 0.940). The market capitalization effect is less stable: it turns to 0.037 when Malaysian firms are excluded, so the negative baseline estimate for market capitalization reflects the large Malaysian cohorts of 2021 and 2022. Estimated market by market (Table IA3), the MTB effect is 0.009 in Malaysia (372 scored firms) and 0.027 in Thailand (157 scored firms); the estimates for Indonesia, the Philippines, and Singapore rest on few scored firms and have wide confidence intervals. The Singaporean estimate is of interest because Singapore required sustainability reports from financial year 2017 (Singapore Exchange, 2016), and mandatory disclosure changes the information environment on its own (Krueger, Sautner, Tang, and Zhong, 2024); it is small and imprecise.</w:t>
       </w:r>
     </w:p>
     <w:p>
@@ -4267,7 +4267,7 @@
       </w:r>
       <w:r>
         <w:rPr/>
-        <w:t xml:space="preserve"> = 0.307) is not significant, and its minimum detectable value is 0.113. We find no evidence that the content of the first score matters for valuation, but the test cannot exclude moderate differences. Because recent scores can be revised after publication (Sahin et al., 2023), the initial scores used for this split may differ from those that investors saw.</w:t>
+        <w:t xml:space="preserve"> = 0.307) is not significant, and its minimum detectable value is 0.113. We find no evidence that the content of the first score matters for valuation, but the test cannot exclude moderate differences. Pedersen, Fitzgibbons, and Pomorski (2021) predict that a high score raises prices through investor preferences, and the analyst literature finds that favorable first coverage raises prices (Demiroglu and Ryngaert, 2010); a weak signal is one explanation for the absence of such a difference, given that scores from different providers disagree (Berg, Kölbel, and Rigobon, 2022; Christensen, Serafeim, and Sikochi, 2022). Because recent scores can be revised after publication (Sahin et al., 2023), the initial scores used for this split may differ from those that investors saw.</w:t>
       </w:r>
     </w:p>
     <w:p>
@@ -4292,7 +4292,7 @@
       </w:pPr>
       <w:r>
         <w:rPr/>
-        <w:t>The confidence interval of the headline estimate is informative about persistent revaluation but not about short-lived price effects. Under assumption (2), the upper end of the interval corresponds to an increase of 4.9 percent in the MTB ratio. This is of the same order as the announcement return of 4.86 percent that Demiroglu and Ryngaert (2010) report for the first analyst coverage of neglected stocks, and larger than the price increase of more than 3 percent that Harris and Gurel (1986) report for additions to the S&amp;P 500, most of which reversed within about two weeks. Annual valuation ratios measured at fiscal year-end would not detect an announcement effect of that size that reverses within weeks. Our estimates therefore speak to whether a first score leaves a lasting mark on valuation, and they say little about trading around the day on which a score is published.</w:t>
+        <w:t>The confidence interval of the headline estimate is informative about persistent revaluation but not about short-lived price effects. Under assumption (2), the upper end of the interval corresponds to an increase of 4.9 percent in the MTB ratio. This is of the same order as the announcement return of 4.86 percent that Demiroglu and Ryngaert (2010) report for the first analyst coverage of neglected stocks, and larger than the price increase of more than 3 percent that Harris and Gurel (1986) report for additions to the S&amp;P 500, most of which reversed within about two weeks. Annual valuation ratios measured at fiscal year-end would not detect an announcement effect of that size that reverses within weeks. Our estimates therefore speak to whether a first score leaves a lasting mark on valuation, and they say little about trading around the day on which a score is published. A lasting effect would be expected from a permanent increase in investor recognition (Merton, 1987; Chen, Noronha, and Singal, 2004), while price pressure from index demand is temporary (Harris and Gurel, 1986).</w:t>
       </w:r>
     </w:p>
     <w:p>
@@ -4303,7 +4303,7 @@
       </w:pPr>
       <w:r>
         <w:rPr/>
-        <w:t>The dynamics offer a second benchmark. Over the four years before the base year, scored firms' MTB ratio grew 10.0 percent more than that of comparable firms, and their market capitalization 14.1 percent more. A lasting valuation effect as large as half of this run-up would lie at the upper end of the headline interval, and an effect as large as the run-up itself lies outside the interval under assumption (2). Relative to the growth that precedes coverage, any valuation effect of the first score is small.</w:t>
+        <w:t>The dynamics offer a second benchmark. Over the four years before the base year, scored firms' MTB ratio grew 10.0 percent more than that of comparable firms, and their market capitalization 14.1 percent more. A lasting valuation effect as large as half of this run-up would lie at the upper end of the headline interval, and an effect as large as the run-up itself lies outside the interval under assumption (2). Relative to the growth that precedes coverage, any valuation effect of the first score is small, which is consistent with a provider that covers firms after they have become visible to investors (Merton, 1987; Chen, Noronha, and Singal, 2004).</w:t>
       </w:r>
     </w:p>
     <w:p>
@@ -4341,7 +4341,7 @@
       </w:pPr>
       <w:r>
         <w:rPr/>
-        <w:t>The event study admits three readings of the flat MTB path after the first score. If scored and never-scored firms would have followed parallel paths from the base year onward, coverage had no effect on valuation within the interval reported in Section 5.2. If the pre-coverage run-up would have continued without coverage, the flat path implies that coverage lowered valuations relative to that trend, which is the reading of the trend-adjusted estimate. If instead the run-up was partly transitory and would have reversed, the flat path is consistent with a positive effect of coverage that offset the reversal. The last reading deserves weight, because firms that enter coverage after a period of relative growth are likely to be selected on transitory as well as permanent components of value.</w:t>
+        <w:t>The event study admits three readings of the flat MTB path after the first score, which correspond to different assumptions about how the pre-coverage trend would have evolved (Roth, 2022; Rambachan and Roth, 2023). If scored and never-scored firms would have followed parallel paths from the base year onward, coverage had no effect on valuation within the interval reported in Section 5.2. If the pre-coverage run-up would have continued without coverage, the flat path implies that coverage lowered valuations relative to that trend, which is the reading of the trend-adjusted estimate. If instead the run-up was partly transitory and would have reversed, the flat path is consistent with a positive effect of coverage that offset the reversal. The last reading deserves weight, because firms that enter coverage after a period of relative growth are likely to be selected on transitory as well as permanent components of value, as the partial reversal of index-addition effects illustrates (Harris and Gurel, 1986; Chen, Noronha, and Singal, 2004).</w:t>
       </w:r>
     </w:p>
     <w:p>
@@ -4352,7 +4352,7 @@
       </w:pPr>
       <w:r>
         <w:rPr/>
-        <w:t>Three pieces of evidence speak to the reversal reading. First, when coverage is dated one year later, MTB ratios decline after the first scored year, which is what a reversal would produce and gives no sign of an offsetting gain. Second, when scored firms are compared with never-scored firms that grew at a similar rate before coverage, and that are therefore subject to similar reversal, the MTB effect is small and insignificant. Third, the bounds in Section 5.4 include zero for every value of M̄ we consider, but they also include effects of several percent in both directions. The evidence therefore does not show that coverage has no effect. It shows that no specification detects a valuation gain after the first score, and that the most robust feature of the data is the ordering of events: the first score follows a period of relative growth and coincides with a valuation peak.</w:t>
+        <w:t>Three pieces of evidence speak to the reversal reading. First, when coverage is dated one year later, MTB ratios decline after the first scored year, which is what a reversal would produce and gives no sign of an offsetting gain. Second, when scored firms are compared with never-scored firms that grew at a similar rate before coverage, and that are therefore subject to similar reversal, the MTB effect is small and insignificant. Third, the bounds in Section 5.4, built on the relative-magnitudes idea of Rambachan and Roth (2023), include zero for every value of M̄ we consider, but they also include effects of several percent in both directions. The evidence therefore does not show that coverage has no effect. It shows that no specification detects a valuation gain after the first score, and that the most robust feature of the data is the ordering of events: the first score follows a period of relative growth and coincides with a valuation peak.</w:t>
       </w:r>
     </w:p>
     <w:p>
@@ -4363,7 +4363,7 @@
       </w:pPr>
       <w:r>
         <w:rPr/>
-        <w:t>The market-level estimates reinforce this reading. The two markets with enough scored firms for precise estimates, Malaysia and Thailand, both show MTB effects close to zero, and no market shows a significant positive effect. The coverage waves differ in timing across markets: the Thai and Singaporean waves came in 2019 and 2020, the Malaysian wave in 2021 and 2022. A common market-wide shock is therefore unlikely to explain the pattern, although the waves may reflect market-specific changes in disclosure rules or index composition that we do not observe.</w:t>
+        <w:t>The market-level estimates reinforce this reading. The two markets with enough scored firms for precise estimates, Malaysia and Thailand, both show MTB effects close to zero, and no market shows a significant positive effect. The coverage waves differ in timing across markets: the Thai and Singaporean waves came in 2019 and 2020, the Malaysian wave in 2021 and 2022. A common market-wide shock is therefore unlikely to explain the pattern, although the waves may reflect market-specific changes in disclosure rules (Singapore Exchange, 2016; Krueger, Sautner, Tang, and Zhong, 2024) or index composition that we do not observe.</w:t>
       </w:r>
     </w:p>
     <w:p>
@@ -4435,7 +4435,7 @@
       </w:pPr>
       <w:r>
         <w:rPr/>
-        <w:t>For listed firms in the five markets, the estimates give no support to the expectation that a first LSEG score will raise the market valuation of their shares, although they cannot rule out effects smaller than about 7.0 percent. For investors and exchanges, the results imply that the set of scored firms is a selected group whose valuation history differs from that of unscored firms, which matters for index construction and for any comparison of the two groups. Whether the same ordering holds in other emerging markets, or for other rating providers, is a hypothesis that these data cannot test.</w:t>
+        <w:t>For listed firms in the five markets, the estimates give no support to the expectation that a first LSEG score will raise the market valuation of their shares through investor recognition or preferences (Merton, 1987; Pástor, Stambaugh, and Taylor, 2021), although they cannot rule out effects smaller than about 7.0 percent. For investors and exchanges, the results imply that the set of scored firms is a selected group whose valuation history differs from that of unscored firms, which matters for index construction and for any comparison of the two groups. Whether the same ordering holds in other emerging markets, or for other rating providers, is a hypothesis that these data cannot test.</w:t>
       </w:r>
     </w:p>
     <w:p>

</xml_diff>

<commit_message>
Language round 1 merged (body 8,316 to 6,313 words); Supplemental Appendix naming (Table S1-S6, Fig. S1)
Co-Authored-By: Claude Opus 5.5 <noreply@anthropic.com>
Claude-Session: https://claude.ai/code/session_01Ka6Duc4zGYgPZcHc3gHgFv
</commit_message>
<xml_diff>
--- a/manuscript/Manuscript_Anonymized.docx
+++ b/manuscript/Manuscript_Anonymized.docx
@@ -45,7 +45,7 @@
       </w:pPr>
       <w:r>
         <w:rPr/>
-        <w:t>Using the staggered first appearance of London Stock Exchange Group (LSEG) environmental, social, and governance (ESG) scores for 675 non-financial firms in five Southeast Asian markets, mostly Malaysian and Thai, and 2,613 never-scored firms, we estimate heterogeneity-robust difference-in-differences effects on market-to-book ratios. Scored firms' market capitalization and market-to-book ratios grew faster than those of comparable firms before their first scored year. Under parallel trends, market-to-book ratios did not rise afterwards (estimate 0.002; 95% interval −0.046 to 0.048). The first scored year coincides with a valuation peak, and we detect no later gain.</w:t>
+        <w:t>Using the staggered first appearance of London Stock Exchange Group (LSEG) environmental, social, and governance (ESG) scores for 675 non-financial firms in five Southeast Asian markets, mostly Malaysian and Thai, and 2,613 never-scored firms, we estimate heterogeneity-robust difference-in-differences effects on market-to-book ratios. Before their first scored year, scored firms' market capitalization and market-to-book ratios grew faster than those of comparable firms. Under parallel trends, market-to-book ratios did not rise afterwards (estimate 0.002; 95% interval −0.046 to 0.048). The first scored year coincides with a valuation peak, and we detect no later gain.</w:t>
       </w:r>
     </w:p>
     <w:p>
@@ -104,7 +104,7 @@
       </w:pPr>
       <w:r>
         <w:rPr/>
-        <w:t>Environmental, social, and governance (ESG) scores now enter portfolio screens, index rules, and the mandates of sustainable funds. For a listed firm, the question of whether it is scored at all can matter as much as the level of its score. A firm without a score cannot enter a portfolio that holds only rated stocks, and a first score can, in principle, widen the set of investors who follow the stock. Merton (1987) shows that a larger investor base lowers the required return and raises the price of a stock. Models of sustainable investing add a preference channel: investors who value ESG attributes accept lower expected returns on assets they can classify as sustainable (Pástor et al., 2021; Pedersen et al., 2021). Evidence from mutual funds shows that investors respond strongly to newly published sustainability ratings (Hartzmark &amp; Sussman, 2019). Together, these arguments predict that the initiation of ESG rating coverage raises a firm's market valuation.</w:t>
+        <w:t>Environmental, social, and governance (ESG) scores enter portfolio screens, index rules, and fund mandates, so whether a listed firm is scored at all can matter as much as its score. An unscored firm cannot enter a portfolio that holds only rated stocks, and a first score can widen the firm's investor base. Merton (1987) shows that a larger investor base raises a stock's price, and investors who value ESG attributes accept lower expected returns on assets they can classify as sustainable (Pástor et al., 2021; Pedersen et al., 2021). Both arguments predict that the initiation of ESG coverage raises a firm's valuation.</w:t>
       </w:r>
     </w:p>
     <w:p>
@@ -115,7 +115,7 @@
       </w:pPr>
       <w:r>
         <w:rPr/>
-        <w:t>A second prediction runs in the opposite direction of causality. Rating providers decide which firms to score, and a firm is likely to enter a provider's universe after it has become large, liquid, or visible enough to matter to the provider's clients, for example by joining an index, so coverage resembles an index addition. Additions to a major index raise prices around the announcement (Harris &amp; Gurel, 1986; Shleifer, 1986), part of the effect reverses within weeks (Harris &amp; Gurel, 1986), and a permanent component has been attributed to greater investor awareness (Chen et al., 2004). If coverage responds to past growth in market value, scored firms will look more valuable than unscored firms even when the score itself changes nothing. A static comparison of rated and unrated firms, or a regression that pools all years before and after coverage, then attributes past growth to the rating.</w:t>
+        <w:t>A second prediction reverses the direction of causality. Providers choose which firms to score and likely add a firm once it is large, liquid, or visible enough to matter to their clients, for example after it joins an index. Additions to a major index raise prices (Harris &amp; Gurel, 1986; Shleifer, 1986), and part of the effect reverses within weeks (Harris &amp; Gurel, 1986). If coverage follows growth in market value, a comparison of rated and unrated firms, or a regression pooling all years around coverage, attributes past growth to the rating.</w:t>
       </w:r>
     </w:p>
     <w:p>
@@ -126,7 +126,7 @@
       </w:pPr>
       <w:r>
         <w:rPr/>
-        <w:t>The studies of rating coverage that we build on use U.S. firms. Tsang et al. (2024) find that firms covered by more ESG rating agencies commit fewer ESG violations, and the same authors document dividend changes after the initiation of coverage by non-financial rating agencies (Tsang et al., 2025). Bikmetova and Pirinsky (2026) study the intensity of coverage among U.S. firms and find that additional coverage is followed by lower toxic emissions, better ratings, and higher ownership by institutions that prefer high-ESG stocks. Research on sell-side analysts offers a closer analogue for valuation: the loss of analyst coverage lowers prices (Kelly &amp; Ljungqvist, 2012), and the first analyst report on a neglected stock earns a positive announcement return that is driven by favorable coverage rather than by coverage as such (Demiroglu &amp; Ryngaert, 2010). What we do not know is whether the first appearance of a firm-level ESG score moves the valuation of firms in emerging equity markets, where most listed firms are unscored and where coverage has expanded in large waves.</w:t>
+        <w:t>The studies of rating coverage that we build on use U.S. firms and outcomes other than valuation. Tsang et al. (2024) link coverage by more ESG raters to fewer ESG violations, and Bikmetova and Pirinsky (2026) link additional coverage to lower toxic emissions, better ratings, and more ownership by high-ESG institutions. Dividends also change after coverage by non-financial rating agencies begins (Tsang et al., 2025). For valuation, sell-side analysts offer a closer analogue: the loss of analyst coverage lowers prices (Kelly &amp; Ljungqvist, 2012), and the first report on a neglected stock earns a positive return driven by favorable coverage rather than by coverage itself (Demiroglu &amp; Ryngaert, 2010). We do not know whether a first ESG score moves valuations in emerging markets, where most listed firms are unscored and coverage has expanded in waves.</w:t>
       </w:r>
     </w:p>
     <w:p>
@@ -137,7 +137,7 @@
       </w:pPr>
       <w:r>
         <w:rPr/>
-        <w:t>We study this question in five Southeast Asian markets: Indonesia, Malaysia, the Philippines, Singapore, and Thailand. The London Stock Exchange Group (LSEG), whose ESG scores were previously distributed as Refinitiv ESG and earlier as ASSET4 scores, extended coverage in these markets in waves that differ by market: 577 of the 675 non-financial firms that entered coverage between 2015 and 2024 did so in 2020 to 2023. Most listed firms remained unscored and serve as comparison firms. We treat the first fiscal year with an LSEG ESG score as a staggered event and estimate group-time average treatment effects on the treated (ATT) with the estimator of Callaway and Sant'Anna (2021), which avoids the biases of two-way fixed effects regressions when treatment timing varies and effects differ across cohorts (Baker et al., 2022; Goodman-Bacon, 2021). The primary outcome is the natural logarithm of the market-to-book (MTB) ratio. We recorded the hypotheses, sample rules, estimator, and robustness checks in a pre-analysis plan, which was committed to the project's version-control history before the estimation code and is included in the replication package, and we label every analysis added afterwards as exploratory.</w:t>
+        <w:t>We study Indonesia, Malaysia, the Philippines, Singapore, and Thailand. The London Stock Exchange Group (LSEG), whose scores were earlier distributed as Refinitiv ESG and ASSET4, extended coverage in market-specific waves: 577 of the 675 non-financial firms that entered coverage between 2015 and 2024 did so in 2020 to 2023. Most scored firms are Malaysian or Thai, and most listed firms remained unscored. We treat the first fiscal year with an LSEG ESG score as a staggered event and estimate group-time average treatment effects on the treated (ATT) with the estimator of Callaway and Sant'Anna (2021). This estimator avoids the biases of two-way fixed effects regressions under staggered timing and heterogeneous effects (Baker et al., 2022; Goodman-Bacon, 2021). The primary outcome is the log market-to-book (MTB) ratio. A pre-analysis plan, committed to version control before the estimation code and included in the replication package, records the hypotheses, sample rules, estimator, and robustness checks, and we label every later analysis as exploratory.</w:t>
       </w:r>
     </w:p>
     <w:p>
@@ -148,17 +148,7 @@
       </w:pPr>
       <w:r>
         <w:rPr/>
-        <w:t>The evidence has three parts. First, scored firms grew faster than comparable never-scored firms in the years before their first scored year. From event year −5 to the base year, a span of four years, their market capitalization grew 14.1 percent more and their MTB ratio 10.0 percent more than those of comparable firms. Second, MTB ratios did not rise after coverage began. Under conditional parallel trends from the base year, the average effect over the first four years is 0.002 (standard error 0.024), with a 95% confidence interval from −0.046 to 0.048. Third, when we date coverage one year later, which allows for the time it takes to publish a score built from a firm's annual disclosures, the effect becomes −0.068 (</w:t>
-      </w:r>
-      <w:r>
-        <w:rPr>
-          <w:i/>
-        </w:rPr>
-        <w:t>p</w:t>
-      </w:r>
-      <w:r>
-        <w:rPr/>
-        <w:t xml:space="preserve"> = 0.004). This decline is measured from the first scored year, the year of peak valuation, so it cannot separate a reversal of the run-up from an effect of coverage. Under parallel trends, valuations therefore peak around the first scored year and do not rise afterwards. A static two-way fixed effects regression on the same data attributes a 6.6 percent MTB increase to coverage, which illustrates how a pooled design turns selection into an apparent rating effect.</w:t>
+        <w:t>The evidence has three parts. First, over the four years from event year −5 to the base year, the market capitalization of scored firms grew 14.1 percent more and their MTB ratio 10.0 percent more than those of comparable never-scored firms. Second, under conditional parallel trends from the base year, the average effect on MTB over the first four years is 0.002, with a 95% confidence interval from −0.046 to 0.048. Third, when we date coverage one year later to allow for the time needed to publish a score, the effect becomes −0.068 (p = 0.004); because this decline is measured from the year of peak valuation, it cannot separate a reversal of the run-up from an effect of coverage. A static two-way fixed effects regression on the same data attributes a 6.6 percent MTB increase to coverage, showing how pooling turns selection into an apparent rating effect.</w:t>
       </w:r>
     </w:p>
     <w:p>
@@ -169,7 +159,7 @@
       </w:pPr>
       <w:r>
         <w:rPr/>
-        <w:t>We do not claim that coverage has no effect on valuation. The pre-coverage run-up casts doubt on the parallel-trends assumption that the post-coverage estimates need. When we allow post-coverage departures from parallel trends of up to a quarter of the largest year-to-year change observed before coverage, in the spirit of Rambachan and Roth (2023), the interval for the MTB effect widens to −0.071 to 0.073. Because the upper limit of the unadjusted interval lies just below a 5 percent increase, any such departure admits positive effects of that size. What the data support is an ordering of events: the first score follows a period of relative growth and coincides with a valuation peak, and under parallel trends no specification detects a valuation gain after it.</w:t>
+        <w:t>We do not claim that coverage has no effect on valuation. The run-up casts doubt on the parallel-trends assumption behind the post-coverage estimates. When we allow post-coverage departures from parallel trends of up to a quarter of the largest pre-coverage year-to-year change, following Rambachan and Roth (2023), the MTB interval widens to −0.071 to 0.073. Because the upper limit of the unadjusted interval lies just below a 5 percent increase, any such departure admits positive effects of that size. The data support an ordering of events: the first score follows relative growth and coincides with a valuation peak, and under parallel trends no specification detects a later gain.</w:t>
       </w:r>
     </w:p>
     <w:p>
@@ -180,7 +170,7 @@
       </w:pPr>
       <w:r>
         <w:rPr/>
-        <w:t>The paper contributes to research on the financial consequences of ESG ratings. Ratings from different providers disagree widely (Berg, Kölbel, et al., 2022), disagreement rises with disclosure (Christensen et al., 2022), and it carries a return premium and affects demand (Avramov et al., 2022; Gibson Brandon et al., 2021). The historical scores of the provider we study have been rewritten on a large scale (Berg et al., 2020), and its recent scores remain subject to revision (Sahin et al., 2023). We add emerging-market evidence on the extensive margin of coverage, measured against a large group of never-scored firms, and show that selection into coverage matters for any comparison of rated and unrated firms. The results also illustrate how pre-trends in staggered designs can carry economic content (Roth, 2022).</w:t>
+        <w:t>We contribute to research on the financial consequences of ESG ratings with emerging-market evidence on the extensive margin of coverage, and we show that selection into coverage matters for any comparison of rated and unrated firms. The results also illustrate how pre-trends in staggered designs can carry economic content (Roth, 2022).</w:t>
       </w:r>
     </w:p>
     <w:p>
@@ -191,7 +181,7 @@
       </w:pPr>
       <w:r>
         <w:rPr/>
-        <w:t>The rest of the paper proceeds as follows. Section 2 reviews related work and states the hypotheses. Section 3 describes the institutional setting and the data. Section 4 presents the methods. Section 5 reports the results. Section 6 discusses them, Section 7 states the limitations, and Section 8 concludes.</w:t>
+        <w:t>Section 2 reviews the literature and states the hypotheses, Section 3 describes the setting and data, and Sections 4 and 5 present the methods and results. Section 6 discusses the results, Section 7 states the limitations, and Section 8 concludes.</w:t>
       </w:r>
     </w:p>
     <w:p>
@@ -229,7 +219,21 @@
       </w:pPr>
       <w:r>
         <w:rPr/>
-        <w:t>Two mechanisms link the first ESG score to a firm's valuation. The first is investor recognition. In Merton (1987), investors hold only the stocks they know about, and a stock followed by fewer investors trades at a lower price because its idiosyncratic risk is borne by a small group. A first score makes the firm visible to investors who screen on ESG data. The second mechanism is preference: when some investors derive utility from holding sustainable assets, the prices of assets classified as sustainable rise and their expected returns fall (Pástor et al., 2021; Pedersen et al., 2021). Both channels predict a positive effect of coverage on valuation, and the second predicts a larger effect for firms that receive a high initial score.</w:t>
+        <w:t>Two mechanisms link a first ESG score to a firm's valuation. Under investor recognition, a stock known to few investors trades at a discount because a small group bears its idiosyncratic risk (Merton, 1987), and a first score makes the firm visible to ESG-screening investors. Under investor preference, assets classified as sustainable command higher prices and lower expected returns (Pástor et al., 2021; Pedersen et al., 2021). Both predict that coverage raises valuation, the second more so for firms with a high initial score. Both also require investors to act on this particular score, yet U.S. ESG funds respond more to one provider's ratings than to those of others (Berg, Heeb, et al., 2022), and providers disagree (Berg, Kölbel, et al., 2022) in ways that are priced (Avramov et al., 2022; Gibson Brandon et al., 2021).</w:t>
+      </w:r>
+    </w:p>
+    <w:p>
+      <w:pPr>
+        <w:keepNext/>
+        <w:spacing w:line="360" w:lineRule="auto" w:after="120" w:before="120"/>
+      </w:pPr>
+      <w:r>
+        <w:rPr>
+          <w:b/>
+          <w:i/>
+          <w:sz w:val="24"/>
+        </w:rPr>
+        <w:t>2.2. Coverage as a selection event</w:t>
       </w:r>
     </w:p>
     <w:p>
@@ -240,21 +244,7 @@
       </w:pPr>
       <w:r>
         <w:rPr/>
-        <w:t>The strength of either channel depends on whether investors act on the particular score. Fund investors react to fund-level sustainability ratings (Hartzmark &amp; Sussman, 2019), and the holdings of ESG funds in the United States respond to the ratings of one provider more than to those of others (Berg, Heeb, et al., 2022). Scores from different providers disagree (Berg, Kölbel, et al., 2022), and disagreement is priced (Avramov et al., 2022; Gibson Brandon et al., 2021). A score from one provider may therefore be a weak signal for investors who follow another provider, which would weaken both mechanisms.</w:t>
-      </w:r>
-    </w:p>
-    <w:p>
-      <w:pPr>
-        <w:keepNext/>
-        <w:spacing w:line="360" w:lineRule="auto" w:after="120" w:before="120"/>
-      </w:pPr>
-      <w:r>
-        <w:rPr>
-          <w:b/>
-          <w:i/>
-          <w:sz w:val="24"/>
-        </w:rPr>
-        <w:t>2.2. Coverage as a selection event</w:t>
+        <w:t>Rating coverage is not assigned at random. We expect providers to cover firms in the indices their clients track and firms that disclose enough to be scored, although our data do not include the provider's coverage rules. Mandatory sustainability reporting increases the information available about listed firms (Krueger et al., 2024), and larger firms receive higher scores from the provider we study (Dobrick et al., 2023). If providers select firms that have grown, a comparison of scored and unscored firms mixes the effect of coverage with the growth that led to it.</w:t>
       </w:r>
     </w:p>
     <w:p>
@@ -265,7 +255,21 @@
       </w:pPr>
       <w:r>
         <w:rPr/>
-        <w:t>Rating coverage is not assigned at random. We expect providers to extend coverage to firms that belong to the indices their clients track and that disclose enough information to be scored; the provider's coverage rules are not part of our data. Mandatory sustainability reporting raises the amount of information available about listed firms (Krueger et al., 2024), which can make scoring feasible. The size of a firm also affects the score it receives: larger firms receive higher scores from the provider we study (Dobrick et al., 2023). If providers select firms that have grown, a comparison of the valuations of scored and unscored firms mixes the effect of coverage with the growth that led to it.</w:t>
+        <w:t>Sell-side coverage offers an analogy: losing analyst coverage lowers prices (Kelly &amp; Ljungqvist, 2012), and the first coverage of a neglected stock raises its price only when the coverage is favorable (Demiroglu &amp; Ryngaert, 2010). Any valuation effect of a first ESG score should then concentrate in firms with favorable scores and in firms that were less visible before coverage.</w:t>
+      </w:r>
+    </w:p>
+    <w:p>
+      <w:pPr>
+        <w:keepNext/>
+        <w:spacing w:line="360" w:lineRule="auto" w:after="120" w:before="120"/>
+      </w:pPr>
+      <w:r>
+        <w:rPr>
+          <w:b/>
+          <w:i/>
+          <w:sz w:val="24"/>
+        </w:rPr>
+        <w:t>2.3. Hypotheses</w:t>
       </w:r>
     </w:p>
     <w:p>
@@ -276,7 +280,7 @@
       </w:pPr>
       <w:r>
         <w:rPr/>
-        <w:t>The setting matters for the size of these effects. Mandatory ESG disclosure raises stock liquidity most for firms with weaker information environments (Krueger et al., 2024), so a first ESG score could matter more in emerging markets than in the United States. But if providers score only firms that are already large and closely followed, the score adds least for the firms that receive it.</w:t>
+        <w:t>The pre-analysis plan states three hypotheses, each tested two-sided.</w:t>
       </w:r>
     </w:p>
     <w:p>
@@ -287,21 +291,7 @@
       </w:pPr>
       <w:r>
         <w:rPr/>
-        <w:t>The analogy with sell-side coverage is instructive. Losing analyst coverage raises information asymmetry and lowers prices (Kelly &amp; Ljungqvist, 2012), while the first coverage of a neglected stock raises its price only when the coverage is favorable (Demiroglu &amp; Ryngaert, 2010). An ESG score differs from an analyst report because it rarely contains news about cash flows, and because it arrives with a delay after the firm's own disclosures. The analogy suggests that any valuation effect of a first ESG score should be concentrated in firms that receive favorable scores and in firms that were less visible before coverage.</w:t>
-      </w:r>
-    </w:p>
-    <w:p>
-      <w:pPr>
-        <w:keepNext/>
-        <w:spacing w:line="360" w:lineRule="auto" w:after="120" w:before="120"/>
-      </w:pPr>
-      <w:r>
-        <w:rPr>
-          <w:b/>
-          <w:i/>
-          <w:sz w:val="24"/>
-        </w:rPr>
-        <w:t>2.3. Hypotheses</w:t>
+        <w:t>H1 (primary): The initiation of LSEG ESG coverage changes the log MTB ratio of scored firms relative to comparable never-scored firms. The recognition and preference channels predict a positive effect; the selection view predicts no effect after coverage and relative growth before it, as for firms added to an index after a period of growth (Chen et al., 2004).</w:t>
       </w:r>
     </w:p>
     <w:p>
@@ -312,7 +302,7 @@
       </w:pPr>
       <w:r>
         <w:rPr/>
-        <w:t>The pre-analysis plan states three hypotheses, tested two-sided.</w:t>
+        <w:t>H2 (secondary): Coverage changes log market capitalization, book leverage, and log total assets.</w:t>
       </w:r>
     </w:p>
     <w:p>
@@ -323,7 +313,34 @@
       </w:pPr>
       <w:r>
         <w:rPr/>
-        <w:t>H1 (primary): The initiation of LSEG ESG coverage changes the log MTB ratio of scored firms relative to comparable never-scored firms. The recognition and preference channels predict a positive effect (Merton, 1987; Pástor et al., 2021; Pedersen et al., 2021). The selection view predicts no effect after coverage, together with relative growth before coverage, as for firms that are added to an index after a period of growth (Chen et al., 2004).</w:t>
+        <w:t>H3 (heterogeneity): The effect on log MTB differs between firms with initial scores above and below their cohort median, as the preference channel and the evidence on favorable first coverage suggest.</w:t>
+      </w:r>
+    </w:p>
+    <w:p>
+      <w:pPr>
+        <w:keepNext/>
+        <w:spacing w:line="360" w:lineRule="auto" w:after="120" w:before="240"/>
+      </w:pPr>
+      <w:r>
+        <w:rPr>
+          <w:b/>
+          <w:sz w:val="24"/>
+        </w:rPr>
+        <w:t>3. Institutional Setting and Data</w:t>
+      </w:r>
+    </w:p>
+    <w:p>
+      <w:pPr>
+        <w:keepNext/>
+        <w:spacing w:line="360" w:lineRule="auto" w:after="120" w:before="120"/>
+      </w:pPr>
+      <w:r>
+        <w:rPr>
+          <w:b/>
+          <w:i/>
+          <w:sz w:val="24"/>
+        </w:rPr>
+        <w:t>3.1. ESG rating coverage in the five markets</w:t>
       </w:r>
     </w:p>
     <w:p>
@@ -334,7 +351,7 @@
       </w:pPr>
       <w:r>
         <w:rPr/>
-        <w:t>H2 (secondary): Coverage changes log market capitalization, book leverage, and log total assets.</w:t>
+        <w:t>Disclosure rules differ across the five markets. Singapore, the most developed market, requires every listed issuer to publish a comply-or-explain sustainability report for financial years ending on or after 31 December 2017 (Singapore Exchange, 2016). In Malaysia, FTSE Russell, another part of LSEG, scored only the FTSE Bursa Malaysia EMAS constituents, about 30 percent of listed companies, until Bursa Malaysia and LSEG agreed in November 2022 to score all Main and ACE Market companies (Bernama, 2022). We do not document the timing of reporting rules in the other four markets. The LSEG ESG score we study, formerly Refinitiv ESG, is a separate product, so some newly covered firms may already have had FTSE Russell or other scores that our data do not record.</w:t>
       </w:r>
     </w:p>
     <w:p>
@@ -345,20 +362,7 @@
       </w:pPr>
       <w:r>
         <w:rPr/>
-        <w:t>H3 (heterogeneity): The effect on log MTB differs between firms that receive an initial score above and below the median of their cohort, as the preference channel (Pedersen et al., 2021) and the evidence on favorable first coverage (Demiroglu &amp; Ryngaert, 2010) suggest.</w:t>
-      </w:r>
-    </w:p>
-    <w:p>
-      <w:pPr>
-        <w:keepNext/>
-        <w:spacing w:line="360" w:lineRule="auto" w:after="120" w:before="240"/>
-      </w:pPr>
-      <w:r>
-        <w:rPr>
-          <w:b/>
-          <w:sz w:val="24"/>
-        </w:rPr>
-        <w:t>3. Institutional Setting and Data</w:t>
+        <w:t>Table S2 and Fig. S1 of the Supplemental Appendix show that coverage arrived in waves: 108 first scores in Thailand and Singapore in 2019 and 2020, and 289 in Malaysia in 2021 and 2022. Of the 675 scored firms, 404, or 59.9 percent, are Malaysian, and Malaysian and Thai firms together make up 84.3 percent. The pooled estimates are therefore weighted toward Malaysia and Thailand, and the Supplemental Appendix reports market-level estimates. The data do not record why coverage expanded when it did.</w:t>
       </w:r>
     </w:p>
     <w:p>
@@ -372,7 +376,7 @@
           <w:i/>
           <w:sz w:val="24"/>
         </w:rPr>
-        <w:t>3.1. ESG rating coverage in the five markets</w:t>
+        <w:t>3.2. Sample and coverage timing</w:t>
       </w:r>
     </w:p>
     <w:p>
@@ -383,7 +387,7 @@
       </w:pPr>
       <w:r>
         <w:rPr/>
-        <w:t>The five markets differ in size, development, and disclosure rules. Singapore is the most developed of the five, and its exchange requires every listed issuer to publish an annual sustainability report on a comply-or-explain basis for financial years ending on or after 31 December 2017 (Singapore Exchange, 2016). In Malaysia, ESG scores of FTSE Russell, another part of LSEG, covered the constituents of the FTSE Bursa Malaysia EMAS index, about 30 percent of listed companies, until Bursa Malaysia and LSEG agreed in November 2022 to extend these scores to all companies on the Main and ACE Markets (Bernama, 2022). We do not document the timing of sustainability-reporting rules in Indonesia, Malaysia, the Philippines, and Thailand. This paper studies the LSEG ESG score, formerly Refinitiv ESG, which is a different product from the FTSE Russell scores. Some firms that enter LSEG coverage may therefore already have been scored by FTSE Russell or by other providers; our data do not record those scores.</w:t>
+        <w:t>The data cover all 3,709 firms listed in the five markets from 2014 to 2024, or 40,799 firm-years, and combine the annual LSEG ESG score (LSEG, 2025) with accounting and market data from Compustat Global (S&amp;P Global Market Intelligence, 2025). We use the ESG score, not the controversy-adjusted combined score. The files do not record the download date, so the vintage of recent, revisable scores is unknown. This data set also underlies a companion study with a different research question (details withheld for anonymous review). That study uses only firm-years with ESG and governance data and asks how reporting standards and board structure relate to the gap between ESG scores and controversy scores. The present paper uses the full listed universe, treats the first appearance of an ESG score as an event, and studies market valuation and financing. No outcome or treatment variable, estimate, table, or figure is shared between the two papers.</w:t>
       </w:r>
     </w:p>
     <w:p>
@@ -394,21 +398,7 @@
       </w:pPr>
       <w:r>
         <w:rPr/>
-        <w:t>Coverage entered the five markets in waves (Table IA2 and Fig. IA1 of the Internet Appendix). Thailand and Singapore account for 108 first scores in 2019 and 2020, and Malaysia for 289 first scores in 2021 and 2022. Over the full period, Malaysian firms account for 404 of the 675 scored firms (59.9 percent), and Malaysian and Thai firms together for 84.3 percent; Indonesia contributes 42, Singapore 50, and the Philippines 14 scored firms. The pooled estimates are therefore weighted toward Malaysia and Thailand, and we report market-level estimates in the Internet Appendix. The data do not record why the provider expanded coverage in a given market and year; changes in disclosure rules (Singapore Exchange, 2016), which raise the information available about listed firms (Krueger et al., 2024), and changes in index membership are possible reasons that we cannot observe.</w:t>
-      </w:r>
-    </w:p>
-    <w:p>
-      <w:pPr>
-        <w:keepNext/>
-        <w:spacing w:line="360" w:lineRule="auto" w:after="120" w:before="120"/>
-      </w:pPr>
-      <w:r>
-        <w:rPr>
-          <w:b/>
-          <w:i/>
-          <w:sz w:val="24"/>
-        </w:rPr>
-        <w:t>3.2. Sample and coverage timing</w:t>
+        <w:t>Dropping financial firms leaves 3,423 firms. A firm's treatment year, g, is its first fiscal year with an LSEG ESG score. Only 17 of the 675 scored firms have a later year without a score, so we treat coverage as permanent, the staggered-adoption setting of Callaway and Sant'Anna (2021). Excluding the 135 firms scored in 2014, which have no pre-coverage year, leaves a full firm-year grid of 3,288 firms and 36,168 firm-years: 675 firms first scored between 2015 and 2024 and 2,613 never-scored firms. A firm-year enters an estimate only if its outcome is observed in both the base year and the comparison year; MTB ratios at or below zero, which reflect negative book equity, are set to missing. Table S4 of the Supplemental Appendix reports firm-years by outcome, and Table S6 scored firms by event year. Of the 274 scored firms with a base-year MTB ratio in cohorts observed through event year 3, 271, or 98.9 percent, still have one in event year 3; the others leave through delisting or missing data. Never-scored firms are much smaller on average, and many trade thinly. The comparison of changes adjusted for size, country, and industry does not need similar levels, but it needs enough never-scored firms of comparable size; a check in Section 4.5 drops small control firms.</w:t>
       </w:r>
     </w:p>
     <w:p>
@@ -419,7 +409,21 @@
       </w:pPr>
       <w:r>
         <w:rPr/>
-        <w:t>The data set covers all 3,709 firms listed in the five markets from 2014 to 2024 (40,799 firm-years). It combines the annual LSEG ESG score (LSEG, 2025) with accounting and market data from Compustat Global (S&amp;P Global Market Intelligence, 2025). We use the ESG score field, not the combined score that adjusts for controversies. The files do not record the date on which the scores were downloaded, so the vintage of the recent, revisable scores is not known exactly. This data set also underlies a companion study with a different research question (details withheld for anonymous review). That study uses only firm-years with ESG and governance data and asks how reporting standards and board structure relate to the gap between ESG scores and controversy scores. The present paper uses the full listed universe, treats the first appearance of an ESG score as an event, and studies market valuation and financing. No outcome or treatment variable, estimate, table, or figure is shared between the two papers.</w:t>
+        <w:t>The treatment year may precede the year in which investors first see a score. First, the score for fiscal year g draws on reports published after the year ends, so it reaches investors in year g + 1 at the earliest. Second, the provider has rewritten historical scores on a large scale (Berg et al., 2020), and scores for the five most recent fiscal years can change after publication (Sahin et al., 2023); if historical years were filled in when a firm entered coverage, the gap exceeds one year. Both features move the true publication date later, never earlier, so they cannot create the pre-coverage growth we report but can place pre-publication years in our post-coverage window. Section 5.4 therefore also dates coverage one year later.</w:t>
+      </w:r>
+    </w:p>
+    <w:p>
+      <w:pPr>
+        <w:keepNext/>
+        <w:spacing w:line="360" w:lineRule="auto" w:after="120" w:before="120"/>
+      </w:pPr>
+      <w:r>
+        <w:rPr>
+          <w:b/>
+          <w:i/>
+          <w:sz w:val="24"/>
+        </w:rPr>
+        <w:t>3.3. Outcomes</w:t>
       </w:r>
     </w:p>
     <w:p>
@@ -430,7 +434,34 @@
       </w:pPr>
       <w:r>
         <w:rPr/>
-        <w:t>We drop financial firms, which leaves 3,423 firms. A firm's treatment year is the first fiscal year with a non-missing LSEG ESG score. Once a firm is scored, it almost always remains scored (17 of the 675 scored firms have a later year without a score), so we treat coverage as permanent, which is the staggered-adoption setting of Callaway and Sant'Anna (2021). We drop the 135 firms that were already scored in 2014 because they have no pre-coverage year. The estimation sample has 3,288 firms and 36,168 firm-years: 675 firms first scored between 2015 and 2024 and 2,613 firms never scored. This is the full firm-year grid; a firm-year enters an estimate only when the outcome is observed in both the base year and the comparison year, and MTB ratios at or below zero (negative book equity) are set to missing. Table IA4 of the Internet Appendix reports the number of firm-years available for each outcome, and Table IA6 the number of scored firms by event year. Of the 274 scored firms in cohorts observed through event year 3 that have an MTB ratio in the base year, 271 (98.9 percent) also have one in event year 3; the others leave the sample through delisting or missing data. Never-scored firms are much smaller on average, and many trade thinly. Because the comparison rests on changes adjusted for size, country, and industry, it does not require similar levels, but it does require enough never-scored firms of comparable size, which the check that drops small control firms (Section 4.5) addresses.</w:t>
+        <w:t>The primary outcome is the natural logarithm of the MTB ratio, the market value of equity divided by its book value. The secondary outcomes are log market capitalization, log total assets, and book leverage, defined as total debt divided by total assets. Market capitalization moves with prices and share counts, which the data cannot separate because they contain neither stock returns nor shares outstanding, so we use MTB for valuation and market capitalization for size. Amounts are in U.S. dollars as recorded in the data set. We winsorize MTB, market capitalization, leverage, and total assets at the 1st and 99th percentiles of the pooled sample before taking logarithms.</w:t>
+      </w:r>
+    </w:p>
+    <w:p>
+      <w:pPr>
+        <w:keepNext/>
+        <w:spacing w:line="360" w:lineRule="auto" w:after="120" w:before="240"/>
+      </w:pPr>
+      <w:r>
+        <w:rPr>
+          <w:b/>
+          <w:sz w:val="24"/>
+        </w:rPr>
+        <w:t>4. Methods</w:t>
+      </w:r>
+    </w:p>
+    <w:p>
+      <w:pPr>
+        <w:keepNext/>
+        <w:spacing w:line="360" w:lineRule="auto" w:after="120" w:before="120"/>
+      </w:pPr>
+      <w:r>
+        <w:rPr>
+          <w:b/>
+          <w:i/>
+          <w:sz w:val="24"/>
+        </w:rPr>
+        <w:t>4.1. Target parameter and identification</w:t>
       </w:r>
     </w:p>
     <w:p>
@@ -441,106 +472,7 @@
       </w:pPr>
       <w:r>
         <w:rPr/>
-        <w:t xml:space="preserve">The treatment year need not be the year in which investors could first see a score, for two reasons. First, the score for fiscal year </w:t>
-      </w:r>
-      <w:r>
-        <w:rPr>
-          <w:i/>
-        </w:rPr>
-        <w:t>g</w:t>
-      </w:r>
-      <w:r>
-        <w:rPr/>
-        <w:t xml:space="preserve"> is built from the firm's reports for that year, which are published after the year ends; a score dated </w:t>
-      </w:r>
-      <w:r>
-        <w:rPr>
-          <w:i/>
-        </w:rPr>
-        <w:t>g</w:t>
-      </w:r>
-      <w:r>
-        <w:rPr/>
-        <w:t xml:space="preserve"> reaches investors in year </w:t>
-      </w:r>
-      <w:r>
-        <w:rPr>
-          <w:i/>
-        </w:rPr>
-        <w:t>g</w:t>
-      </w:r>
-      <w:r>
-        <w:rPr/>
-        <w:t xml:space="preserve"> + 1 at the earliest. Second, the provider has rewritten historical scores on a large scale (Berg et al., 2020), and scores for the five most recent fiscal years can change after publication (Sahin et al., 2023). If historical years were filled in when a firm entered coverage, the treatment year precedes the first published score by more than one year. Both features move the true publication date later, never earlier, so they cannot create the pre-coverage growth we report, but they can place pre-publication years in our post-coverage window. We address this with estimates that date coverage one year later (Section 5.4).</w:t>
-      </w:r>
-    </w:p>
-    <w:p>
-      <w:pPr>
-        <w:keepNext/>
-        <w:spacing w:line="360" w:lineRule="auto" w:after="120" w:before="120"/>
-      </w:pPr>
-      <w:r>
-        <w:rPr>
-          <w:b/>
-          <w:i/>
-          <w:sz w:val="24"/>
-        </w:rPr>
-        <w:t>3.3. Outcomes</w:t>
-      </w:r>
-    </w:p>
-    <w:p>
-      <w:pPr>
-        <w:spacing w:line="360" w:lineRule="auto" w:after="120" w:before="0"/>
-        <w:ind w:firstLine="432"/>
-        <w:jc w:val="both"/>
-      </w:pPr>
-      <w:r>
-        <w:rPr/>
-        <w:t>The primary outcome is the natural logarithm of the MTB ratio, the market value of equity divided by its book value. Three secondary outcomes describe size and financing: the logarithm of market capitalization, book leverage (total debt divided by total assets), and the logarithm of total assets. Market capitalization reflects both price changes and changes in the number of shares, and the data contain neither stock returns nor shares outstanding, so we use MTB for statements about valuation and market capitalization for statements about size. Monetary amounts are in U.S. dollars as recorded in the data set. We winsorize MTB, market capitalization, leverage, and total assets at the 1st and 99th percentiles of the pooled sample before taking logarithms.</w:t>
-      </w:r>
-    </w:p>
-    <w:p>
-      <w:pPr>
-        <w:keepNext/>
-        <w:spacing w:line="360" w:lineRule="auto" w:after="120" w:before="240"/>
-      </w:pPr>
-      <w:r>
-        <w:rPr>
-          <w:b/>
-          <w:sz w:val="24"/>
-        </w:rPr>
-        <w:t>4. Methods</w:t>
-      </w:r>
-    </w:p>
-    <w:p>
-      <w:pPr>
-        <w:keepNext/>
-        <w:spacing w:line="360" w:lineRule="auto" w:after="120" w:before="120"/>
-      </w:pPr>
-      <w:r>
-        <w:rPr>
-          <w:b/>
-          <w:i/>
-          <w:sz w:val="24"/>
-        </w:rPr>
-        <w:t>4.1. Target parameter and identification</w:t>
-      </w:r>
-    </w:p>
-    <w:p>
-      <w:pPr>
-        <w:spacing w:line="360" w:lineRule="auto" w:after="120" w:before="0"/>
-        <w:ind w:firstLine="432"/>
-        <w:jc w:val="both"/>
-      </w:pPr>
-      <w:r>
-        <w:rPr/>
-        <w:t xml:space="preserve">We follow the notation of Callaway and Sant'Anna (2021). Let </w:t>
-      </w:r>
-      <w:r>
-        <w:rPr>
-          <w:i/>
-        </w:rPr>
-        <w:t>G</w:t>
+        <w:t>In the notation of Callaway and Sant'Anna (2021), let G</w:t>
       </w:r>
       <w:r>
         <w:rPr>
@@ -550,23 +482,7 @@
       </w:r>
       <w:r>
         <w:rPr/>
-        <w:t xml:space="preserve"> denote the first year in which firm </w:t>
-      </w:r>
-      <w:r>
-        <w:rPr>
-          <w:i/>
-        </w:rPr>
-        <w:t>i</w:t>
-      </w:r>
-      <w:r>
-        <w:rPr/>
-        <w:t xml:space="preserve"> has an LSEG ESG score, with </w:t>
-      </w:r>
-      <w:r>
-        <w:rPr>
-          <w:i/>
-        </w:rPr>
-        <w:t>G</w:t>
+        <w:t xml:space="preserve"> be the first year in which firm i has an LSEG ESG score, with G</w:t>
       </w:r>
       <w:r>
         <w:rPr>
@@ -576,13 +492,7 @@
       </w:r>
       <w:r>
         <w:rPr/>
-        <w:t xml:space="preserve"> = ∞ for firms never scored, and let </w:t>
-      </w:r>
-      <w:r>
-        <w:rPr>
-          <w:i/>
-        </w:rPr>
-        <w:t>Y</w:t>
+        <w:t xml:space="preserve"> = ∞ if it is never scored, and let Y</w:t>
       </w:r>
       <w:r>
         <w:rPr>
@@ -592,47 +502,7 @@
       </w:r>
       <w:r>
         <w:rPr/>
-        <w:t>(</w:t>
-      </w:r>
-      <w:r>
-        <w:rPr>
-          <w:i/>
-        </w:rPr>
-        <w:t>g</w:t>
-      </w:r>
-      <w:r>
-        <w:rPr/>
-        <w:t xml:space="preserve">) denote the potential outcome of firm </w:t>
-      </w:r>
-      <w:r>
-        <w:rPr>
-          <w:i/>
-        </w:rPr>
-        <w:t>i</w:t>
-      </w:r>
-      <w:r>
-        <w:rPr/>
-        <w:t xml:space="preserve"> in year </w:t>
-      </w:r>
-      <w:r>
-        <w:rPr>
-          <w:i/>
-        </w:rPr>
-        <w:t>t</w:t>
-      </w:r>
-      <w:r>
-        <w:rPr/>
-        <w:t xml:space="preserve"> if it were first scored in year </w:t>
-      </w:r>
-      <w:r>
-        <w:rPr>
-          <w:i/>
-        </w:rPr>
-        <w:t>g</w:t>
-      </w:r>
-      <w:r>
-        <w:rPr/>
-        <w:t>. The group-time average treatment effect on the treated is</w:t>
+        <w:t>(g) be the potential outcome of firm i in year t if it were first scored in year g. The group-time average treatment effect on the treated is</w:t>
       </w:r>
     </w:p>
     <w:p>
@@ -828,37 +698,7 @@
       </w:pPr>
       <w:r>
         <w:rPr/>
-        <w:t xml:space="preserve">the average effect in year </w:t>
-      </w:r>
-      <w:r>
-        <w:rPr>
-          <w:i/>
-        </w:rPr>
-        <w:t>t</w:t>
-      </w:r>
-      <w:r>
-        <w:rPr/>
-        <w:t xml:space="preserve"> of first coverage in year </w:t>
-      </w:r>
-      <w:r>
-        <w:rPr>
-          <w:i/>
-        </w:rPr>
-        <w:t>g</w:t>
-      </w:r>
-      <w:r>
-        <w:rPr/>
-        <w:t xml:space="preserve"> among firms first scored in year </w:t>
-      </w:r>
-      <w:r>
-        <w:rPr>
-          <w:i/>
-        </w:rPr>
-        <w:t>g</w:t>
-      </w:r>
-      <w:r>
-        <w:rPr/>
-        <w:t xml:space="preserve"> (Callaway &amp; Sant'Anna, 2021). We identify it under conditional parallel trends relative to the year before coverage:</w:t>
+        <w:t>the average effect in year t for firms first scored in year g. We identify it under conditional parallel trends relative to the year before coverage:</w:t>
       </w:r>
     </w:p>
     <w:p>
@@ -1198,13 +1038,7 @@
       </w:pPr>
       <w:r>
         <w:rPr/>
-        <w:t xml:space="preserve">where </w:t>
-      </w:r>
-      <w:r>
-        <w:rPr>
-          <w:i/>
-        </w:rPr>
-        <w:t>X</w:t>
+        <w:t>where X</w:t>
       </w:r>
       <w:r>
         <w:rPr>
@@ -1214,37 +1048,7 @@
       </w:r>
       <w:r>
         <w:rPr/>
-        <w:t xml:space="preserve"> contains country indicators, industry indicators, and log total assets and its square, all measured in year </w:t>
-      </w:r>
-      <w:r>
-        <w:rPr>
-          <w:i/>
-        </w:rPr>
-        <w:t>g</w:t>
-      </w:r>
-      <w:r>
-        <w:rPr/>
-        <w:t xml:space="preserve"> − 1. Assumption (2) states that, given the covariates, scored firms' outcomes would have changed from year </w:t>
-      </w:r>
-      <w:r>
-        <w:rPr>
-          <w:i/>
-        </w:rPr>
-        <w:t>g</w:t>
-      </w:r>
-      <w:r>
-        <w:rPr/>
-        <w:t xml:space="preserve"> − 1 to year </w:t>
-      </w:r>
-      <w:r>
-        <w:rPr>
-          <w:i/>
-        </w:rPr>
-        <w:t>t</w:t>
-      </w:r>
-      <w:r>
-        <w:rPr/>
-        <w:t xml:space="preserve"> as those of never-scored firms did; it concerns changes, so the size differences in Table 1 do not violate it by themselves. It is violated when scored firms were on a different path before coverage, as would happen if coverage followed a period of growth of the kind that precedes index additions (Chen et al., 2004). We test this implication with the pre-coverage estimates, and we do not rely on the test alone, because pre-trend tests can have low power and conditioning on them can distort inference (Roth, 2022).</w:t>
+        <w:t xml:space="preserve"> contains country and industry indicators and log total assets and its square, measured in year g − 1. Because assumption (2) concerns changes in outcomes, the size differences in Table 1 do not violate it by themselves, but pre-coverage growth of the kind that precedes index additions would (Chen et al., 2004). We test this implication with the pre-coverage estimates but do not rely on the test alone.</w:t>
       </w:r>
     </w:p>
     <w:p>
@@ -1269,27 +1073,7 @@
       </w:pPr>
       <w:r>
         <w:rPr/>
-        <w:t xml:space="preserve">For each cohort </w:t>
-      </w:r>
-      <w:r>
-        <w:rPr>
-          <w:i/>
-        </w:rPr>
-        <w:t>g</w:t>
-      </w:r>
-      <w:r>
-        <w:rPr/>
-        <w:t xml:space="preserve"> and each year </w:t>
-      </w:r>
-      <w:r>
-        <w:rPr>
-          <w:i/>
-        </w:rPr>
-        <w:t>t</w:t>
-      </w:r>
-      <w:r>
-        <w:rPr/>
-        <w:t>, we form the long difference ΔY</w:t>
+        <w:t>For each cohort g and year t, we regress the long difference ΔY</w:t>
       </w:r>
       <w:r>
         <w:rPr>
@@ -1319,7 +1103,17 @@
       </w:r>
       <w:r>
         <w:rPr/>
-        <w:t xml:space="preserve"> and estimate an outcome regression among never-scored firms (Sant'Anna &amp; Zhao, 2020):</w:t>
+        <w:t xml:space="preserve"> on X</w:t>
+      </w:r>
+      <w:r>
+        <w:rPr>
+          <w:vertAlign w:val="subscript"/>
+        </w:rPr>
+        <w:t>i</w:t>
+      </w:r>
+      <w:r>
+        <w:rPr/>
+        <w:t xml:space="preserve"> among never-scored firms (Sant'Anna &amp; Zhao, 2020):</w:t>
       </w:r>
     </w:p>
     <w:p>
@@ -1477,7 +1271,27 @@
       </w:pPr>
       <w:r>
         <w:rPr/>
-        <w:t>This is the outcome-regression version of the group-time estimator of Callaway and Sant'Anna (2021); the doubly robust version of Sant'Anna and Zhao (2020) adds a propensity-score model, which we do not use because scored and never-scored firms overlap poorly in size: 24.6 percent of scored firms are larger in the base year than the 95th percentile of never-scored firms in the same year. Poor overlap also means that the outcome regression extrapolates for the largest scored firms, and the robustness check R4 trims control firms only from below. The fitted values from Eq. (3) give the counterfactual change for each scored firm, and the estimated group-time effect is</w:t>
+        <w:t>where β</w:t>
+      </w:r>
+      <w:r>
+        <w:rPr>
+          <w:vertAlign w:val="subscript"/>
+        </w:rPr>
+        <w:t>g,t</w:t>
+      </w:r>
+      <w:r>
+        <w:rPr/>
+        <w:t xml:space="preserve"> is the cell's coefficient vector and u</w:t>
+      </w:r>
+      <w:r>
+        <w:rPr>
+          <w:vertAlign w:val="subscript"/>
+        </w:rPr>
+        <w:t>i,t</w:t>
+      </w:r>
+      <w:r>
+        <w:rPr/>
+        <w:t xml:space="preserve"> the error. We omit the propensity-score model of the doubly robust estimator because size overlap is poor: 24.6 percent of scored firms are larger in the base year than the 95th percentile of never-scored firms. For the largest scored firms the outcome regression therefore extrapolates, and check R4 trims controls only from below. The estimated group-time effect is</w:t>
       </w:r>
     </w:p>
     <w:p>
@@ -1728,13 +1542,7 @@
       </w:pPr>
       <w:r>
         <w:rPr/>
-        <w:t xml:space="preserve">where </w:t>
-      </w:r>
-      <w:r>
-        <w:rPr>
-          <w:i/>
-        </w:rPr>
-        <w:t>N</w:t>
+        <w:t>where N</w:t>
       </w:r>
       <w:r>
         <w:rPr>
@@ -1744,67 +1552,17 @@
       </w:r>
       <w:r>
         <w:rPr/>
-        <w:t xml:space="preserve"> is the number of firms first scored in year </w:t>
+        <w:t xml:space="preserve"> is the number of firms first scored in year g with data in years g − 1 and t, and β̂</w:t>
       </w:r>
       <w:r>
         <w:rPr>
-          <w:i/>
+          <w:vertAlign w:val="subscript"/>
         </w:rPr>
-        <w:t>g</w:t>
+        <w:t>g,t</w:t>
       </w:r>
       <w:r>
         <w:rPr/>
-        <w:t xml:space="preserve"> with data in years </w:t>
-      </w:r>
-      <w:r>
-        <w:rPr>
-          <w:i/>
-        </w:rPr>
-        <w:t>g</w:t>
-      </w:r>
-      <w:r>
-        <w:rPr/>
-        <w:t xml:space="preserve"> − 1 and </w:t>
-      </w:r>
-      <w:r>
-        <w:rPr>
-          <w:i/>
-        </w:rPr>
-        <w:t>t</w:t>
-      </w:r>
-      <w:r>
-        <w:rPr/>
-        <w:t xml:space="preserve">. Following the aggregation scheme of Callaway and Sant'Anna (2021), we average the group-time effects by years since coverage, </w:t>
-      </w:r>
-      <w:r>
-        <w:rPr>
-          <w:i/>
-        </w:rPr>
-        <w:t>e</w:t>
-      </w:r>
-      <w:r>
-        <w:rPr/>
-        <w:t xml:space="preserve"> = </w:t>
-      </w:r>
-      <w:r>
-        <w:rPr>
-          <w:i/>
-        </w:rPr>
-        <w:t>t</w:t>
-      </w:r>
-      <w:r>
-        <w:rPr/>
-        <w:t xml:space="preserve"> − </w:t>
-      </w:r>
-      <w:r>
-        <w:rPr>
-          <w:i/>
-        </w:rPr>
-        <w:t>g</w:t>
-      </w:r>
-      <w:r>
-        <w:rPr/>
-        <w:t>, weighting each cohort by its number of scored firms:</w:t>
+        <w:t xml:space="preserve"> is estimated from Eq. (3). We average by years since coverage, e = t − g, weighting cohorts by their number of scored firms (Callaway &amp; Sant'Anna, 2021):</w:t>
       </w:r>
     </w:p>
     <w:p>
@@ -2030,7 +1788,7 @@
       </w:pPr>
       <w:r>
         <w:rPr/>
-        <w:t>The headline estimate averages all group-time effects from the year of the first score to three years later, again weighting each cell by its number of scored firms, a variant of the simple aggregation in Callaway and Sant'Anna (2021):</w:t>
+        <w:t>where h indexes cohorts. The headline estimate averages all cells from the first scored year to three years later with the same weights:</w:t>
       </w:r>
     </w:p>
     <w:p>
@@ -2362,7 +2120,7 @@
       </w:pPr>
       <w:r>
         <w:rPr/>
-        <w:t>Cohorts first scored in 2022 or later are not observed for all four post-coverage years, so the composition of cohorts changes across event years, a problem that Callaway and Sant'Anna (2021) and Baker et al. (2022) discuss for event-study aggregations. We therefore also report estimates restricted to cohorts first scored no later than 2021, which are observed through event year three.</w:t>
+        <w:t>Cohorts first scored after 2021 are not observed for all four post-coverage years, so cohort composition changes across event years; we therefore also report estimates for the cohorts observed through event year three.</w:t>
       </w:r>
     </w:p>
     <w:p>
@@ -2373,57 +2131,7 @@
       </w:pPr>
       <w:r>
         <w:rPr/>
-        <w:t>Three design choices deserve comment. First, the baseline control group contains only firms that are never scored, one of the two comparison groups proposed by Callaway and Sant'Anna (2021). Firms scored later are likely to be growing toward the provider's universe themselves, so we add them to the controls only as a robustness check. Second, all comparisons use the year before coverage as the base year, including those for the years before coverage, so that pre-coverage and post-coverage estimates are measured against the same reference point, as the pre-trend analysis of Roth (2022) presumes. A negative pre-coverage estimate θ̂(</w:t>
-      </w:r>
-      <w:r>
-        <w:rPr>
-          <w:i/>
-        </w:rPr>
-        <w:t>e</w:t>
-      </w:r>
-      <w:r>
-        <w:rPr/>
-        <w:t xml:space="preserve">), </w:t>
-      </w:r>
-      <w:r>
-        <w:rPr>
-          <w:i/>
-        </w:rPr>
-        <w:t>e</w:t>
-      </w:r>
-      <w:r>
-        <w:rPr/>
-        <w:t xml:space="preserve"> ≤ −2, therefore means that scored firms grew faster than comparable never-scored firms from year </w:t>
-      </w:r>
-      <w:r>
-        <w:rPr>
-          <w:i/>
-        </w:rPr>
-        <w:t>g</w:t>
-      </w:r>
-      <w:r>
-        <w:rPr/>
-        <w:t xml:space="preserve"> + </w:t>
-      </w:r>
-      <w:r>
-        <w:rPr>
-          <w:i/>
-        </w:rPr>
-        <w:t>e</w:t>
-      </w:r>
-      <w:r>
-        <w:rPr/>
-        <w:t xml:space="preserve"> to year </w:t>
-      </w:r>
-      <w:r>
-        <w:rPr>
-          <w:i/>
-        </w:rPr>
-        <w:t>g</w:t>
-      </w:r>
-      <w:r>
-        <w:rPr/>
-        <w:t xml:space="preserve"> − 1. Third, the covariates are measured in the base year, at the end of any run-up. Because the provider's scores rise with firm size (Dobrick et al., 2023), size is the covariate most closely related to selection into coverage. Conditioning on size at the end of a period of growth compares scored firms with never-scored firms that reached a similar size, which can absorb part of the run-up into the covariates. We therefore report estimates without covariates and estimates that condition explicitly on growth before the base year.</w:t>
+        <w:t>Three design choices need comment. First, the baseline controls are never-scored firms; later-scored firms, which may also be growing toward the provider's universe, join them only in check R1. Second, all comparisons, including pre-coverage ones, use year g − 1 as the base year, so a negative estimate θ̂(e) for e ≤ −2 means that scored firms grew faster than comparable never-scored firms from year g + e to year g − 1. Third, the covariates are measured at the end of any run-up. Because the provider's scores rise with firm size (Dobrick et al., 2023), conditioning on base-year size matches scored firms to never-scored firms of similar size and can absorb part of the run-up, so we also report estimates without covariates and estimates that condition on pre-coverage growth.</w:t>
       </w:r>
     </w:p>
     <w:p>
@@ -2448,17 +2156,7 @@
       </w:pPr>
       <w:r>
         <w:rPr/>
-        <w:t xml:space="preserve">Inference uses a bootstrap, as recommended by Callaway and Sant'Anna (2021) for aggregated group-time effects. We resample firms with replacement, keeping each firm's time series intact, and use the same 999 draws, with a fixed seed, for every specification, so that differences between specifications have a valid joint distribution. We report the bootstrap standard error, the percentile 95% confidence interval, and a two-sided </w:t>
-      </w:r>
-      <w:r>
-        <w:rPr>
-          <w:i/>
-        </w:rPr>
-        <w:t>p</w:t>
-      </w:r>
-      <w:r>
-        <w:rPr/>
-        <w:t>-value from the normal approximation. The minimum detectable effect at 80% power and a 5% two-sided test is</w:t>
+        <w:t>Following Callaway and Sant'Anna (2021), we bootstrap the aggregated effects by resampling firms with their full time series. All specifications share the same 999 draws and fixed seed, so differences between specifications have a valid joint distribution. We report the bootstrap standard error, the percentile 95% confidence interval, and a normal-approximation two-sided p-value. The minimum detectable effect (MDE) at 80% power in a two-sided 5% test is</w:t>
       </w:r>
     </w:p>
     <w:p>
@@ -2604,37 +2302,27 @@
       </w:pPr>
       <w:r>
         <w:rPr/>
-        <w:t xml:space="preserve">We test the primary outcome at the 5% level and adjust the three secondary outcomes with the Holm method. The confidence intervals are not adjusted for multiple testing, whereas the </w:t>
+        <w:t>where z</w:t>
       </w:r>
       <w:r>
         <w:rPr>
-          <w:i/>
+          <w:vertAlign w:val="subscript"/>
         </w:rPr>
-        <w:t>p</w:t>
+        <w:t>0.975</w:t>
       </w:r>
       <w:r>
         <w:rPr/>
-        <w:t xml:space="preserve">-values of the secondary outcomes are Holm-adjusted, so an interval that excludes zero can accompany an adjusted </w:t>
+        <w:t xml:space="preserve"> and z</w:t>
       </w:r>
       <w:r>
         <w:rPr>
-          <w:i/>
+          <w:vertAlign w:val="subscript"/>
         </w:rPr>
-        <w:t>p</w:t>
+        <w:t>0.80</w:t>
       </w:r>
       <w:r>
         <w:rPr/>
-        <w:t xml:space="preserve">-value above 5%, as for total assets in Table 2. The joint test of parallel pre-trends uses the event-time estimates for </w:t>
-      </w:r>
-      <w:r>
-        <w:rPr>
-          <w:i/>
-        </w:rPr>
-        <w:t>e</w:t>
-      </w:r>
-      <w:r>
-        <w:rPr/>
-        <w:t xml:space="preserve"> = −5 to −2 and their bootstrap covariance matrix; following Roth (2022), we report it as a diagnostic and do not condition the analysis on its outcome:</w:t>
+        <w:t xml:space="preserve"> are standard normal quantiles and the hatted SE is the bootstrap standard error. We test the primary outcome at the 5% level and Holm-adjust the p-values of the three secondary outcomes but not the confidence intervals, so an interval that excludes zero can accompany an adjusted p-value above 5%, as for total assets in Table 2. The joint test of parallel pre-trends is</w:t>
       </w:r>
     </w:p>
     <w:p>
@@ -2826,51 +2514,27 @@
       </w:pPr>
       <w:r>
         <w:rPr/>
-        <w:t xml:space="preserve">Coverage arrived in market-level waves, so shocks common to a market and year can affect many scored firms at once. The country indicators in Eq. (3) absorb market-wide changes between years </w:t>
+        <w:t>where θ̂</w:t>
       </w:r>
       <w:r>
         <w:rPr>
-          <w:i/>
+          <w:vertAlign w:val="subscript"/>
         </w:rPr>
-        <w:t>g</w:t>
+        <w:t>pre</w:t>
       </w:r>
       <w:r>
         <w:rPr/>
-        <w:t xml:space="preserve"> − 1 and </w:t>
+        <w:t xml:space="preserve"> stacks the estimates for e = −5 to −2 and V̂</w:t>
       </w:r>
       <w:r>
         <w:rPr>
-          <w:i/>
+          <w:vertAlign w:val="subscript"/>
         </w:rPr>
-        <w:t>t</w:t>
+        <w:t>pre</w:t>
       </w:r>
       <w:r>
         <w:rPr/>
-        <w:t xml:space="preserve"> within each cell, and we report leave-one-market-out estimates. With five markets, a bootstrap that resamples markets would rest on too few clusters to be reliable, and we do not use one. The firm-level bootstrap treats firms as independent draws and does not account for correlation within market-level coverage waves, so the confidence intervals and pre-trend </w:t>
-      </w:r>
-      <w:r>
-        <w:rPr>
-          <w:i/>
-        </w:rPr>
-        <w:t>p</w:t>
-      </w:r>
-      <w:r>
-        <w:rPr/>
-        <w:t>-values may be too narrow. Market-level differences in disclosure rules (Krueger et al., 2024; Singapore Exchange, 2016) are one reason why common shocks within a market are plausible.</w:t>
-      </w:r>
-    </w:p>
-    <w:p>
-      <w:pPr>
-        <w:keepNext/>
-        <w:spacing w:line="360" w:lineRule="auto" w:after="120" w:before="120"/>
-      </w:pPr>
-      <w:r>
-        <w:rPr>
-          <w:b/>
-          <w:i/>
-          <w:sz w:val="24"/>
-        </w:rPr>
-        <w:t>4.4. Sensitivity to departures from parallel trends</w:t>
+        <w:t xml:space="preserve"> is their bootstrap covariance matrix. Because pre-trend tests can have low power and conditioning on them can distort inference (Roth, 2022), we report W as a diagnostic and do not condition the analysis on it.</w:t>
       </w:r>
     </w:p>
     <w:p>
@@ -2881,7 +2545,32 @@
       </w:pPr>
       <w:r>
         <w:rPr/>
-        <w:t>Because the pre-coverage estimates cast doubt on Eq. (2), and because a pre-trend test that fails to reject is weak evidence for parallel trends (Roth, 2022), we add two exploratory checks that the pre-analysis plan did not contain. The first removes a linear trend fitted to the pre-coverage event-time estimates, with the line constrained to pass through zero in the base year:</w:t>
+        <w:t>Coverage arrived in market-level waves, so a market-year shock can affect many scored firms at once. The country indicators in Eq. (3) absorb market-wide changes within each cell, and we report leave-one-market-out estimates; five markets are too few clusters for a reliable market-level bootstrap. The firm-level bootstrap does not account for correlation within market-level coverage waves, so the confidence intervals and pre-trend p-values may be too narrow.</w:t>
+      </w:r>
+    </w:p>
+    <w:p>
+      <w:pPr>
+        <w:keepNext/>
+        <w:spacing w:line="360" w:lineRule="auto" w:after="120" w:before="120"/>
+      </w:pPr>
+      <w:r>
+        <w:rPr>
+          <w:b/>
+          <w:i/>
+          <w:sz w:val="24"/>
+        </w:rPr>
+        <w:t>4.4. Sensitivity to departures from parallel trends</w:t>
+      </w:r>
+    </w:p>
+    <w:p>
+      <w:pPr>
+        <w:spacing w:line="360" w:lineRule="auto" w:after="120" w:before="0"/>
+        <w:ind w:firstLine="432"/>
+        <w:jc w:val="both"/>
+      </w:pPr>
+      <w:r>
+        <w:rPr/>
+        <w:t>Because the pre-coverage estimates cast doubt on Eq. (2), we add two exploratory checks that the pre-analysis plan did not contain. The first removes a linear pre-coverage trend that passes through zero in the base year:</w:t>
       </w:r>
     </w:p>
     <w:p>
@@ -3198,37 +2887,7 @@
       </w:pPr>
       <w:r>
         <w:rPr/>
-        <w:t>The trend-adjusted headline estimate averages θ̃(</w:t>
-      </w:r>
-      <w:r>
-        <w:rPr>
-          <w:i/>
-        </w:rPr>
-        <w:t>e</w:t>
-      </w:r>
-      <w:r>
-        <w:rPr/>
-        <w:t xml:space="preserve">) over </w:t>
-      </w:r>
-      <w:r>
-        <w:rPr>
-          <w:i/>
-        </w:rPr>
-        <w:t>e</w:t>
-      </w:r>
-      <w:r>
-        <w:rPr/>
-        <w:t xml:space="preserve"> = 0 to 3 with the weights of Eq. (6). The second check bounds the bias from departures from parallel trends in the spirit of the relative-magnitudes restriction of Rambachan and Roth (2023). Let δ(</w:t>
-      </w:r>
-      <w:r>
-        <w:rPr>
-          <w:i/>
-        </w:rPr>
-        <w:t>e</w:t>
-      </w:r>
-      <w:r>
-        <w:rPr/>
-        <w:t>) denote the post-coverage violation of Eq. (2). We assume that it changes from one year to the next by no more than M̄ times the largest change between consecutive pre-coverage estimates:</w:t>
+        <w:t>where b̂ is the fitted slope and θ̃(e) is the trend-adjusted estimate, which we average over e = 0 to 3 with the weights of Eq. (6). The second bounds the bias, in the spirit of the relative-magnitudes restriction of Rambachan and Roth (2023). Let δ(e) denote the post-coverage violation of Eq. (2) in event year e. We assume that it changes from year to year by at most M̄ times Δ, the largest change between consecutive pre-coverage estimates:</w:t>
       </w:r>
     </w:p>
     <w:p>
@@ -3496,43 +3155,7 @@
       </w:pPr>
       <w:r>
         <w:rPr/>
-        <w:t>Under Eq. (10), the bias of the event-year estimate is at most M̄Δ(</w:t>
-      </w:r>
-      <w:r>
-        <w:rPr>
-          <w:i/>
-        </w:rPr>
-        <w:t>e</w:t>
-      </w:r>
-      <w:r>
-        <w:rPr/>
-        <w:t xml:space="preserve"> + 1), and we widen the bootstrap confidence interval of the headline estimate by the weighted average of this bound. This construction is conservative and simpler than the confidence sets of Rambachan and Roth (2023), which we do not compute. We also estimate each model after adding the growth of log market capitalization from year </w:t>
-      </w:r>
-      <w:r>
-        <w:rPr>
-          <w:i/>
-        </w:rPr>
-        <w:t>g</w:t>
-      </w:r>
-      <w:r>
-        <w:rPr/>
-        <w:t xml:space="preserve"> − 3 to year </w:t>
-      </w:r>
-      <w:r>
-        <w:rPr>
-          <w:i/>
-        </w:rPr>
-        <w:t>g</w:t>
-      </w:r>
-      <w:r>
-        <w:rPr/>
-        <w:t xml:space="preserve"> − 1 to </w:t>
-      </w:r>
-      <w:r>
-        <w:rPr>
-          <w:i/>
-        </w:rPr>
-        <w:t>X</w:t>
+        <w:t>where s indexes pre-coverage event years. The bias for event year e is then at most M̄Δ(e + 1), and we widen the headline confidence interval by the weighted average of this bound. This construction is conservative and simpler than the confidence sets of Rambachan and Roth (2023), which we do not compute. We also add to X</w:t>
       </w:r>
       <w:r>
         <w:rPr>
@@ -3542,7 +3165,7 @@
       </w:r>
       <w:r>
         <w:rPr/>
-        <w:t>, which compares scored firms with never-scored firms that grew at a similar rate before coverage.</w:t>
+        <w:t xml:space="preserve"> the growth of log market capitalization from year g − 3 to year g − 1, which compares scored firms with never-scored firms of similar pre-coverage growth.</w:t>
       </w:r>
     </w:p>
     <w:p>
@@ -3567,7 +3190,7 @@
       </w:pPr>
       <w:r>
         <w:rPr/>
-        <w:t>To show how a conventional design reads the same data, we estimate the static two-way fixed effects regression that Goodman-Bacon (2021) and Baker et al. (2022) analyze, on scored and never-scored firms:</w:t>
+        <w:t>As a benchmark, we estimate on scored and never-scored firms the static two-way fixed effects regression that Goodman-Bacon (2021) and Baker et al. (2022) analyze:</w:t>
       </w:r>
     </w:p>
     <w:p>
@@ -3786,7 +3409,7 @@
       </w:pPr>
       <w:r>
         <w:rPr/>
-        <w:t>with firm effects α</w:t>
+        <w:t>where α</w:t>
       </w:r>
       <w:r>
         <w:rPr>
@@ -3796,7 +3419,7 @@
       </w:r>
       <w:r>
         <w:rPr/>
-        <w:t xml:space="preserve"> and year effects λ</w:t>
+        <w:t xml:space="preserve"> and λ</w:t>
       </w:r>
       <w:r>
         <w:rPr>
@@ -3806,7 +3429,27 @@
       </w:r>
       <w:r>
         <w:rPr/>
-        <w:t>, no covariates, all event years, and standard errors clustered by firm. The coefficient β compares all post-coverage years with all pre-coverage years and averages over any run-up before coverage; with staggered timing it also uses already-scored firms as controls for later cohorts, which biases β when effects change over time (Baker et al., 2022; Goodman-Bacon, 2021).</w:t>
+        <w:t xml:space="preserve"> are firm and year effects, D</w:t>
+      </w:r>
+      <w:r>
+        <w:rPr>
+          <w:vertAlign w:val="subscript"/>
+        </w:rPr>
+        <w:t>i,t</w:t>
+      </w:r>
+      <w:r>
+        <w:rPr/>
+        <w:t xml:space="preserve"> marks years from the first score onward, and ε</w:t>
+      </w:r>
+      <w:r>
+        <w:rPr>
+          <w:vertAlign w:val="subscript"/>
+        </w:rPr>
+        <w:t>i,t</w:t>
+      </w:r>
+      <w:r>
+        <w:rPr/>
+        <w:t xml:space="preserve"> is the error; we use no covariates and all event years and cluster standard errors by firm. The coefficient β compares all post-coverage with all pre-coverage years, so it averages over any run-up, and with staggered timing it uses already-scored firms as controls for later cohorts, which biases β when effects change over time.</w:t>
       </w:r>
     </w:p>
     <w:p>
@@ -3817,17 +3460,7 @@
       </w:pPr>
       <w:r>
         <w:rPr/>
-        <w:t xml:space="preserve">The pre-analysis plan fixed rows R1 to R6 of Table 3: four robustness checks, a placebo, and the benchmark regression of Eq. (11). The checks add not-yet-scored firms to the controls, which is the alternative comparison group of Callaway and Sant'Anna (2021); drop the covariates; exclude the 2020 and 2021 cohorts; and keep only control firms whose log total assets in year </w:t>
-      </w:r>
-      <w:r>
-        <w:rPr>
-          <w:i/>
-        </w:rPr>
-        <w:t>g</w:t>
-      </w:r>
-      <w:r>
-        <w:rPr/>
-        <w:t xml:space="preserve"> − 1 are at or above the 10th percentile of the scored firms in the cohort (a lower bound only). The placebo dates coverage three years before the first score and uses only years before the actual score. Besides the checks in Section 4.4, we added four exploratory analyses: dating coverage one year later, with its own pre-trend test and bounds; restricting the sample to cohorts observed through event year three; excluding one market at a time; and estimating the model separately for each market.</w:t>
+        <w:t>The pre-analysis plan fixed rows R1 to R6 of Table 3: four robustness checks, a placebo, and the benchmark of Eq. (11). The checks add not-yet-scored firms to the controls; drop the covariates; exclude the 2020 and 2021 cohorts; and keep only control firms whose log total assets in year g − 1 reach the 10th percentile of the cohort's scored firms, a lower bound only. The placebo dates coverage three years early and uses only years before the actual score. Besides the checks in Section 4.4, four analyses are exploratory: dating coverage one year later, with its own pre-trend test and bounds; restricting the sample to cohorts observed through event year three; excluding one market at a time; and estimating the model by market.</w:t>
       </w:r>
     </w:p>
     <w:p>
@@ -3852,7 +3485,7 @@
       </w:pPr>
       <w:r>
         <w:rPr/>
-        <w:t>The authors used Claude (Anthropic), accessed through Claude Code in September 2026, to screen candidate research questions, draft the pre-analysis plan, write and debug the R code, draft and edit the text, and search for and check references. Five instances of the tool, each in a separate context, also produced simulated referee reports that informed the revision. The authors reviewed and approved the research question and the pre-analysis plan before any estimation, reviewed every output of the tool, checked each reported number against the R output files, and take full responsibility for the content.</w:t>
+        <w:t>The authors used Claude (Anthropic) through Claude Code in September 2026 to screen candidate research questions, draft the pre-analysis plan, write and debug the R code, draft and edit the text, and search for and check references. Five instances of the tool, each in a separate context, also produced simulated referee reports that informed the revision. The authors reviewed and approved the research question and the pre-analysis plan before any estimation, reviewed every output of the tool, checked each reported number against the R output files, and take full responsibility for the content.</w:t>
       </w:r>
     </w:p>
     <w:p>
@@ -3890,7 +3523,21 @@
       </w:pPr>
       <w:r>
         <w:rPr/>
-        <w:t>Table 1 compares scored firms in the year before their first score with never-scored firm-years. Scored firms are much larger: their median market capitalization is 203.2 million U.S. dollars against 42.2 million for never-scored firm-years, and their median total assets are 4.3 times those of never-scored firms. Their mean MTB ratio is 2.37, compared with 1.84, and their mean return on assets is 0.064, compared with 0.045. The normalized differences are largest for size (0.69 for market capitalization and 0.61 for total assets) and small for leverage (−0.04). These differences in levels fit the view that providers extend coverage to large and visible firms (Section 2.2), and the size gap matters for the scores themselves, because larger firms receive higher scores from this provider (Dobrick et al., 2023). They motivate the comparison of changes and the adjustment for size, country, and industry in Eq. (3).</w:t>
+        <w:t>Table 1 compares scored firms in the year before their first score with never-scored firm-years. Scored firms are much larger: their median market capitalization is 203.2 million U.S. dollars against 42.2 million, and their median total assets are 4.3 times as large, with normalized differences of 0.69 and 0.61. Their mean MTB ratio is 2.37 against 1.84, and the medians agree, while leverage barely differs (normalized difference −0.04). Return on assets is available for far fewer firm-years, so we use it only descriptively. These gaps fit a provider that covers large and visible firms (Section 2.2), and the MTB gap fits the pre-coverage growth in Section 5.3, as for firms added to an index (Chen et al., 2004). Size also matters for the scores themselves, because larger firms receive higher scores from this provider (Dobrick et al., 2023). We therefore compare changes and adjust for size, country, and industry in Eq. (3).</w:t>
+      </w:r>
+    </w:p>
+    <w:p>
+      <w:pPr>
+        <w:keepNext/>
+        <w:spacing w:line="360" w:lineRule="auto" w:after="120" w:before="120"/>
+      </w:pPr>
+      <w:r>
+        <w:rPr>
+          <w:b/>
+          <w:i/>
+          <w:sz w:val="24"/>
+        </w:rPr>
+        <w:t>5.2. Average effects of the first score</w:t>
       </w:r>
     </w:p>
     <w:p>
@@ -3901,7 +3548,7 @@
       </w:pPr>
       <w:r>
         <w:rPr/>
-        <w:t>The medians agree: the median MTB ratio is 1.26 for scored firms and 0.95 for never-scored firm-years, while median leverage is almost the same (0.217 and 0.205). Return on assets is available for far fewer firm-years (Table 1), so we use it only descriptively. The higher MTB level of scored firms fits the pre-coverage growth documented in Section 5.3, as for firms added to an index (Chen et al., 2004).</w:t>
+        <w:t>Table 2 reports the headline estimates of Eq. (6). The effect on log MTB is 0.002, with a standard error of 0.024 and a 95% confidence interval from −0.046 to 0.048, which under assumption (2) excludes changes in the MTB ratio outside −4.5 to 4.9 percent. The minimum detectable effect from Eq. (7) is 0.067, about 7.0 percent, detected with 80% probability; the confidence interval, not the MDE, gives the effects compatible with the data, and it includes increases of a few percent. No outcome changes significantly at the 5% level once the secondary outcomes are Holm-adjusted: log market capitalization changes by −0.055 (p = 0.134), leverage by 0.8 percentage points (p = 0.134), and total assets by 0.044 log points (p = 0.053, against an unadjusted p = 0.018). Under assumption (2), the MTB estimate gives no sign of the positive effect that the recognition channel of Merton (1987) and the preference channel of Pástor et al. (2021) and Pedersen et al. (2021) predict, nor of a lasting valuation gain from the fund flows that Hartzmark and Sussman (2019) show respond to newly published sustainability ratings.</w:t>
       </w:r>
     </w:p>
     <w:p>
@@ -3915,7 +3562,7 @@
           <w:i/>
           <w:sz w:val="24"/>
         </w:rPr>
-        <w:t>5.2. Average effects of the first score</w:t>
+        <w:t>5.3. Dynamics before and after the first score</w:t>
       </w:r>
     </w:p>
     <w:p>
@@ -3926,61 +3573,7 @@
       </w:pPr>
       <w:r>
         <w:rPr/>
-        <w:t xml:space="preserve">Table 2 reports the headline estimates of Eq. (6). The effect on log MTB is 0.002, with a standard error of 0.024 and a 95% confidence interval from −0.046 to 0.048. In terms of the MTB ratio, the interval excludes changes outside the range from −4.5 to 4.9 percent under assumption (2). The minimum detectable effect from Eq. (7) is 0.067: an effect of about 7.0 percent on the MTB ratio would be detected with 80% probability. The range of effects compatible with the data under assumption (2) is given by the confidence interval, not by the MDE, and it includes increases of a few percent. The effect on log market capitalization is −0.055 (Holm-adjusted </w:t>
-      </w:r>
-      <w:r>
-        <w:rPr>
-          <w:i/>
-        </w:rPr>
-        <w:t>p</w:t>
-      </w:r>
-      <w:r>
-        <w:rPr/>
-        <w:t xml:space="preserve"> = 0.134). Total assets rise by 0.044 log points after coverage (unadjusted </w:t>
-      </w:r>
-      <w:r>
-        <w:rPr>
-          <w:i/>
-        </w:rPr>
-        <w:t>p</w:t>
-      </w:r>
-      <w:r>
-        <w:rPr/>
-        <w:t xml:space="preserve"> = 0.018; Holm-adjusted </w:t>
-      </w:r>
-      <w:r>
-        <w:rPr>
-          <w:i/>
-        </w:rPr>
-        <w:t>p</w:t>
-      </w:r>
-      <w:r>
-        <w:rPr/>
-        <w:t xml:space="preserve"> = 0.053), and leverage rises by 0.8 percentage points (Holm-adjusted </w:t>
-      </w:r>
-      <w:r>
-        <w:rPr>
-          <w:i/>
-        </w:rPr>
-        <w:t>p</w:t>
-      </w:r>
-      <w:r>
-        <w:rPr/>
-        <w:t xml:space="preserve"> = 0.134). None of the four outcomes shows a significant change at the 5% level after the Holm adjustment. Under assumption (2), the MTB estimate gives no sign of the positive effect that the recognition channel of Merton (1987) and the preference channel of Pástor et al. (2021) and Pedersen et al. (2021) predict. Hartzmark and Sussman (2019) show that fund flows respond strongly to newly published sustainability ratings; that channel concerns demand for funds, and our estimate indicates that it did not produce a lasting valuation gain for newly scored firms in these markets. U.S. studies find changes in firm conduct and financial policy after coverage (Bikmetova &amp; Pirinsky, 2026; Tsang et al., 2024, 2025); our outcomes differ from theirs.</w:t>
-      </w:r>
-    </w:p>
-    <w:p>
-      <w:pPr>
-        <w:keepNext/>
-        <w:spacing w:line="360" w:lineRule="auto" w:after="120" w:before="120"/>
-      </w:pPr>
-      <w:r>
-        <w:rPr>
-          <w:b/>
-          <w:i/>
-          <w:sz w:val="24"/>
-        </w:rPr>
-        <w:t>5.3. Dynamics before and after the first score</w:t>
+        <w:t>Fig. 1 plots the event-time estimates of Eq. (5) for all four outcomes. Before the first score, the coefficients for market capitalization and MTB are negative and rise toward zero. In event years −5 and −4, four and three years before the base year, the MTB estimates are −0.095 and −0.082 (p = 0.015 and p = 0.015). Over these four years, scored firms' market capitalization grew 14.1 percent more than that of comparable firms, and their MTB ratio 10.0 percent more. This run-up resembles the growth that precedes additions to a major index (Chen et al., 2004; Harris &amp; Gurel, 1986; Shleifer, 1986), as the selection view in Section 2.2 predicts. The joint test of Eq. (8) rejects parallel pre-trends for market capitalization (p = 0.022) but not at the 5% level for MTB (p = 0.074); as Roth (2022) cautions, this non-rejection is not evidence that pre-trends are absent. Total assets follow a weaker version of the pattern, and leverage falls toward the base year (pre-trend p = 0.002).</w:t>
       </w:r>
     </w:p>
     <w:p>
@@ -3991,57 +3584,21 @@
       </w:pPr>
       <w:r>
         <w:rPr/>
-        <w:t>Fig. 1 plots the event-time estimates of Eq. (5) for all four outcomes. Before the first score, the coefficients for market capitalization and MTB are negative and rise toward zero. For market capitalization, the estimates for event years −5 and −4, four and three years before the base year, are −0.132 and −0.125; for MTB, they are −0.095 and −0.082. This run-up resembles the growth that precedes additions to a major index (Chen et al., 2004; Harris &amp; Gurel, 1986; Shleifer, 1986) and is the pattern the selection view in Section 2.2 predicts. Over the four years from event year −5 to the base year, scored firms' market capitalization grew 14.1 percent more than that of comparable firms, and their MTB ratio 10.0 percent more. The joint test of Eq. (8) rejects parallel pre-trends for market capitalization (</w:t>
-      </w:r>
+        <w:t>After the first score, the MTB coefficients for event years 0 to 3 lie between −0.044 and 0.017, and none differs from zero at the 5% level. The market capitalization estimate is −0.072 in event year 1 (p = 0.029) and not significant later. Only 141 scored firms from 6 cohorts reach event year 4, so we plot that year but exclude it from Eq. (6); its estimates are −0.077 for MTB (p = 0.209) and 0.088 for market capitalization (p = 0.153). Total assets rise to 0.090 by event year 3, and leverage returns toward its earlier level. The valuation gap thus widens before coverage and stops widening afterwards, with no mirror image of the price decline that follows a loss of analyst coverage (Kelly &amp; Ljungqvist, 2012). Without data on share issuance, we cannot tell whether the pre-coverage growth in market capitalization reflects rising prices, new shares, or both, so we base statements about valuation on the MTB ratio.</w:t>
+      </w:r>
+    </w:p>
+    <w:p>
+      <w:pPr>
+        <w:keepNext/>
+        <w:spacing w:line="360" w:lineRule="auto" w:after="120" w:before="120"/>
+      </w:pPr>
       <w:r>
         <w:rPr>
+          <w:b/>
           <w:i/>
+          <w:sz w:val="24"/>
         </w:rPr>
-        <w:t>p</w:t>
-      </w:r>
-      <w:r>
-        <w:rPr/>
-        <w:t xml:space="preserve"> = 0.022) but not at the 5% level for MTB (</w:t>
-      </w:r>
-      <w:r>
-        <w:rPr>
-          <w:i/>
-        </w:rPr>
-        <w:t>p</w:t>
-      </w:r>
-      <w:r>
-        <w:rPr/>
-        <w:t xml:space="preserve"> = 0.074), although the individual MTB estimates for event years −5 and −4 are significant (</w:t>
-      </w:r>
-      <w:r>
-        <w:rPr>
-          <w:i/>
-        </w:rPr>
-        <w:t>p</w:t>
-      </w:r>
-      <w:r>
-        <w:rPr/>
-        <w:t xml:space="preserve"> = 0.015 and </w:t>
-      </w:r>
-      <w:r>
-        <w:rPr>
-          <w:i/>
-        </w:rPr>
-        <w:t>p</w:t>
-      </w:r>
-      <w:r>
-        <w:rPr/>
-        <w:t xml:space="preserve"> = 0.015). Total assets follow a similar but weaker pattern, and leverage falls toward the base year (pre-trend </w:t>
-      </w:r>
-      <w:r>
-        <w:rPr>
-          <w:i/>
-        </w:rPr>
-        <w:t>p</w:t>
-      </w:r>
-      <w:r>
-        <w:rPr/>
-        <w:t xml:space="preserve"> = 0.002). As Roth (2022) cautions, a joint test that does not reject at the 5% level, as for MTB, is not evidence that pre-trends are absent.</w:t>
+        <w:t>5.4. Timing of coverage and sensitivity to pre-trends</w:t>
       </w:r>
     </w:p>
     <w:p>
@@ -4052,51 +3609,7 @@
       </w:pPr>
       <w:r>
         <w:rPr/>
-        <w:t>After the first score, the MTB coefficients lie between −0.044 and 0.017 from event year 0 to event year 3, and none differs from zero at the 5% level. In event year 4, which only 141 scored firms from 6 cohorts reach, the MTB estimate is −0.077 (</w:t>
-      </w:r>
-      <w:r>
-        <w:rPr>
-          <w:i/>
-        </w:rPr>
-        <w:t>p</w:t>
-      </w:r>
-      <w:r>
-        <w:rPr/>
-        <w:t xml:space="preserve"> = 0.209) and the market capitalization estimate is 0.088 (</w:t>
-      </w:r>
-      <w:r>
-        <w:rPr>
-          <w:i/>
-        </w:rPr>
-        <w:t>p</w:t>
-      </w:r>
-      <w:r>
-        <w:rPr/>
-        <w:t xml:space="preserve"> = 0.153); we plot event year 4 but exclude it from Eq. (6) for this reason. For market capitalization, the estimate for event year 1 is −0.072 (</w:t>
-      </w:r>
-      <w:r>
-        <w:rPr>
-          <w:i/>
-        </w:rPr>
-        <w:t>p</w:t>
-      </w:r>
-      <w:r>
-        <w:rPr/>
-        <w:t xml:space="preserve"> = 0.029), and the estimates for later years are not significant. Total assets rise after coverage, with an estimate of 0.090 in event year 3, and leverage returns toward its earlier level. The valuation gap between scored and comparable firms thus widens before coverage and stops widening afterwards, with no mirror image of the price decline that follows a loss of analyst coverage (Kelly &amp; Ljungqvist, 2012). Falling leverage before the base year and rising total assets fit firms that raise equity or grow their assets before they enter coverage. Without data on share issuance, we cannot tell whether the growth in market capitalization before coverage reflects rising prices, new shares, or both, which is why we base statements about valuation on the MTB ratio.</w:t>
-      </w:r>
-    </w:p>
-    <w:p>
-      <w:pPr>
-        <w:keepNext/>
-        <w:spacing w:line="360" w:lineRule="auto" w:after="120" w:before="120"/>
-      </w:pPr>
-      <w:r>
-        <w:rPr>
-          <w:b/>
-          <w:i/>
-          <w:sz w:val="24"/>
-        </w:rPr>
-        <w:t>5.4. Timing of coverage and sensitivity to pre-trends</w:t>
+        <w:t>Table 3 reports the robustness checks; rows R1 to R6 were pre-specified, and rows R7 to R11 are exploratory. Row R10 dates coverage one year after the first scored fiscal year, when a score could first have been published; because scores were backfilled or revised (Berg et al., 2020; Sahin et al., 2023), this also moves the base year closer to the end of the run-up. The MTB effect is then −0.068, a decline of about −6.6 percent (95% interval −0.116 to −0.020; p = 0.004), estimated from 646 scored and 2,412 control firms. It assumes parallel trends from the first scored year, the year of peak valuation. Its joint pre-trend test gives p = 0.072, and with M̄ = 0.25 in Eq. (10) its robust interval, from −0.138 to 0.002, includes zero; the decline loses significance once M̄ reaches 0.23. If firms are selected at an unusually high valuation that later partly reverses, the decline measures the reversal and can hide an offsetting positive coverage effect; if valuations would otherwise have stayed at their peak, coverage lowered them. The data cannot separate the two readings.</w:t>
       </w:r>
     </w:p>
     <w:p>
@@ -4107,37 +3620,7 @@
       </w:pPr>
       <w:r>
         <w:rPr/>
-        <w:t xml:space="preserve">Table 3 reports the robustness checks, including those that address the timing of coverage and the pre-trends. When we date coverage one year after the first scored fiscal year (row R10), so that the base year is the first scored year and the post-coverage window starts when a score could first have been published, the MTB effect is −0.068 (95% interval −0.116 to −0.020; </w:t>
-      </w:r>
-      <w:r>
-        <w:rPr>
-          <w:i/>
-        </w:rPr>
-        <w:t>p</w:t>
-      </w:r>
-      <w:r>
-        <w:rPr/>
-        <w:t xml:space="preserve"> = 0.004), a decline of about −6.6 percent, estimated from 646 scored and 2,412 control firms. The market capitalization effect is −0.073 (</w:t>
-      </w:r>
-      <w:r>
-        <w:rPr>
-          <w:i/>
-        </w:rPr>
-        <w:t>p</w:t>
-      </w:r>
-      <w:r>
-        <w:rPr/>
-        <w:t xml:space="preserve"> = 0.016), and the asset effect is −0.006. This estimate assumes parallel trends from the first scored year, which is the year of peak valuation. The joint pre-trend test for this dating gives </w:t>
-      </w:r>
-      <w:r>
-        <w:rPr>
-          <w:i/>
-        </w:rPr>
-        <w:t>p</w:t>
-      </w:r>
-      <w:r>
-        <w:rPr/>
-        <w:t xml:space="preserve"> = 0.072, and with M̄ = 0.25 in Eq. (10) its robust interval is −0.138 to 0.002, which includes zero; the decline is no longer significant once M̄ reaches 0.23. Two readings fit the decline. If the provider selects firms after a period of unusually high valuation and part of that valuation later reverses, the decline measures the reversal, and it can hide a positive effect of coverage that offsets part of it. If valuations would otherwise have stayed at their peak, coverage lowered them. The data cannot separate the two readings. Because scores were backfilled or revised (Berg et al., 2020; Sahin et al., 2023), later dating also moves the base year closer to the end of the run-up.</w:t>
+        <w:t>Row R11 keeps the 7 cohorts first scored by 2021 and observed through event year 3, with 273 scored and 2,032 control firms. Its MTB effect of −0.008 (p = 0.806) shows that changing cohort composition does not explain the headline estimate, although the interval widens. Row R7 removes a linear pre-trend with Eq. (9). The MTB effect becomes −0.052, with a 95% interval from −0.118 to 0.014; it is negative because a continued run-up would have raised valuations further. Row R8 compares scored firms with never-scored firms that grew at a similar rate before coverage, and so share any tendency to revert, and gives an MTB effect of 0.028 (p = 0.265). This comparison partly accounts for any reversal of temporary demand, like the partly reversing price effects of index additions (Harris &amp; Gurel, 1986), and shows no significant gain, but its interval, from −0.021 to 0.077, admits gains of several percent. It conditions only on market capitalization growth from year g − 3 to year g − 1, and control firms matched on past growth can themselves revert, so it does not settle the reversal question.</w:t>
       </w:r>
     </w:p>
     <w:p>
@@ -4148,57 +3631,21 @@
       </w:pPr>
       <w:r>
         <w:rPr/>
-        <w:t>Restricting the sample to the 7 cohorts first scored no later than 2021, which are observed through event year 3 (row R11; 273 scored and 2,032 control firms), gives an MTB effect of −0.008 (</w:t>
-      </w:r>
+        <w:t>Table S5 of the Supplemental Appendix reports the bounds of Eq. (10), which follow the relative-magnitudes logic of Rambachan and Roth (2023). With a largest change of 0.046 between consecutive pre-coverage MTB estimates, the robust interval for the MTB effect is −0.071 to 0.073 with M̄ = 0.25 and widens to −0.147 to 0.148 with M̄ = 1. Every interval includes zero and admits moderate effects in either direction. The upper limit of the unadjusted interval lies just below a 5 percent increase in the MTB ratio (0.049 log points): any departure with M̄ of 0.01 or more admits an increase of 5 percent, and any departure at all admits a positive effect. The post-coverage null and the absence of a positive effect are therefore both conditional on assumption (2).</w:t>
+      </w:r>
+    </w:p>
+    <w:p>
+      <w:pPr>
+        <w:keepNext/>
+        <w:spacing w:line="360" w:lineRule="auto" w:after="120" w:before="120"/>
+      </w:pPr>
       <w:r>
         <w:rPr>
+          <w:b/>
           <w:i/>
+          <w:sz w:val="24"/>
         </w:rPr>
-        <w:t>p</w:t>
-      </w:r>
-      <w:r>
-        <w:rPr/>
-        <w:t xml:space="preserve"> = 0.806), so the change in cohort composition across event years does not explain the headline estimate, although the smaller sample widens the interval. Removing a linear pre-trend with Eq. (9) (row R7) changes the MTB effect to −0.052 (95% interval −0.118 to 0.014). The estimate is negative because a continued run-up would have raised valuations further; the interval includes zero. For market capitalization the same adjustment gives −0.134 (</w:t>
-      </w:r>
-      <w:r>
-        <w:rPr>
-          <w:i/>
-        </w:rPr>
-        <w:t>p</w:t>
-      </w:r>
-      <w:r>
-        <w:rPr/>
-        <w:t xml:space="preserve"> = 0.001): relative to a continued linear run-up, scored firms' market value grew more slowly after coverage. Conditioning on pre-coverage growth (row R8), which compares scored firms with never-scored firms that grew at a similar rate before coverage and that therefore share any tendency to revert, gives an MTB effect of 0.028 (</w:t>
-      </w:r>
-      <w:r>
-        <w:rPr>
-          <w:i/>
-        </w:rPr>
-        <w:t>p</w:t>
-      </w:r>
-      <w:r>
-        <w:rPr/>
-        <w:t xml:space="preserve"> = 0.265). If part of the pre-coverage growth reflected temporary demand of the kind documented around index additions, whose price effects partly reverse (Harris &amp; Gurel, 1986), this comparison partly accounts for the reversal and shows no significant gain, but its interval, from −0.021 to 0.077, admits gains of several percent. It conditions only on the growth of market capitalization from year </w:t>
-      </w:r>
-      <w:r>
-        <w:rPr>
-          <w:i/>
-        </w:rPr>
-        <w:t>g</w:t>
-      </w:r>
-      <w:r>
-        <w:rPr/>
-        <w:t xml:space="preserve"> − 3 to year </w:t>
-      </w:r>
-      <w:r>
-        <w:rPr>
-          <w:i/>
-        </w:rPr>
-        <w:t>g</w:t>
-      </w:r>
-      <w:r>
-        <w:rPr/>
-        <w:t xml:space="preserve"> − 1, and control firms matched on past growth can themselves revert, so it does not settle the reversal question.</w:t>
+        <w:t>5.5. Robustness and heterogeneity</w:t>
       </w:r>
     </w:p>
     <w:p>
@@ -4209,21 +3656,7 @@
       </w:pPr>
       <w:r>
         <w:rPr/>
-        <w:t>Table IA5 of the Internet Appendix reports the bounds of Eq. (10), which follow the logic of the relative-magnitudes restriction of Rambachan and Roth (2023). The largest change between consecutive pre-coverage MTB estimates is 0.046. With M̄ = 0.25, the robust interval for the MTB effect is −0.071 to 0.073; with M̄ = 0.5, it is −0.096 to 0.098; and with M̄ = 1, it is −0.147 to 0.148. Every interval includes zero, and none excludes effects of moderate size in either direction once departures from parallel trends of the size seen before coverage are allowed. The upper limit of the unadjusted interval, 0.048, lies just below a 5 percent increase in the MTB ratio (0.049 log points): any departure with M̄ of 0.01 or more admits an increase of 5 percent, and any departure at all admits a positive effect. The post-coverage null and the absence of a positive effect are therefore both conditional on assumption (2).</w:t>
-      </w:r>
-    </w:p>
-    <w:p>
-      <w:pPr>
-        <w:keepNext/>
-        <w:spacing w:line="360" w:lineRule="auto" w:after="120" w:before="120"/>
-      </w:pPr>
-      <w:r>
-        <w:rPr>
-          <w:b/>
-          <w:i/>
-          <w:sz w:val="24"/>
-        </w:rPr>
-        <w:t>5.5. Robustness and heterogeneity</w:t>
+        <w:t>In the pre-specified rows R1 to R4, the effect on log MTB is −0.001 when not-yet-scored firms join the controls, as Callaway and Sant'Anna (2021) propose, 0.025 without the outcome-regression covariates of Sant'Anna and Zhao (2020), 0.031 without the 2020 and 2021 cohorts, and 0.016 when control firms below the size range of scored firms are dropped; none differs from zero at the 10% level, so the valuation result is unchanged. The size results are less stable. Under the size restriction, the market capitalization effect shrinks to −0.007 and the asset effect is 0.101, against 0.011 without covariates, so we do not read the asset estimate in Table 2 as evidence that coverage causes growth.</w:t>
       </w:r>
     </w:p>
     <w:p>
@@ -4234,7 +3667,7 @@
       </w:pPr>
       <w:r>
         <w:rPr/>
-        <w:t>The pre-specified checks in rows R1 to R4 of Table 3 leave the valuation result unchanged, including the change of comparison group proposed by Callaway and Sant'Anna (2021) and the removal of the outcome-regression covariates of Sant'Anna and Zhao (2020). The effect on log MTB is −0.001 when not-yet-scored firms join the control group, 0.025 without covariates, 0.031 without the 2020 and 2021 cohorts, and 0.016 when control firms below the size range of scored firms are dropped; none differs from zero at the 10% level. The size results are less stable. The market capitalization effect shrinks to −0.007 under the size restriction, and the asset effect ranges from 0.011 without covariates to 0.101 under the size restriction, so we do not read the asset estimate in Table 2 as evidence that coverage causes growth.</w:t>
+        <w:t>The placebo in row R5, which dates coverage three years before the first score within pre-score years, yields 0.059 on log MTB (p = 0.010) and 0.134 on log market capitalization (p &lt; 0.001). This failure restates the pre-coverage growth of Fig. 1 and adds no independent evidence. The static two-way fixed effects regression of Eq. (11) in row R6 attributes increases of 0.064 in log MTB (p = 0.014) and 0.185 in log market capitalization to coverage, because it compares all post-coverage with all earlier years and so counts part of the run-up as a rating effect. Part of its gap to the baseline reflects the covariates and the event window, as the larger estimate without covariates in row R2 shows; the remainder illustrates the biases of static regressions under staggered timing described by Goodman-Bacon (2021) and Baker et al. (2022).</w:t>
       </w:r>
     </w:p>
     <w:p>
@@ -4245,37 +3678,7 @@
       </w:pPr>
       <w:r>
         <w:rPr/>
-        <w:t>The placebo in row R5 dates coverage three years before the first score and uses only years before the actual score. It yields an effect of 0.059 on log MTB (</w:t>
-      </w:r>
-      <w:r>
-        <w:rPr>
-          <w:i/>
-        </w:rPr>
-        <w:t>p</w:t>
-      </w:r>
-      <w:r>
-        <w:rPr/>
-        <w:t xml:space="preserve"> = 0.010) and of 0.134 on log market capitalization (</w:t>
-      </w:r>
-      <w:r>
-        <w:rPr>
-          <w:i/>
-        </w:rPr>
-        <w:t>p</w:t>
-      </w:r>
-      <w:r>
-        <w:rPr/>
-        <w:t xml:space="preserve"> &lt; 0.001). The placebo fails, and the failure restates the pre-coverage growth shown in Fig. 1 in a different form rather than adding independent evidence. Row R6 reports the static two-way fixed effects regression of Eq. (11). It attributes an increase of 0.064 in log MTB (</w:t>
-      </w:r>
-      <w:r>
-        <w:rPr>
-          <w:i/>
-        </w:rPr>
-        <w:t>p</w:t>
-      </w:r>
-      <w:r>
-        <w:rPr/>
-        <w:t xml:space="preserve"> = 0.014) and of 0.185 in log market capitalization to coverage. Because it compares all post-coverage years with all earlier years, it counts part of the pre-coverage growth as an effect of the rating. Part of the gap between row R6 and the baseline reflects the covariates and the event window, since the heterogeneity-robust estimate without covariates is 0.025 (row R2); the remainder is an example of the biases of static two-way fixed effects regressions under staggered timing described by Goodman-Bacon (2021) and Baker et al. (2022).</w:t>
+        <w:t>When row R9 and Table S1 of the Supplemental Appendix exclude one market at a time, the MTB effect ranges from −0.007 to 0.017 and is −0.003 without Malaysia (p = 0.940), whereas the market capitalization effect turns to 0.037, so its negative baseline estimate reflects the large Malaysian cohorts of 2021 and 2022. Estimated market by market in Table S3, the MTB effect is 0.009 in Malaysia, with 372 scored firms, and 0.027 in Thailand, with 157. Indonesia, the Philippines, and Singapore have few scored firms and imprecise estimates, including a small one for Singapore, where reporting became mandatory from financial year 2017 (Krueger et al., 2024; Singapore Exchange, 2016).</w:t>
       </w:r>
     </w:p>
     <w:p>
@@ -4286,17 +3689,21 @@
       </w:pPr>
       <w:r>
         <w:rPr/>
-        <w:t>Row R9 and Table IA1 of the Internet Appendix exclude one market at a time. Across the five leave-one-market-out samples, the MTB effect ranges from −0.007 to 0.017, and excluding Malaysia gives −0.003 (</w:t>
-      </w:r>
+        <w:t>The last three rows of Table 3 split scored firms at the cohort median of their first ESG score. The MTB effect is −0.019 for high-score and 0.022 for low-score entrants. The difference of −0.041 (standard error 0.040, p = 0.307) is not significant, but with a minimum detectable value of 0.113 the test cannot exclude moderate differences. The preference channel (Pedersen et al., 2021) and the evidence on favorable first coverage (Demiroglu &amp; Ryngaert, 2010) predict such a difference; a weak signal, given that providers disagree (Berg, Kölbel, et al., 2022; Christensen et al., 2022), is one reason it may be absent. The split also uses initial scores that may have been revised since publication (Sahin et al., 2023).</w:t>
+      </w:r>
+    </w:p>
+    <w:p>
+      <w:pPr>
+        <w:keepNext/>
+        <w:spacing w:line="360" w:lineRule="auto" w:after="120" w:before="120"/>
+      </w:pPr>
       <w:r>
         <w:rPr>
+          <w:b/>
           <w:i/>
+          <w:sz w:val="24"/>
         </w:rPr>
-        <w:t>p</w:t>
-      </w:r>
-      <w:r>
-        <w:rPr/>
-        <w:t xml:space="preserve"> = 0.940). The market capitalization effect is less stable: it turns to 0.037 when Malaysian firms are excluded, so the negative baseline estimate for market capitalization reflects the large Malaysian cohorts of 2021 and 2022. Estimated market by market (Table IA3), the MTB effect is 0.009 in Malaysia (372 scored firms) and 0.027 in Thailand (157 scored firms); the estimates for Indonesia, the Philippines, and Singapore rest on few scored firms and have wide confidence intervals. The Singaporean estimate, of interest because reporting became mandatory there from financial year 2017 (Krueger et al., 2024; Singapore Exchange, 2016), is small and imprecise.</w:t>
+        <w:t>5.6. Economic magnitude</w:t>
       </w:r>
     </w:p>
     <w:p>
@@ -4307,17 +3714,20 @@
       </w:pPr>
       <w:r>
         <w:rPr/>
-        <w:t xml:space="preserve">The last three rows of Table 3 split scored firms at the median of the first ESG score within their cohort. The MTB effect is −0.019 for firms that enter coverage with a high score and 0.022 for firms with a low score. The difference of −0.041 (standard error 0.040, </w:t>
-      </w:r>
+        <w:t>Under assumption (2), the largest increase compatible with the headline interval is of the same order as the announcement return of 4.86 percent that Demiroglu and Ryngaert (2010) report for the first analyst coverage of neglected stocks, and it exceeds the increase of more than 3 percent that Harris and Gurel (1986) report for additions to the S&amp;P 500, most of which reversed within about two weeks. Annual year-end ratios would miss such short-lived effects, so our estimates concern lasting revaluation of the kind a permanent rise in investor recognition would produce (Chen et al., 2004; Merton, 1987). Under the same assumption, a lasting effect half as large as the MTB run-up in Section 5.3 would lie just outside the headline interval, so any such effect is small relative to the growth that precedes coverage.</w:t>
+      </w:r>
+    </w:p>
+    <w:p>
+      <w:pPr>
+        <w:keepNext/>
+        <w:spacing w:line="360" w:lineRule="auto" w:after="120" w:before="240"/>
+      </w:pPr>
       <w:r>
         <w:rPr>
-          <w:i/>
+          <w:b/>
+          <w:sz w:val="24"/>
         </w:rPr>
-        <w:t>p</w:t>
-      </w:r>
-      <w:r>
-        <w:rPr/>
-        <w:t xml:space="preserve"> = 0.307) is not significant, and its minimum detectable value is 0.113. We find no evidence that the content of the first score matters for valuation, but the test cannot exclude moderate differences. The preference channel (Pedersen et al., 2021) and the evidence on favorable first coverage (Demiroglu &amp; Ryngaert, 2010) predict such a difference; a weak signal, given that providers disagree (Berg, Kölbel, et al., 2022; Christensen et al., 2022), is one reason it may be absent. Because recent scores can be revised after publication (Sahin et al., 2023), the initial scores used for this split may differ from those that investors saw.</w:t>
+        <w:t>6. Discussion</w:t>
       </w:r>
     </w:p>
     <w:p>
@@ -4331,7 +3741,7 @@
           <w:i/>
           <w:sz w:val="24"/>
         </w:rPr>
-        <w:t>5.6. Economic magnitude</w:t>
+        <w:t>6.1. Interpreting the post-coverage path</w:t>
       </w:r>
     </w:p>
     <w:p>
@@ -4342,7 +3752,7 @@
       </w:pPr>
       <w:r>
         <w:rPr/>
-        <w:t>Under assumption (2), the upper end of the headline interval corresponds to an increase of 4.9 percent in the MTB ratio. This is of the same order as the announcement return of 4.86 percent that Demiroglu and Ryngaert (2010) report for the first analyst coverage of neglected stocks, and larger than the price increase of more than 3 percent that Harris and Gurel (1986) report for additions to the S&amp;P 500, most of which reversed within about two weeks. Annual ratios measured at fiscal year-end would miss an announcement effect of that size that reverses within weeks, so our estimates speak to lasting revaluation, as a permanent increase in investor recognition would produce (Chen et al., 2004; Merton, 1987), and not to temporary price pressure (Harris &amp; Gurel, 1986).</w:t>
+        <w:t>The flat post-coverage MTB path admits three readings, depending on the counterfactual pre-coverage trend (Rambachan &amp; Roth, 2023; Roth, 2022). With parallel paths from the base year, coverage had no effect within the interval of Section 5.2. With a continued run-up, coverage lowered valuations relative to trend. With a partly transitory run-up, the flat path is consistent with a positive coverage effect that offset a reversal. The third reading deserves weight, because firms selected after relative growth likely carry transitory value, as the partial reversal of index-addition effects illustrates (Chen et al., 2004; Harris &amp; Gurel, 1986).</w:t>
       </w:r>
     </w:p>
     <w:p>
@@ -4353,34 +3763,7 @@
       </w:pPr>
       <w:r>
         <w:rPr/>
-        <w:t>The dynamics offer a second benchmark. Over the four years before the base year, scored firms' MTB ratio grew 10.0 percent more than that of comparable firms, and their market capitalization 14.1 percent more. Under assumption (2), a lasting valuation effect as large as half of the MTB run-up would lie just outside the headline interval, so any such effect is small relative to the growth that precedes coverage, which is consistent with a provider that covers firms after they have become visible to investors (Chen et al., 2004; Merton, 1987).</w:t>
-      </w:r>
-    </w:p>
-    <w:p>
-      <w:pPr>
-        <w:keepNext/>
-        <w:spacing w:line="360" w:lineRule="auto" w:after="120" w:before="240"/>
-      </w:pPr>
-      <w:r>
-        <w:rPr>
-          <w:b/>
-          <w:sz w:val="24"/>
-        </w:rPr>
-        <w:t>6. Discussion</w:t>
-      </w:r>
-    </w:p>
-    <w:p>
-      <w:pPr>
-        <w:keepNext/>
-        <w:spacing w:line="360" w:lineRule="auto" w:after="120" w:before="120"/>
-      </w:pPr>
-      <w:r>
-        <w:rPr>
-          <w:b/>
-          <w:i/>
-          <w:sz w:val="24"/>
-        </w:rPr>
-        <w:t>6.1. Interpreting the post-coverage path</w:t>
+        <w:t>Three results bear on reversal. First, dating coverage one year later yields an MTB decline after the first scored year, which a reversal would produce and a positive coverage effect could partly offset; the estimate cannot separate the two. Second, against never-scored firms with similar pre-coverage growth, the MTB effect is small and insignificant, but this comparison conditions on a single growth measure, and its interval admits gains of several percent. Third, the bounds in Section 5.4 include zero for every M̄ we consider but also effects of several percent in both directions. The evidence therefore does not show that coverage has no effect: no specification detects a valuation gain, and the bounds do not exclude one. The clearest result is the ordering of events: the first scored fiscal year follows relative growth and coincides with a valuation peak.</w:t>
       </w:r>
     </w:p>
     <w:p>
@@ -4391,7 +3774,21 @@
       </w:pPr>
       <w:r>
         <w:rPr/>
-        <w:t>The flat MTB path after the first score admits three readings, which differ in how the pre-coverage trend would have evolved (Rambachan &amp; Roth, 2023; Roth, 2022). Under parallel paths from the base year, coverage had no effect within the interval of Section 5.2. If the run-up would have continued, coverage lowered valuations relative to that trend, as the trend-adjusted estimate reads it. If instead the run-up was partly transitory and would have reversed, the flat path is consistent with a positive effect of coverage that offset the reversal. The last reading deserves weight: firms selected after relative growth are likely selected partly on transitory value, as the partial reversal of index-addition effects illustrates (Chen et al., 2004; Harris &amp; Gurel, 1986).</w:t>
+        <w:t>Market-level MTB effects agree: they are close to zero in Malaysia and Thailand, the two largest scored samples, and no market shows a significant positive effect. Because the coverage waves came in 2019 and 2020 in Thailand and Singapore but in 2021 and 2022 in Malaysia, a shock common to all five markets is a less likely explanation, although the waves may reflect market-specific disclosure rules (Krueger et al., 2024; Singapore Exchange, 2016) or unobserved index changes.</w:t>
+      </w:r>
+    </w:p>
+    <w:p>
+      <w:pPr>
+        <w:keepNext/>
+        <w:spacing w:line="360" w:lineRule="auto" w:after="120" w:before="120"/>
+      </w:pPr>
+      <w:r>
+        <w:rPr>
+          <w:b/>
+          <w:i/>
+          <w:sz w:val="24"/>
+        </w:rPr>
+        <w:t>6.2. Relation to prior evidence</w:t>
       </w:r>
     </w:p>
     <w:p>
@@ -4402,7 +3799,7 @@
       </w:pPr>
       <w:r>
         <w:rPr/>
-        <w:t>Three pieces of evidence speak to the reversal reading. First, when coverage is dated one year later, MTB ratios decline after the first scored year. A reversal would produce such a decline, and a positive effect of coverage could offset part of it; the estimate cannot distinguish the two. Second, when scored firms are compared with never-scored firms that grew at a similar rate before coverage, and that are therefore subject to similar reversal, the MTB effect is small and insignificant, but that comparison conditions on a single measure of past growth and its interval admits gains of several percent. Third, the bounds in Section 5.4, built on the relative-magnitudes idea of Rambachan and Roth (2023), include zero for every value of M̄ we consider, but they also include effects of several percent in both directions. The evidence therefore does not show that coverage has no effect. It shows that no specification detects a valuation gain after the first score, although the bounds do not exclude one, and that the most robust feature of the data is the ordering of events: the first score follows a period of relative growth and coincides with a valuation peak.</w:t>
+        <w:t>Sell-side evidence suggests why a first ESG score might move prices: losing coverage lowers prices (Kelly &amp; Ljungqvist, 2012), a favorable first report on a neglected stock raises them (Demiroglu &amp; Ryngaert, 2010), and Hartzmark and Sussman (2019) document a demand channel through fund flows. Two features may explain the absence of a gain. ESG scores rarely carry cash-flow news and arrive after the firm's own disclosures. Our firms were also large and visible before coverage (Table 1), and some had FTSE Russell scores, leaving less room for the recognition channel of Merton (1987); foreign-ownership limits in these markets could further mute recognition through foreign ESG investors. Without data on ownership, investor attention, foreign holdings, or these limits, we cannot test either explanation.</w:t>
       </w:r>
     </w:p>
     <w:p>
@@ -4413,7 +3810,7 @@
       </w:pPr>
       <w:r>
         <w:rPr/>
-        <w:t>The market-level estimates reinforce this reading. The two markets with the most scored firms, Malaysia and Thailand, both show MTB effects close to zero, and no market shows a significant positive effect. The coverage waves differ in timing across markets: the Thai and Singaporean waves came in 2019 and 2020, the Malaysian wave in 2021 and 2022. A single shock common to all five markets is therefore a less likely explanation of the pattern, although the waves may reflect market-specific changes in disclosure rules (Krueger et al., 2024; Singapore Exchange, 2016) or index composition that we do not observe.</w:t>
+        <w:t>The results also fit the evidence on rating disagreement. If ESG funds follow one provider more than others (Berg, Heeb, et al., 2022), coverage by another provider may matter little for demand, and dispersion across providers (Berg, Kölbel, et al., 2022; Christensen et al., 2022) weakens the information in any single score. U.S. studies find that coverage changes firm conduct (Bikmetova &amp; Pirinsky, 2026; Tsang et al., 2024) and financial policy (Tsang et al., 2025); we find no stable change in leverage or assets and observe no measures of conduct.</w:t>
       </w:r>
     </w:p>
     <w:p>
@@ -4427,7 +3824,7 @@
           <w:i/>
           <w:sz w:val="24"/>
         </w:rPr>
-        <w:t>6.2. Relation to prior evidence</w:t>
+        <w:t>6.3. Implications</w:t>
       </w:r>
     </w:p>
     <w:p>
@@ -4438,7 +3835,7 @@
       </w:pPr>
       <w:r>
         <w:rPr/>
-        <w:t>The evidence on sell-side coverage suggests why a first ESG score might move prices: the loss of coverage lowers prices (Kelly &amp; Ljungqvist, 2012), and the first report on a neglected stock raises prices when it is favorable (Demiroglu &amp; Ryngaert, 2010). Hartzmark and Sussman (2019) document a demand channel through fund flows. Two features of ESG scores may explain why we detect no valuation gain. An ESG score rarely contains news about cash flows, and it arrives with a lag after the firm's own disclosures. In addition, the firms in our sample were already large and visible before their first LSEG score (Table 1), and some of them had been scored by FTSE Russell, so the recognition channel of Merton (1987) had less room to operate; we have not tested this explanation directly because the data contain no measures of ownership or investor attention. Limits on foreign ownership that apply to some listed firms in these markets could also mute a recognition channel that works through foreign ESG investors; we observe neither the limits nor foreign holdings.</w:t>
+        <w:t>The main implication is methodological. A cross-sectional valuation premium of rated firms, or a static two-way fixed effects estimate, can reflect selection into coverage rather than an effect of ratings. Here the static regression attributes an MTB increase of 6.6 percent to coverage, whereas the heterogeneity-robust estimator and its event-time profile trace the gap to pre-coverage growth (Callaway &amp; Sant'Anna, 2021; Roth, 2022). Studies comparing rated and unrated firms in these markets should model coverage timing and report pre-coverage dynamics.</w:t>
       </w:r>
     </w:p>
     <w:p>
@@ -4449,21 +3846,20 @@
       </w:pPr>
       <w:r>
         <w:rPr/>
-        <w:t>The results also fit the evidence on rating disagreement. If ESG funds follow one provider more than others (Berg, Heeb, et al., 2022), coverage by a different provider may matter little for demand, and the dispersion of scores across providers (Berg, Kölbel, et al., 2022; Christensen et al., 2022) weakens the information content of any single score. Price effects of index additions, which the pre-coverage growth resembles, are concentrated around the announcement; part of them lasts (Chen et al., 2004; Shleifer, 1986) and part reverses (Harris &amp; Gurel, 1986), and annual data cannot isolate an effect of that kind. Our evidence complements the U.S. findings that coverage changes firm conduct (Bikmetova &amp; Pirinsky, 2026; Tsang et al., 2024) and financial policy (Tsang et al., 2025): we find no stable change in leverage or assets, and we observe no measures of conduct.</w:t>
+        <w:t>For listed firms in the five markets, the estimates give no support, under assumption (2), to the expectation that a first LSEG score will raise their valuation through investor recognition or preferences (Merton, 1987; Pástor et al., 2021); the confidence interval excludes increases above 4.9 percent, but smaller effects remain possible. The evidence does not speak to short-lived price effects around publication, to unscored firms, or to outcomes other than valuation and financing. For investors and exchanges, scored firms are a selected group with a distinct valuation history. These data cannot show whether the ordering extends to other markets or providers.</w:t>
       </w:r>
     </w:p>
     <w:p>
       <w:pPr>
         <w:keepNext/>
-        <w:spacing w:line="360" w:lineRule="auto" w:after="120" w:before="120"/>
+        <w:spacing w:line="360" w:lineRule="auto" w:after="120" w:before="240"/>
       </w:pPr>
       <w:r>
         <w:rPr>
           <w:b/>
-          <w:i/>
           <w:sz w:val="24"/>
         </w:rPr>
-        <w:t>6.3. Implications</w:t>
+        <w:t>7. Limitations</w:t>
       </w:r>
     </w:p>
     <w:p>
@@ -4474,7 +3870,20 @@
       </w:pPr>
       <w:r>
         <w:rPr/>
-        <w:t>The main implication is methodological. A cross-sectional valuation premium of rated firms, or a static two-way fixed effects estimate, can reflect the selection of firms into coverage rather than an effect of ratings. In our data, the static regression suggests that coverage raises the MTB ratio by 6.6 percent, while the heterogeneity-robust estimator and its event-time profile attribute the gap to growth before coverage (Callaway &amp; Sant'Anna, 2021; Roth, 2022). Studies that compare rated and unrated firms in these markets should model the timing of coverage and report pre-coverage dynamics.</w:t>
+        <w:t>The study has eight limitations. First, the provider chooses when to cover a firm, and we have no coverage variation unrelated to firm performance. The post-coverage estimates rest on conditional parallel trends from the base year, which the pre-coverage estimates question, and our sensitivity analysis uses a linear trend and a simplified bound, not the confidence sets of Rambachan and Roth (2023). Second, the data are annual and may contain backfilled or revised scores, so we observe neither first-score publication dates nor announcement returns; later dating closes only part of this gap. Third, we observe only LSEG coverage; for firms with earlier scores from other providers, such as FTSE Russell scores for Malaysian index constituents (Bernama, 2022), the event is an additional score. Fourth, without stock returns, shares outstanding, ownership, foreign holdings, foreign-ownership limits, index membership, or sustainability report dates, we cannot separate price changes from share issuance, test the recognition channel directly, or link first scores to index entry or first sustainability reports. Fifth, a few market capitalization values are implausibly large; pooled winsorization limits but does not correct them, an erroneous base-year value enters every group-time estimate of its cohort, and return on assets covers a minority of firm-years. Sixth, Malaysian and Thai firms make up 84.3 percent of scored firms and dominate the pooled estimates, and the firm-level bootstrap does not account for correlation within market-level coverage waves, so the intervals may be too narrow. Seventh, the minimum detectable effect on log MTB is 0.067, about 7.0 percent, so smaller effects would be detected with less than 80% probability; under parallel trends, the confidence interval excludes only increases above 4.9 percent. Eighth, the unrecorded download date leaves the vintage of revisable recent scores uncertain, and we do not document the timing of disclosure rules outside Singapore.</w:t>
+      </w:r>
+    </w:p>
+    <w:p>
+      <w:pPr>
+        <w:keepNext/>
+        <w:spacing w:line="360" w:lineRule="auto" w:after="120" w:before="240"/>
+      </w:pPr>
+      <w:r>
+        <w:rPr>
+          <w:b/>
+          <w:sz w:val="24"/>
+        </w:rPr>
+        <w:t>8. Conclusion</w:t>
       </w:r>
     </w:p>
     <w:p>
@@ -4485,55 +3894,7 @@
       </w:pPr>
       <w:r>
         <w:rPr/>
-        <w:t>For listed firms in the five markets, the estimates give no support to the expectation that a first LSEG score will raise the market valuation of their shares through investor recognition or preferences (Merton, 1987; Pástor et al., 2021), although the evidence is conditional on assumption (2). Under that assumption, the confidence interval excludes increases of more than 4.9 percent, and smaller effects remain possible. The evidence does not speak to short-lived price effects around publication, to firms outside the scored sample, or to outcomes other than valuation and financing. For investors and exchanges, scored firms are a selected group whose valuation history differs from that of unscored firms. Whether the same ordering holds in other markets or for other providers is a question these data cannot answer.</w:t>
-      </w:r>
-    </w:p>
-    <w:p>
-      <w:pPr>
-        <w:keepNext/>
-        <w:spacing w:line="360" w:lineRule="auto" w:after="120" w:before="240"/>
-      </w:pPr>
-      <w:r>
-        <w:rPr>
-          <w:b/>
-          <w:sz w:val="24"/>
-        </w:rPr>
-        <w:t>7. Limitations</w:t>
-      </w:r>
-    </w:p>
-    <w:p>
-      <w:pPr>
-        <w:spacing w:line="360" w:lineRule="auto" w:after="120" w:before="0"/>
-        <w:ind w:firstLine="432"/>
-        <w:jc w:val="both"/>
-      </w:pPr>
-      <w:r>
-        <w:rPr/>
-        <w:t>The study has eight limitations. First, the provider chooses when to cover a firm, and we have no source of variation in coverage that is unrelated to firm performance. The post-coverage estimates rely on conditional parallel trends from the base year, an assumption that the pre-coverage estimates call into question. Our sensitivity analysis uses a linear trend and a simplified bound; we do not compute the confidence sets of Rambachan and Roth (2023). Second, the data are annual and may contain backfilled or revised scores, so we observe neither the date on which a first score was published nor announcement returns; dating coverage one year later addresses only part of this gap. Third, we observe coverage by LSEG only. Some firms had scores from other providers before their first LSEG score, including FTSE Russell scores for Malaysian index constituents (Bernama, 2022), and the event we study is then an additional score rather than a first rating of any kind. Fourth, the data contain no stock returns, shares outstanding, ownership (including foreign holdings and foreign-ownership limits), index membership, or dates of sustainability reports, so we cannot separate price changes from share issuance, test the recognition channel directly, or show whether first scores coincide with index entry or with a firm's first sustainability report. Fifth, a small number of market capitalization values in the source data are implausibly large, winsorization over the pooled sample limits their influence without correcting them, an erroneous value in a cohort's base year enters every group-time estimate of that cohort, and return on assets is available for a minority of firm-years. Sixth, Malaysian and Thai firms account for 84.3 percent of scored firms, so the pooled estimates weight those markets heavily, and the firm-level bootstrap does not account for correlation within market-level coverage waves, so the intervals may be too narrow. Seventh, the minimum detectable effect on log MTB is 0.067 (about 7.0 percent), so smaller effects would be detected with less than 80% probability; under parallel trends, the confidence interval excludes increases above 4.9 percent but not smaller ones. Eighth, the download date of the scores is not recorded, so the vintage of revisable recent scores is not known exactly, and we do not document the timing of disclosure rules outside Singapore.</w:t>
-      </w:r>
-    </w:p>
-    <w:p>
-      <w:pPr>
-        <w:keepNext/>
-        <w:spacing w:line="360" w:lineRule="auto" w:after="120" w:before="240"/>
-      </w:pPr>
-      <w:r>
-        <w:rPr>
-          <w:b/>
-          <w:sz w:val="24"/>
-        </w:rPr>
-        <w:t>8. Conclusion</w:t>
-      </w:r>
-    </w:p>
-    <w:p>
-      <w:pPr>
-        <w:spacing w:line="360" w:lineRule="auto" w:after="120" w:before="0"/>
-        <w:ind w:firstLine="432"/>
-        <w:jc w:val="both"/>
-      </w:pPr>
-      <w:r>
-        <w:rPr/>
-        <w:t>Using the staggered first appearance of LSEG ESG scores for 675 non-financial firms in Indonesia, Malaysia, the Philippines, Singapore, and Thailand, we find that scored firms, most of them Malaysian and Thai, grew faster than comparable never-scored firms before their first scored year and that, under parallel trends, their market-to-book ratios did not rise afterwards. The headline effect is 0.002 (95% interval −0.046 to 0.048), and dating coverage one year later gives −0.068, a decline that may reflect a reversal of the pre-coverage run-up. The first scored year therefore coincides with a valuation peak, and we detect no later gain, although departures from parallel trends of the size seen before coverage would admit effects of several percent in either direction. Analyses that compare rated and unrated firms without modeling the timing of coverage will attribute this selection to the rating.</w:t>
+        <w:t>Using the staggered first appearance of LSEG ESG scores for 675 non-financial firms in five Southeast Asian markets, we find that scored firms, mostly Malaysian and Thai, grew faster than comparable never-scored firms before their first scored year and, under parallel trends, did not gain in market-to-book ratio afterwards (headline effect 0.002; 95% interval −0.046 to 0.048). Dating coverage one year later gives −0.068, a decline that may reflect a reversal of the run-up. The first scored year thus coincides with a valuation peak, although departures from parallel trends like those before coverage would admit effects of several percent either way. Comparisons of rated and unrated firms that ignore coverage timing will attribute this selection to the rating.</w:t>
       </w:r>
     </w:p>
     <w:p>
@@ -7367,33 +6728,7 @@
         <w:rPr>
           <w:sz w:val="20"/>
         </w:rPr>
-        <w:t xml:space="preserve">ATT is the average effect over event years 0 to 3 (Eq. 6), with bootstrap standard errors and unadjusted 95% intervals; </w:t>
-      </w:r>
-      <w:r>
-        <w:rPr>
-          <w:i/>
-          <w:sz w:val="20"/>
-        </w:rPr>
-        <w:t>p</w:t>
-      </w:r>
-      <w:r>
-        <w:rPr>
-          <w:sz w:val="20"/>
-        </w:rPr>
-        <w:t xml:space="preserve">-values of the three secondary outcomes are Holm-adjusted. MDE is the minimum detectable effect at 80% power, and pre-trend </w:t>
-      </w:r>
-      <w:r>
-        <w:rPr>
-          <w:i/>
-          <w:sz w:val="20"/>
-        </w:rPr>
-        <w:t>p</w:t>
-      </w:r>
-      <w:r>
-        <w:rPr>
-          <w:sz w:val="20"/>
-        </w:rPr>
-        <w:t xml:space="preserve"> is the joint test of Eq. (8).</w:t>
+        <w:t>ATT is the average effect over event years 0 to 3 (Eq. 6), with bootstrap standard errors and unadjusted 95% intervals; p-values of the three secondary outcomes are Holm-adjusted. MDE is the minimum detectable effect at 80% power, and pre-trend p is the joint test of Eq. (8).</w:t>
       </w:r>
     </w:p>
     <w:p>
@@ -9040,20 +8375,7 @@
         <w:rPr>
           <w:sz w:val="20"/>
         </w:rPr>
-        <w:t xml:space="preserve">Cells show the average effect over event years 0 to 3, with bootstrap standard errors in parentheses (firm-clustered in R6); R1 to R6 are pre-specified and R7 to R11 exploratory. *, **, and *** denote significance at 10%, 5%, and 1% (unadjusted </w:t>
-      </w:r>
-      <w:r>
-        <w:rPr>
-          <w:i/>
-          <w:sz w:val="20"/>
-        </w:rPr>
-        <w:t>p</w:t>
-      </w:r>
-      <w:r>
-        <w:rPr>
-          <w:sz w:val="20"/>
-        </w:rPr>
-        <w:t>-values).</w:t>
+        <w:t>Cells show the average effect over event years 0 to 3, with bootstrap standard errors in parentheses (firm-clustered in R6); R1 to R6 are pre-specified and R7 to R11 exploratory. *, **, and *** denote significance at 10%, 5%, and 1% (unadjusted p-values).</w:t>
       </w:r>
     </w:p>
     <w:p>

</xml_diff>

<commit_message>
Stage 4.5 findings fixed (3 MEDIUM, 13 MINOR); E6 dispositions; Dobrick DOI
Co-Authored-By: Claude Opus 5.5 <noreply@anthropic.com>
Claude-Session: https://claude.ai/code/session_01Ka6Duc4zGYgPZcHc3gHgFv
</commit_message>
<xml_diff>
--- a/manuscript/Manuscript_Anonymized.docx
+++ b/manuscript/Manuscript_Anonymized.docx
@@ -159,7 +159,7 @@
       </w:pPr>
       <w:r>
         <w:rPr/>
-        <w:t>We do not claim that coverage has no effect on valuation. The run-up casts doubt on the parallel-trends assumption behind the post-coverage estimates. When we allow post-coverage departures from parallel trends of up to a quarter of the largest pre-coverage year-to-year change, following Rambachan and Roth (2023), the MTB interval widens to −0.071 to 0.073. Because the upper limit of the unadjusted interval lies just below a 5 percent increase, any such departure admits positive effects of that size. The data support an ordering of events: the first score follows relative growth and coincides with a valuation peak, and under parallel trends no specification detects a later gain.</w:t>
+        <w:t>We do not claim that coverage has no effect on valuation. The run-up casts doubt on the parallel-trends assumption behind the post-coverage estimates. When we allow post-coverage departures from parallel trends of up to a quarter of the largest pre-coverage year-to-year change, following Rambachan and Roth (2023), the MTB interval widens to −0.071 to 0.073. Because the upper limit of the unadjusted interval lies just below a 5 percent increase, any such departure admits positive effects of that size. The data support an ordering of events: the first score follows relative growth and coincides with a valuation peak, and under parallel trends no heterogeneity-robust specification detects a later gain.</w:t>
       </w:r>
     </w:p>
     <w:p>
@@ -170,7 +170,7 @@
       </w:pPr>
       <w:r>
         <w:rPr/>
-        <w:t>We contribute to research on the financial consequences of ESG ratings with emerging-market evidence on the extensive margin of coverage, and we show that selection into coverage matters for any comparison of rated and unrated firms. The results also illustrate how pre-trends in staggered designs can carry economic content (Roth, 2022).</w:t>
+        <w:t>We contribute to research on the financial consequences of ESG ratings with emerging-market evidence on the extensive margin of coverage, and we show that selection into coverage matters for any comparison of rated and unrated firms. The results also show that pre-coverage dynamics, which pre-trend tests treat as a nuisance (Roth, 2022), can be the economic finding.</w:t>
       </w:r>
     </w:p>
     <w:p>
@@ -291,7 +291,7 @@
       </w:pPr>
       <w:r>
         <w:rPr/>
-        <w:t>H1 (primary): The initiation of LSEG ESG coverage changes the log MTB ratio of scored firms relative to comparable never-scored firms. The recognition and preference channels predict a positive effect; the selection view predicts no effect after coverage and relative growth before it, as for firms added to an index after a period of growth (Chen et al., 2004).</w:t>
+        <w:t>H1 (primary): The initiation of LSEG ESG coverage changes the log MTB ratio of scored firms relative to comparable never-scored firms. The recognition and preference channels predict a positive effect; the selection view predicts no effect after coverage and relative growth before it.</w:t>
       </w:r>
     </w:p>
     <w:p>
@@ -398,7 +398,7 @@
       </w:pPr>
       <w:r>
         <w:rPr/>
-        <w:t>Dropping financial firms leaves 3,423 firms. A firm's treatment year, g, is its first fiscal year with an LSEG ESG score. Only 17 of the 675 scored firms have a later year without a score, so we treat coverage as permanent, the staggered-adoption setting of Callaway and Sant'Anna (2021). Excluding the 135 firms scored in 2014, which have no pre-coverage year, leaves a full firm-year grid of 3,288 firms and 36,168 firm-years: 675 firms first scored between 2015 and 2024 and 2,613 never-scored firms. A firm-year enters an estimate only if its outcome is observed in both the base year and the comparison year; MTB ratios at or below zero, which reflect negative book equity, are set to missing. Table S4 of the Supplemental Appendix reports firm-years by outcome, and Table S6 scored firms by event year. Of the 274 scored firms with a base-year MTB ratio in cohorts observed through event year 3, 271, or 98.9 percent, still have one in event year 3; the others leave through delisting or missing data. Never-scored firms are much smaller on average, and many trade thinly. The comparison of changes adjusted for size, country, and industry does not need similar levels, but it needs enough never-scored firms of comparable size; a check in Section 4.5 drops small control firms.</w:t>
+        <w:t>Dropping financial firms leaves 3,423 firms. A firm's treatment year, g, is its first fiscal year with an LSEG ESG score. Only 17 of the 675 scored firms have a later year without a score, so we treat coverage as permanent, the staggered-adoption setting of Callaway and Sant'Anna (2021). Excluding the 135 firms scored in 2014, which have no pre-coverage year, leaves a full firm-year grid of 3,288 firms and 36,168 firm-years: 675 firms first scored between 2015 and 2024 and 2,613 never-scored firms. A firm-year enters an estimate only if its outcome is observed in both the base year and the comparison year; MTB ratios at or below zero, which reflect negative book equity, are set to missing. Table S4 of the Supplemental Appendix reports firm-years by outcome, and Table S6 scored firms by event year. Of the 274 scored firms with a base-year MTB ratio in cohorts observed through event year 3, 271, or 98.9 percent, still have one in event year 3; the others have no MTB ratio in event year 3. Never-scored firms are much smaller on average, and many trade thinly. The comparison of changes adjusted for size, country, and industry does not need similar levels, but it needs enough never-scored firms of comparable size; a check in Section 4.5 drops small control firms.</w:t>
       </w:r>
     </w:p>
     <w:p>
@@ -1048,7 +1048,7 @@
       </w:r>
       <w:r>
         <w:rPr/>
-        <w:t xml:space="preserve"> contains country and industry indicators and log total assets and its square, measured in year g − 1. Because assumption (2) concerns changes in outcomes, the size differences in Table 1 do not violate it by themselves, but pre-coverage growth of the kind that precedes index additions would (Chen et al., 2004). We test this implication with the pre-coverage estimates but do not rely on the test alone.</w:t>
+        <w:t xml:space="preserve"> contains country and industry indicators and log total assets and its square, measured in year g − 1. Because assumption (2) concerns changes in outcomes, the size differences in Table 1 do not violate it by themselves, but a different growth path before coverage would. We test this implication with the pre-coverage estimates but do not rely on the test alone.</w:t>
       </w:r>
     </w:p>
     <w:p>
@@ -2156,7 +2156,7 @@
       </w:pPr>
       <w:r>
         <w:rPr/>
-        <w:t>Following Callaway and Sant'Anna (2021), we bootstrap the aggregated effects by resampling firms with their full time series. All specifications share the same 999 draws and fixed seed, so differences between specifications have a valid joint distribution. We report the bootstrap standard error, the percentile 95% confidence interval, and a normal-approximation two-sided p-value. The minimum detectable effect (MDE) at 80% power in a two-sided 5% test is</w:t>
+        <w:t>We bootstrap the aggregated effects by resampling firms with their full time series, a nonparametric alternative to the multiplier bootstrap of Callaway and Sant'Anna (2021). All specifications share the same 999 draws and fixed seed, so differences between specifications have a valid joint distribution. We report the bootstrap standard error, the percentile 95% confidence interval, and a normal-approximation two-sided p-value. The minimum detectable effect (MDE) at 80% power in a two-sided 5% test is</w:t>
       </w:r>
     </w:p>
     <w:p>
@@ -3523,7 +3523,7 @@
       </w:pPr>
       <w:r>
         <w:rPr/>
-        <w:t>Table 1 compares scored firms in the year before their first score with never-scored firm-years. Scored firms are much larger: their median market capitalization is 203.2 million U.S. dollars against 42.2 million, and their median total assets are 4.3 times as large, with normalized differences of 0.69 and 0.61. Their mean MTB ratio is 2.37 against 1.84, and the medians agree, while leverage barely differs (normalized difference −0.04). Return on assets is available for far fewer firm-years, so we use it only descriptively. These gaps fit a provider that covers large and visible firms (Section 2.2), and the MTB gap fits the pre-coverage growth in Section 5.3, as for firms added to an index (Chen et al., 2004). Size also matters for the scores themselves, because larger firms receive higher scores from this provider (Dobrick et al., 2023). We therefore compare changes and adjust for size, country, and industry in Eq. (3).</w:t>
+        <w:t>Table 1 compares scored firms in the year before their first score with never-scored firm-years. Scored firms are much larger: their median market capitalization is 203.2 million U.S. dollars against 42.2 million, and their median total assets are 4.3 times as large, with normalized differences of 0.69 and 0.61. Their mean MTB ratio is 2.37 against 1.84, and the medians agree, while leverage barely differs (normalized difference −0.04). Return on assets is available for far fewer firm-years, so we use it only descriptively. These gaps fit a provider that covers large and visible firms (Section 2.2), and the MTB gap fits the pre-coverage growth in Section 5.3. Size also matters for the scores themselves, because larger firms receive higher scores from this provider (Dobrick et al., 2023). We therefore compare changes and adjust for size, country, and industry in Eq. (3).</w:t>
       </w:r>
     </w:p>
     <w:p>
@@ -3548,7 +3548,7 @@
       </w:pPr>
       <w:r>
         <w:rPr/>
-        <w:t>Table 2 reports the headline estimates of Eq. (6). The effect on log MTB is 0.002, with a standard error of 0.024 and a 95% confidence interval from −0.046 to 0.048, which under assumption (2) excludes changes in the MTB ratio outside −4.5 to 4.9 percent. The minimum detectable effect from Eq. (7) is 0.067, about 7.0 percent, detected with 80% probability; the confidence interval, not the MDE, gives the effects compatible with the data, and it includes increases of a few percent. No outcome changes significantly at the 5% level once the secondary outcomes are Holm-adjusted: log market capitalization changes by −0.055 (p = 0.134), leverage by 0.8 percentage points (p = 0.134), and total assets by 0.044 log points (p = 0.053, against an unadjusted p = 0.018). Under assumption (2), the MTB estimate gives no sign of the positive effect that the recognition channel of Merton (1987) and the preference channel of Pástor et al. (2021) and Pedersen et al. (2021) predict, nor of a lasting valuation gain from the fund flows that Hartzmark and Sussman (2019) show respond to newly published sustainability ratings.</w:t>
+        <w:t>Table 2 reports the headline estimates of Eq. (6). The effect on log MTB is 0.002, with a standard error of 0.024 and a 95% confidence interval from −0.046 to 0.048, which under assumption (2) excludes changes in the MTB ratio outside −4.5 to 4.9 percent. The minimum detectable effect from Eq. (7) is 0.067, about 7.0 percent, detected with 80% probability; the confidence interval, not the MDE, gives the effects compatible with the data, and it includes increases of a few percent. No outcome changes significantly at the 5% level once the secondary outcomes are Holm-adjusted: log market capitalization changes by −0.055 (p = 0.134), leverage by 0.8 percentage points (p = 0.134), and total assets by 0.044 log points (p = 0.053, against an unadjusted p = 0.018). Under assumption (2), the MTB estimate gives no sign of the positive effect that the recognition channel of Merton (1987) and the preference channel of Pástor et al. (2021) and Pedersen et al. (2021) predict. Hartzmark and Sussman (2019) show that fund flows respond to newly published sustainability ratings; under assumption (2), we detect no lasting valuation gain from such demand, although the interval admits gains of up to 4.9 percent.</w:t>
       </w:r>
     </w:p>
     <w:p>
@@ -3573,7 +3573,7 @@
       </w:pPr>
       <w:r>
         <w:rPr/>
-        <w:t>Fig. 1 plots the event-time estimates of Eq. (5) for all four outcomes. Before the first score, the coefficients for market capitalization and MTB are negative and rise toward zero. In event years −5 and −4, four and three years before the base year, the MTB estimates are −0.095 and −0.082 (p = 0.015 and p = 0.015). Over these four years, scored firms' market capitalization grew 14.1 percent more than that of comparable firms, and their MTB ratio 10.0 percent more. This run-up resembles the growth that precedes additions to a major index (Chen et al., 2004; Harris &amp; Gurel, 1986; Shleifer, 1986), as the selection view in Section 2.2 predicts. The joint test of Eq. (8) rejects parallel pre-trends for market capitalization (p = 0.022) but not at the 5% level for MTB (p = 0.074); as Roth (2022) cautions, this non-rejection is not evidence that pre-trends are absent. Total assets follow a weaker version of the pattern, and leverage falls toward the base year (pre-trend p = 0.002).</w:t>
+        <w:t>Fig. 1 plots the event-time estimates of Eq. (5) for all four outcomes. Before the first score, the coefficients for market capitalization and MTB are negative and rise toward zero. In event years −5 and −4, four and three years before the base year, the MTB estimates are −0.095 and −0.082 (p = 0.015 and p = 0.015). Over these four years, scored firms' market capitalization grew 14.1 percent more than that of comparable firms, and their MTB ratio 10.0 percent more. This run-up is the pattern that the selection view in Section 2.2 predicts. The joint test of Eq. (8) rejects parallel pre-trends for market capitalization (p = 0.022) but not at the 5% level for MTB (p = 0.074); as Roth (2022) cautions, this non-rejection is not evidence that pre-trends are absent. Total assets follow a weaker version of the pattern, and leverage falls toward the base year (pre-trend p = 0.002).</w:t>
       </w:r>
     </w:p>
     <w:p>
@@ -3609,7 +3609,7 @@
       </w:pPr>
       <w:r>
         <w:rPr/>
-        <w:t>Table 3 reports the robustness checks; rows R1 to R6 were pre-specified, and rows R7 to R11 are exploratory. Row R10 dates coverage one year after the first scored fiscal year, when a score could first have been published; because scores were backfilled or revised (Berg et al., 2020; Sahin et al., 2023), this also moves the base year closer to the end of the run-up. The MTB effect is then −0.068, a decline of about −6.6 percent (95% interval −0.116 to −0.020; p = 0.004), estimated from 646 scored and 2,412 control firms. It assumes parallel trends from the first scored year, the year of peak valuation. Its joint pre-trend test gives p = 0.072, and with M̄ = 0.25 in Eq. (10) its robust interval, from −0.138 to 0.002, includes zero; the decline loses significance once M̄ reaches 0.23. If firms are selected at an unusually high valuation that later partly reverses, the decline measures the reversal and can hide an offsetting positive coverage effect; if valuations would otherwise have stayed at their peak, coverage lowered them. The data cannot separate the two readings.</w:t>
+        <w:t>Table 3 reports the robustness checks; rows R1 to R6 were pre-specified, and rows R7 to R11 are exploratory. Row R10 dates coverage one year after the first scored fiscal year, when a score could first have been published; because scores were backfilled or revised (Berg et al., 2020; Sahin et al., 2023), this also moves the base year closer to the end of the run-up. The MTB effect is then −0.068, a change of about −6.6 percent (95% interval −0.116 to −0.020; p = 0.004), estimated from 646 scored and 2,412 control firms. It assumes parallel trends from the first scored year, the year of peak valuation. Its joint pre-trend test gives p = 0.072, and with M̄ = 0.25 in Eq. (10) its robust interval, from −0.138 to 0.002, includes zero; the decline loses significance once M̄ reaches 0.23. If firms are selected at an unusually high valuation that later partly reverses, the decline measures the reversal and can hide an offsetting positive coverage effect; if valuations would otherwise have stayed at their peak, coverage lowered them. The data cannot separate the two readings.</w:t>
       </w:r>
     </w:p>
     <w:p>
@@ -3631,7 +3631,7 @@
       </w:pPr>
       <w:r>
         <w:rPr/>
-        <w:t>Table S5 of the Supplemental Appendix reports the bounds of Eq. (10), which follow the relative-magnitudes logic of Rambachan and Roth (2023). With a largest change of 0.046 between consecutive pre-coverage MTB estimates, the robust interval for the MTB effect is −0.071 to 0.073 with M̄ = 0.25 and widens to −0.147 to 0.148 with M̄ = 1. Every interval includes zero and admits moderate effects in either direction. The upper limit of the unadjusted interval lies just below a 5 percent increase in the MTB ratio (0.049 log points): any departure with M̄ of 0.01 or more admits an increase of 5 percent, and any departure at all admits a positive effect. The post-coverage null and the absence of a positive effect are therefore both conditional on assumption (2).</w:t>
+        <w:t>Table S5 of the Supplemental Appendix reports the bounds of Eq. (10), which follow the relative-magnitudes logic of Rambachan and Roth (2023). With a largest change of 0.046 between consecutive pre-coverage MTB estimates, the robust interval for the MTB effect is −0.071 to 0.073 with M̄ = 0.25 and widens to −0.147 to 0.148 with M̄ = 1. Every interval includes zero and admits moderate effects in either direction. The upper limit of the unadjusted interval lies just below a 5 percent increase in the MTB ratio (0.049 log points): any departure with M̄ above about 0.01 admits an increase of 5 percent, and any departure at all admits a positive effect. The post-coverage null and the absence of a detected positive effect are therefore both conditional on assumption (2).</w:t>
       </w:r>
     </w:p>
     <w:p>
@@ -3714,7 +3714,7 @@
       </w:pPr>
       <w:r>
         <w:rPr/>
-        <w:t>Under assumption (2), the largest increase compatible with the headline interval is of the same order as the announcement return of 4.86 percent that Demiroglu and Ryngaert (2010) report for the first analyst coverage of neglected stocks, and it exceeds the increase of more than 3 percent that Harris and Gurel (1986) report for additions to the S&amp;P 500, most of which reversed within about two weeks. Annual year-end ratios would miss such short-lived effects, so our estimates concern lasting revaluation of the kind a permanent rise in investor recognition would produce (Chen et al., 2004; Merton, 1987). Under the same assumption, a lasting effect half as large as the MTB run-up in Section 5.3 would lie just outside the headline interval, so any such effect is small relative to the growth that precedes coverage.</w:t>
+        <w:t>Under assumption (2), the largest increase compatible with the headline interval is of the same order as the announcement return of 4.86 percent that Demiroglu and Ryngaert (2010) report for the first analyst coverage of neglected stocks, and it exceeds the increase of more than 3 percent that Harris and Gurel (1986) report for additions to the S&amp;P 500, most of which reversed within about two weeks. Annual year-end ratios would miss such short-lived effects, so our estimates concern lasting revaluation of the kind a permanent rise in investor recognition would produce (Chen et al., 2004; Merton, 1987). Under the same assumption, a lasting effect half as large as the MTB run-up in Section 5.3 would lie at the upper end of the headline interval, so any such effect is small relative to the growth that precedes coverage.</w:t>
       </w:r>
     </w:p>
     <w:p>
@@ -3763,7 +3763,7 @@
       </w:pPr>
       <w:r>
         <w:rPr/>
-        <w:t>Three results bear on reversal. First, dating coverage one year later yields an MTB decline after the first scored year, which a reversal would produce and a positive coverage effect could partly offset; the estimate cannot separate the two. Second, against never-scored firms with similar pre-coverage growth, the MTB effect is small and insignificant, but this comparison conditions on a single growth measure, and its interval admits gains of several percent. Third, the bounds in Section 5.4 include zero for every M̄ we consider but also effects of several percent in both directions. The evidence therefore does not show that coverage has no effect: no specification detects a valuation gain, and the bounds do not exclude one. The clearest result is the ordering of events: the first scored fiscal year follows relative growth and coincides with a valuation peak.</w:t>
+        <w:t>Three results bear on reversal. First, dating coverage one year later yields an MTB decline after the first scored year, which a reversal would produce and a positive coverage effect could partly offset; the estimate cannot separate the two. Second, against never-scored firms with similar pre-coverage growth, the MTB effect is small and insignificant, but this comparison conditions on a single growth measure, and its interval admits gains of several percent. Third, the bounds in Section 5.4 include zero for every M̄ we consider but also effects of several percent in both directions. The evidence therefore does not show that coverage has no effect: no heterogeneity-robust specification detects a valuation gain, and the bounds do not exclude one. The clearest result is the ordering of events: the first scored fiscal year follows relative growth and coincides with a valuation peak.</w:t>
       </w:r>
     </w:p>
     <w:p>
@@ -3799,7 +3799,7 @@
       </w:pPr>
       <w:r>
         <w:rPr/>
-        <w:t>Sell-side evidence suggests why a first ESG score might move prices: losing coverage lowers prices (Kelly &amp; Ljungqvist, 2012), a favorable first report on a neglected stock raises them (Demiroglu &amp; Ryngaert, 2010), and Hartzmark and Sussman (2019) document a demand channel through fund flows. Two features may explain the absence of a gain. ESG scores rarely carry cash-flow news and arrive after the firm's own disclosures. Our firms were also large and visible before coverage (Table 1), and some had FTSE Russell scores, leaving less room for the recognition channel of Merton (1987); foreign-ownership limits in these markets could further mute recognition through foreign ESG investors. Without data on ownership, investor attention, foreign holdings, or these limits, we cannot test either explanation.</w:t>
+        <w:t>Sell-side evidence suggests why a first ESG score might move prices: losing coverage lowers prices (Kelly &amp; Ljungqvist, 2012), a favorable first report on a neglected stock raises them (Demiroglu &amp; Ryngaert, 2010), and Hartzmark and Sussman (2019) document a demand channel through fund flows. Two features may explain the absence of a gain. ESG scores rarely carry cash-flow news and arrive after the firm's own disclosures. Our firms were also large and visible before coverage (Table 1), and some may have had FTSE Russell scores, leaving less room for the recognition channel of Merton (1987); foreign-ownership limits in these markets could further mute recognition through foreign ESG investors. Without data on ownership, investor attention, foreign holdings, or these limits, we cannot test either explanation.</w:t>
       </w:r>
     </w:p>
     <w:p>
@@ -3835,7 +3835,7 @@
       </w:pPr>
       <w:r>
         <w:rPr/>
-        <w:t>The main implication is methodological. A cross-sectional valuation premium of rated firms, or a static two-way fixed effects estimate, can reflect selection into coverage rather than an effect of ratings. Here the static regression attributes an MTB increase of 6.6 percent to coverage, whereas the heterogeneity-robust estimator and its event-time profile trace the gap to pre-coverage growth (Callaway &amp; Sant'Anna, 2021; Roth, 2022). Studies comparing rated and unrated firms in these markets should model coverage timing and report pre-coverage dynamics.</w:t>
+        <w:t>The main implication is methodological. A cross-sectional valuation premium of rated firms, or a static two-way fixed effects estimate, can reflect selection into coverage rather than an effect of ratings. Here the static regression attributes an MTB increase of 6.6 percent to coverage, whereas the heterogeneity-robust estimator and its event-time profile trace most of the gap to pre-coverage growth, with the covariates and event window accounting for the rest (Section 5.5; Callaway &amp; Sant'Anna, 2021; Roth, 2022). Studies comparing rated and unrated firms in these markets should model coverage timing and report pre-coverage dynamics.</w:t>
       </w:r>
     </w:p>
     <w:p>
@@ -4237,7 +4237,7 @@
       </w:r>
       <w:r>
         <w:rPr/>
-        <w:t>, Article 104014.</w:t>
+        <w:t>, Article 104014. https://doi.org/10.1016/j.frl.2023.104014</w:t>
       </w:r>
     </w:p>
     <w:p>
@@ -4697,7 +4697,7 @@
       </w:r>
       <w:r>
         <w:rPr/>
-        <w:t xml:space="preserve"> (applicable to financial years ending on or after 31 December 2017). https://rulebook.sgx.com/rulebook/711a</w:t>
+        <w:t xml:space="preserve"> (introduced in 2016 and applicable to financial years ending on or after 31 December 2017; the linked page shows the current, amended text). https://rulebook.sgx.com/rulebook/711a</w:t>
       </w:r>
     </w:p>
     <w:p>
@@ -8375,7 +8375,7 @@
         <w:rPr>
           <w:sz w:val="20"/>
         </w:rPr>
-        <w:t>Cells show the average effect over event years 0 to 3, with bootstrap standard errors in parentheses (firm-clustered in R6); R1 to R6 are pre-specified and R7 to R11 exploratory. *, **, and *** denote significance at 10%, 5%, and 1% (unadjusted p-values).</w:t>
+        <w:t>Cells show the average effect over event years 0 to 3 (0 to 2 in R5; the Eq. (11) coefficient in R6), with bootstrap standard errors in parentheses (firm-clustered in R6); R1 to R6 are pre-specified and R7 to R11 exploratory. *, **, and *** denote significance at 10%, 5%, and 1% (unadjusted p-values).</w:t>
       </w:r>
     </w:p>
     <w:p>

</xml_diff>

<commit_message>
Finalize JF:IP submission package; remove original-paper files
- Shorten Section 4.6 (AI disclosure stays in Methods per JF:IP); remove companion-study passage
- Hypothesis labels as subscripts (H1-H3); APA 7 reference check (italic journal/volume, official titles)
- Fix OOXML schema-order issues in generated docx; all files pass validation
- Rewrite stale cover letter; build submission/JFIP_submission (00-09) with Vietnamese checklist
- Delete original ESG2 paper materials, intermediate drafts, lock files and .DS_Store

Co-Authored-By: Claude Opus 5.5 <noreply@anthropic.com>
Claude-Session: https://claude.ai/code/session_01DV1FpN7pyDPdia8AQncgwU
</commit_message>
<xml_diff>
--- a/manuscript/Manuscript_Anonymized.docx
+++ b/manuscript/Manuscript_Anonymized.docx
@@ -291,7 +291,17 @@
       </w:pPr>
       <w:r>
         <w:rPr/>
-        <w:t>H1 (primary): The initiation of LSEG ESG coverage changes the log MTB ratio of scored firms relative to comparable never-scored firms. The recognition and preference channels predict a positive effect; the selection view predicts no effect after coverage and relative growth before it.</w:t>
+        <w:t>H</w:t>
+      </w:r>
+      <w:r>
+        <w:rPr>
+          <w:vertAlign w:val="subscript"/>
+        </w:rPr>
+        <w:t>1</w:t>
+      </w:r>
+      <w:r>
+        <w:rPr/>
+        <w:t xml:space="preserve"> (primary): The initiation of LSEG ESG coverage changes the log MTB ratio of scored firms relative to comparable never-scored firms. The recognition and preference channels predict a positive effect; the selection view predicts no effect after coverage and relative growth before it.</w:t>
       </w:r>
     </w:p>
     <w:p>
@@ -302,7 +312,17 @@
       </w:pPr>
       <w:r>
         <w:rPr/>
-        <w:t>H2 (secondary): Coverage changes log market capitalization, book leverage, and log total assets.</w:t>
+        <w:t>H</w:t>
+      </w:r>
+      <w:r>
+        <w:rPr>
+          <w:vertAlign w:val="subscript"/>
+        </w:rPr>
+        <w:t>2</w:t>
+      </w:r>
+      <w:r>
+        <w:rPr/>
+        <w:t xml:space="preserve"> (secondary): Coverage changes log market capitalization, book leverage, and log total assets.</w:t>
       </w:r>
     </w:p>
     <w:p>
@@ -313,7 +333,17 @@
       </w:pPr>
       <w:r>
         <w:rPr/>
-        <w:t>H3 (heterogeneity): The effect on log MTB differs between firms with initial scores above and below their cohort median, as the preference channel and the evidence on favorable first coverage suggest.</w:t>
+        <w:t>H</w:t>
+      </w:r>
+      <w:r>
+        <w:rPr>
+          <w:vertAlign w:val="subscript"/>
+        </w:rPr>
+        <w:t>3</w:t>
+      </w:r>
+      <w:r>
+        <w:rPr/>
+        <w:t xml:space="preserve"> (heterogeneity): The effect on log MTB differs between firms with initial scores above and below their cohort median, as the preference channel and the evidence on favorable first coverage suggest.</w:t>
       </w:r>
     </w:p>
     <w:p>
@@ -387,7 +417,7 @@
       </w:pPr>
       <w:r>
         <w:rPr/>
-        <w:t>The data cover all 3,709 firms listed in the five markets from 2014 to 2024, or 40,799 firm-years, and combine the annual LSEG ESG score (LSEG, 2025) with accounting and market data from Compustat Global (S&amp;P Global Market Intelligence, 2025). We use the ESG score, not the controversy-adjusted combined score. The files do not record the download date, so the vintage of recent, revisable scores is unknown. This data set also underlies a companion study with a different research question (details withheld for anonymous review). That study uses only firm-years with ESG and governance data and asks how reporting standards and board structure relate to the gap between ESG scores and controversy scores. The present paper uses the full listed universe, treats the first appearance of an ESG score as an event, and studies market valuation and financing. No outcome or treatment variable, estimate, table, or figure is shared between the two papers.</w:t>
+        <w:t>The data cover all 3,709 firms listed in the five markets from 2014 to 2024, or 40,799 firm-years, and combine the annual LSEG ESG score (LSEG, 2025) with accounting and market data from Compustat Global (S&amp;P Global Market Intelligence, 2025). We use the ESG score, not the controversy-adjusted combined score. The files do not record the download date, so the vintage of recent, revisable scores is unknown.</w:t>
       </w:r>
     </w:p>
     <w:p>
@@ -538,8 +568,8 @@
         <m:d>
           <m:dPr>
             <m:begChr m:val="("/>
+            <m:sepChr m:val=""/>
             <m:endChr m:val=")"/>
-            <m:sepChr m:val=""/>
             <m:grow/>
           </m:dPr>
           <m:e>
@@ -565,16 +595,16 @@
         </m:r>
         <m:r>
           <m:rPr>
+            <m:scr m:val="double-struck"/>
             <m:sty m:val="p"/>
-            <m:scr m:val="double-struck"/>
           </m:rPr>
           <m:t>E</m:t>
         </m:r>
         <m:d>
           <m:dPr>
             <m:begChr m:val="["/>
+            <m:sepChr m:val=""/>
             <m:endChr m:val="]"/>
-            <m:sepChr m:val=""/>
             <m:grow/>
           </m:dPr>
           <m:e>
@@ -602,8 +632,8 @@
             <m:d>
               <m:dPr>
                 <m:begChr m:val="("/>
+                <m:sepChr m:val=""/>
                 <m:endChr m:val=")"/>
-                <m:sepChr m:val=""/>
                 <m:grow/>
               </m:dPr>
               <m:e>
@@ -642,8 +672,8 @@
             <m:d>
               <m:dPr>
                 <m:begChr m:val="("/>
+                <m:sepChr m:val=""/>
                 <m:endChr m:val=")"/>
-                <m:sepChr m:val=""/>
                 <m:grow/>
               </m:dPr>
               <m:e>
@@ -715,16 +745,16 @@
       <m:oMath>
         <m:r>
           <m:rPr>
+            <m:scr m:val="double-struck"/>
             <m:sty m:val="p"/>
-            <m:scr m:val="double-struck"/>
           </m:rPr>
           <m:t>E</m:t>
         </m:r>
         <m:d>
           <m:dPr>
             <m:begChr m:val="["/>
+            <m:sepChr m:val=""/>
             <m:endChr m:val="]"/>
-            <m:sepChr m:val=""/>
             <m:grow/>
           </m:dPr>
           <m:e>
@@ -752,8 +782,8 @@
             <m:d>
               <m:dPr>
                 <m:begChr m:val="("/>
+                <m:sepChr m:val=""/>
                 <m:endChr m:val=")"/>
-                <m:sepChr m:val=""/>
                 <m:grow/>
               </m:dPr>
               <m:e>
@@ -804,8 +834,8 @@
             <m:d>
               <m:dPr>
                 <m:begChr m:val="("/>
+                <m:sepChr m:val=""/>
                 <m:endChr m:val=")"/>
-                <m:sepChr m:val=""/>
                 <m:grow/>
               </m:dPr>
               <m:e>
@@ -872,16 +902,16 @@
         </m:r>
         <m:r>
           <m:rPr>
+            <m:scr m:val="double-struck"/>
             <m:sty m:val="p"/>
-            <m:scr m:val="double-struck"/>
           </m:rPr>
           <m:t>E</m:t>
         </m:r>
         <m:d>
           <m:dPr>
             <m:begChr m:val="["/>
+            <m:sepChr m:val=""/>
             <m:endChr m:val="]"/>
-            <m:sepChr m:val=""/>
             <m:grow/>
           </m:dPr>
           <m:e>
@@ -909,8 +939,8 @@
             <m:d>
               <m:dPr>
                 <m:begChr m:val="("/>
+                <m:sepChr m:val=""/>
                 <m:endChr m:val=")"/>
-                <m:sepChr m:val=""/>
                 <m:grow/>
               </m:dPr>
               <m:e>
@@ -961,8 +991,8 @@
             <m:d>
               <m:dPr>
                 <m:begChr m:val="("/>
+                <m:sepChr m:val=""/>
                 <m:endChr m:val=")"/>
-                <m:sepChr m:val=""/>
                 <m:grow/>
               </m:dPr>
               <m:e>
@@ -1334,8 +1364,8 @@
         <m:d>
           <m:dPr>
             <m:begChr m:val="("/>
+            <m:sepChr m:val=""/>
             <m:endChr m:val=")"/>
-            <m:sepChr m:val=""/>
             <m:grow/>
           </m:dPr>
           <m:e>
@@ -1443,8 +1473,8 @@
             <m:d>
               <m:dPr>
                 <m:begChr m:val="("/>
+                <m:sepChr m:val=""/>
                 <m:endChr m:val=")"/>
-                <m:sepChr m:val=""/>
                 <m:grow/>
               </m:dPr>
               <m:e>
@@ -1590,8 +1620,8 @@
         <m:d>
           <m:dPr>
             <m:begChr m:val="("/>
+            <m:sepChr m:val=""/>
             <m:endChr m:val=")"/>
-            <m:sepChr m:val=""/>
             <m:grow/>
           </m:dPr>
           <m:e>
@@ -1746,8 +1776,8 @@
         <m:d>
           <m:dPr>
             <m:begChr m:val="("/>
+            <m:sepChr m:val=""/>
             <m:endChr m:val=")"/>
-            <m:sepChr m:val=""/>
             <m:grow/>
           </m:dPr>
           <m:e>
@@ -1865,8 +1895,8 @@
                 <m:d>
                   <m:dPr>
                     <m:begChr m:val="("/>
+                    <m:sepChr m:val=""/>
                     <m:endChr m:val=")"/>
-                    <m:sepChr m:val=""/>
                     <m:grow/>
                   </m:dPr>
                   <m:e>
@@ -1984,8 +2014,8 @@
             <m:d>
               <m:dPr>
                 <m:begChr m:val="("/>
+                <m:sepChr m:val=""/>
                 <m:endChr m:val=")"/>
-                <m:sepChr m:val=""/>
                 <m:grow/>
               </m:dPr>
               <m:e>
@@ -2016,8 +2046,8 @@
                 <m:d>
                   <m:dPr>
                     <m:begChr m:val="("/>
+                    <m:sepChr m:val=""/>
                     <m:endChr m:val=")"/>
-                    <m:sepChr m:val=""/>
                     <m:grow/>
                   </m:dPr>
                   <m:e>
@@ -2198,8 +2228,8 @@
         <m:d>
           <m:dPr>
             <m:begChr m:val="("/>
+            <m:sepChr m:val=""/>
             <m:endChr m:val=")"/>
-            <m:sepChr m:val=""/>
             <m:grow/>
           </m:dPr>
           <m:e>
@@ -2648,8 +2678,8 @@
                 <m:d>
                   <m:dPr>
                     <m:begChr m:val="("/>
+                    <m:sepChr m:val=""/>
                     <m:endChr m:val=")"/>
-                    <m:sepChr m:val=""/>
                     <m:grow/>
                   </m:dPr>
                   <m:e>
@@ -2685,8 +2715,8 @@
             <m:d>
               <m:dPr>
                 <m:begChr m:val="("/>
+                <m:sepChr m:val=""/>
                 <m:endChr m:val=")"/>
-                <m:sepChr m:val=""/>
                 <m:grow/>
               </m:dPr>
               <m:e>
@@ -2741,8 +2771,8 @@
                     <m:d>
                       <m:dPr>
                         <m:begChr m:val="("/>
+                        <m:sepChr m:val=""/>
                         <m:endChr m:val=")"/>
-                        <m:sepChr m:val=""/>
                         <m:grow/>
                       </m:dPr>
                       <m:e>
@@ -2793,8 +2823,8 @@
         <m:d>
           <m:dPr>
             <m:begChr m:val="("/>
+            <m:sepChr m:val=""/>
             <m:endChr m:val=")"/>
-            <m:sepChr m:val=""/>
             <m:grow/>
           </m:dPr>
           <m:e>
@@ -2822,8 +2852,8 @@
         <m:d>
           <m:dPr>
             <m:begChr m:val="("/>
+            <m:sepChr m:val=""/>
             <m:endChr m:val=")"/>
-            <m:sepChr m:val=""/>
             <m:grow/>
           </m:dPr>
           <m:e>
@@ -2854,8 +2884,8 @@
         <m:d>
           <m:dPr>
             <m:begChr m:val="("/>
+            <m:sepChr m:val=""/>
             <m:endChr m:val=")"/>
-            <m:sepChr m:val=""/>
             <m:grow/>
           </m:dPr>
           <m:e>
@@ -2905,8 +2935,8 @@
         <m:d>
           <m:dPr>
             <m:begChr m:val="|"/>
+            <m:sepChr m:val=""/>
             <m:endChr m:val="|"/>
-            <m:sepChr m:val=""/>
             <m:grow/>
           </m:dPr>
           <m:e>
@@ -2916,8 +2946,8 @@
             <m:d>
               <m:dPr>
                 <m:begChr m:val="("/>
+                <m:sepChr m:val=""/>
                 <m:endChr m:val=")"/>
-                <m:sepChr m:val=""/>
                 <m:grow/>
               </m:dPr>
               <m:e>
@@ -2938,8 +2968,8 @@
             <m:d>
               <m:dPr>
                 <m:begChr m:val="("/>
+                <m:sepChr m:val=""/>
                 <m:endChr m:val=")"/>
-                <m:sepChr m:val=""/>
                 <m:grow/>
               </m:dPr>
               <m:e>
@@ -3011,8 +3041,8 @@
         <m:d>
           <m:dPr>
             <m:begChr m:val="|"/>
+            <m:sepChr m:val=""/>
             <m:endChr m:val="|"/>
-            <m:sepChr m:val=""/>
             <m:grow/>
           </m:dPr>
           <m:e>
@@ -3029,8 +3059,8 @@
             <m:d>
               <m:dPr>
                 <m:begChr m:val="("/>
+                <m:sepChr m:val=""/>
                 <m:endChr m:val=")"/>
-                <m:sepChr m:val=""/>
                 <m:grow/>
               </m:dPr>
               <m:e>
@@ -3058,8 +3088,8 @@
             <m:d>
               <m:dPr>
                 <m:begChr m:val="("/>
+                <m:sepChr m:val=""/>
                 <m:endChr m:val=")"/>
-                <m:sepChr m:val=""/>
                 <m:grow/>
               </m:dPr>
               <m:e>
@@ -3116,8 +3146,8 @@
         <m:d>
           <m:dPr>
             <m:begChr m:val="("/>
+            <m:sepChr m:val=""/>
             <m:endChr m:val=")"/>
-            <m:sepChr m:val=""/>
             <m:grow/>
           </m:dPr>
           <m:e>
@@ -3367,8 +3397,8 @@
         <m:d>
           <m:dPr>
             <m:begChr m:val="["/>
+            <m:sepChr m:val=""/>
             <m:endChr m:val="]"/>
-            <m:sepChr m:val=""/>
             <m:grow/>
           </m:dPr>
           <m:e>
@@ -3485,7 +3515,7 @@
       </w:pPr>
       <w:r>
         <w:rPr/>
-        <w:t>The authors used Claude (Anthropic) through Claude Code in September 2026 to screen candidate research questions, draft the pre-analysis plan, write and debug the R code, draft and edit the text, and search for and check references. Five instances of the tool, each in a separate context, also produced simulated referee reports that informed the revision. The authors reviewed and approved the research question and the pre-analysis plan before any estimation, reviewed every output of the tool, checked each reported number against the R output files, and take full responsibility for the content.</w:t>
+        <w:t>We used Claude (Anthropic), through Claude Code, in September 2026 to screen research questions, draft the pre-analysis plan, write the R code, edit the text, check references, and simulate referee reports. We reviewed every output, checked each number against the R output files, and take full responsibility for the content.</w:t>
       </w:r>
     </w:p>
     <w:p>
@@ -4133,7 +4163,7 @@
         <w:rPr>
           <w:i/>
         </w:rPr>
-        <w:t>Journal of Finance</w:t>
+        <w:t>The Journal of Finance</w:t>
       </w:r>
       <w:r>
         <w:rPr/>
@@ -4313,7 +4343,7 @@
         <w:rPr>
           <w:i/>
         </w:rPr>
-        <w:t>Journal of Finance</w:t>
+        <w:t>The Journal of Finance</w:t>
       </w:r>
       <w:r>
         <w:rPr/>
@@ -4343,7 +4373,7 @@
         <w:rPr>
           <w:i/>
         </w:rPr>
-        <w:t>Journal of Finance</w:t>
+        <w:t>The Journal of Finance</w:t>
       </w:r>
       <w:r>
         <w:rPr/>
@@ -4373,7 +4403,7 @@
         <w:rPr>
           <w:i/>
         </w:rPr>
-        <w:t>Review of Financial Studies</w:t>
+        <w:t>The Review of Financial Studies</w:t>
       </w:r>
       <w:r>
         <w:rPr/>
@@ -4453,7 +4483,7 @@
         <w:rPr>
           <w:i/>
         </w:rPr>
-        <w:t>Journal of Finance</w:t>
+        <w:t>The Journal of Finance</w:t>
       </w:r>
       <w:r>
         <w:rPr/>
@@ -4543,7 +4573,7 @@
         <w:rPr>
           <w:i/>
         </w:rPr>
-        <w:t>Review of Economic Studies</w:t>
+        <w:t>The Review of Economic Studies</w:t>
       </w:r>
       <w:r>
         <w:rPr/>
@@ -4663,7 +4693,7 @@
         <w:rPr>
           <w:i/>
         </w:rPr>
-        <w:t>Journal of Finance</w:t>
+        <w:t>The Journal of Finance</w:t>
       </w:r>
       <w:r>
         <w:rPr/>
@@ -4697,7 +4727,7 @@
       </w:r>
       <w:r>
         <w:rPr/>
-        <w:t xml:space="preserve"> (introduced in 2016 and applicable to financial years ending on or after 31 December 2017; the linked page shows the current, amended text). https://rulebook.sgx.com/rulebook/711a</w:t>
+        <w:t xml:space="preserve"> [Listing rules]. SGX Rulebook. https://rulebook.sgx.com/rulebook/711a</w:t>
       </w:r>
     </w:p>
     <w:p>
@@ -4808,14 +4838,13 @@
         <w:tblW w:type="auto" w:w="0"/>
         <w:jc w:val="center"/>
         <w:tblLayout w:type="fixed"/>
-        <w:tblLook w:firstColumn="1" w:firstRow="1" w:lastColumn="0" w:lastRow="0" w:noHBand="0" w:noVBand="1" w:val="04A0"/>
         <w:tblCellMar>
           <w:top w:w="40" w:type="dxa"/>
+          <w:left w:w="85" w:type="dxa"/>
           <w:bottom w:w="40" w:type="dxa"/>
-          <w:left w:w="85" w:type="dxa"/>
           <w:right w:w="85" w:type="dxa"/>
         </w:tblCellMar>
-        <w:tblLayout w:type="fixed"/>
+        <w:tblLook w:firstColumn="1" w:firstRow="1" w:lastColumn="0" w:lastRow="0" w:noHBand="0" w:noVBand="1" w:val="04A0"/>
       </w:tblPr>
       <w:tblGrid>
         <w:gridCol w:w="2448"/>
@@ -5812,14 +5841,13 @@
         <w:tblW w:type="auto" w:w="0"/>
         <w:jc w:val="center"/>
         <w:tblLayout w:type="fixed"/>
-        <w:tblLook w:firstColumn="1" w:firstRow="1" w:lastColumn="0" w:lastRow="0" w:noHBand="0" w:noVBand="1" w:val="04A0"/>
         <w:tblCellMar>
           <w:top w:w="40" w:type="dxa"/>
+          <w:left w:w="85" w:type="dxa"/>
           <w:bottom w:w="40" w:type="dxa"/>
-          <w:left w:w="85" w:type="dxa"/>
           <w:right w:w="85" w:type="dxa"/>
         </w:tblCellMar>
-        <w:tblLayout w:type="fixed"/>
+        <w:tblLook w:firstColumn="1" w:firstRow="1" w:lastColumn="0" w:lastRow="0" w:noHBand="0" w:noVBand="1" w:val="04A0"/>
       </w:tblPr>
       <w:tblGrid>
         <w:gridCol w:w="2232"/>
@@ -6854,14 +6882,13 @@
         <w:tblW w:type="auto" w:w="0"/>
         <w:jc w:val="center"/>
         <w:tblLayout w:type="fixed"/>
-        <w:tblLook w:firstColumn="1" w:firstRow="1" w:lastColumn="0" w:lastRow="0" w:noHBand="0" w:noVBand="1" w:val="04A0"/>
         <w:tblCellMar>
           <w:top w:w="40" w:type="dxa"/>
+          <w:left w:w="85" w:type="dxa"/>
           <w:bottom w:w="40" w:type="dxa"/>
-          <w:left w:w="85" w:type="dxa"/>
           <w:right w:w="85" w:type="dxa"/>
         </w:tblCellMar>
-        <w:tblLayout w:type="fixed"/>
+        <w:tblLook w:firstColumn="1" w:firstRow="1" w:lastColumn="0" w:lastRow="0" w:noHBand="0" w:noVBand="1" w:val="04A0"/>
       </w:tblPr>
       <w:tblGrid>
         <w:gridCol w:w="2736"/>

</xml_diff>

<commit_message>
Stage 4' edits: remove wholesale/selective framing, bound exchange implication, H3 and R10 in abstract, terminology, limitations
Co-Authored-By: Claude Opus 5.5 <noreply@anthropic.com>
Claude-Session: https://claude.ai/code/session_01H8HDPH7cZ4HRFFk99Dk3WW
</commit_message>
<xml_diff>
--- a/manuscript/Manuscript_Anonymized.docx
+++ b/manuscript/Manuscript_Anonymized.docx
@@ -45,7 +45,7 @@
       </w:pPr>
       <w:r>
         <w:rPr/>
-        <w:t>Most listed firms in Southeast Asia have no environmental, social, and governance (ESG) score, so they sit outside the universe that ESG-screened investors can hold. Using the staggered entry of 675 non-financial firms into London Stock Exchange Group (LSEG) ESG coverage, we find that firms entering through selective coverage had outgrown comparable unscored firms beforehand, while a wholesale Malaysian expansion shows no such run-up. Under parallel trends, market-to-book ratios did not rise after the first score (estimate 0.002; 95% interval −0.046 to 0.048), whatever the level of the score.</w:t>
+        <w:t>Most listed firms in Southeast Asia have no environmental, social, and governance (ESG) score, so they sit outside the universe that ESG-screened investors can hold. Following 675 non-financial firms that entered London Stock Exchange Group (LSEG) ESG coverage, we find that their market-to-book (MTB) ratio grew 10.0 percent more than that of never-scored firms beforehand, a run-up absent in a large Malaysian wave. Under parallel trends, we detect no MTB gain after the first score (estimate 0.002; 95% interval −0.046 to 0.048) for high- or low-score firms.</w:t>
       </w:r>
     </w:p>
     <w:p>
@@ -104,7 +104,7 @@
       </w:pPr>
       <w:r>
         <w:rPr/>
-        <w:t>Environmental, social, and governance (ESG) scores decide which firms ESG-screened investors can hold. A fund restricted to scored stocks, an index built from scored constituents, or a mandate with a minimum score cannot buy a firm that no provider covers. In the five largest Southeast Asian equity markets, most listed firms had no score from London Stock Exchange Group (LSEG), one of the most widely used providers in research and practice, at any point between 2014 and 2024. Entry into the scored universe is therefore an event in its own right, and it raises two questions for sustainable finance: which firms get scored, and does entering the scored universe change how the market values them?</w:t>
+        <w:t>Environmental, social, and governance (ESG) scores decide which firms ESG-screened investors can hold. A fund restricted to scored stocks, an index built from scored constituents, or a mandate with a minimum score cannot buy a firm that no provider covers. In five Southeast Asian equity markets, most listed firms had no score from London Stock Exchange Group (LSEG), a provider whose scores are used in much of the academic literature on ESG ratings (Berg, Kölbel, et al., 2022; Dobrick et al., 2023), at any point between 2014 and 2024. Entry into the scored universe is therefore an event in its own right, and it raises two questions for sustainable finance: which firms get scored, and does entering the scored universe change how the market values them?</w:t>
       </w:r>
     </w:p>
     <w:p>
@@ -115,7 +115,7 @@
       </w:pPr>
       <w:r>
         <w:rPr/>
-        <w:t>Theory gives no single answer to the second question. Under investor recognition, a first score makes a firm visible to investors who screen on ESG data, and a broader investor base raises its price (Merton, 1987). Under ESG preferences, investors pay more for assets they can classify as sustainable and less for those they cannot (Pástor et al., 2021; Pedersen et al., 2021), so a first score should raise the value of firms revealed as green and lower the value of firms revealed as brown. Evidence on ESG certification events is mixed: additions to the Dow Jones Sustainability Index have little price effect once comparable firms are used as benchmarks (Durand et al., 2019; Hawn et al., 2018), whereas downgrades of existing ratings are followed by negative abnormal returns and upgrades by weaker positive ones (Berg, Heeb, et al., 2022; Shanaev &amp; Ghimire, 2022). Fund investors respond to sustainability ratings when these are new and salient (Hartzmark &amp; Sussman, 2019).</w:t>
+        <w:t>Theory gives no single answer to the second question. Under investor recognition, a first score makes a firm visible to investors who screen on ESG data, and a broader investor base raises its price (Merton, 1987). Under ESG preferences, investors pay more for green assets and less for brown ones (Pástor et al., 2021; Pedersen et al., 2021), so a first score should raise the value of firms it reveals as green and lower the value of firms it reveals as brown. Evidence on ESG certification events is mixed: additions to the Dow Jones Sustainability Index have little price effect once comparable firms are used as benchmarks (Durand et al., 2019; Hawn et al., 2018), whereas downgrades of existing ratings are followed by negative abnormal returns and upgrades by weaker positive ones (Berg, Heeb, et al., 2022; Shanaev &amp; Ghimire, 2022). Fund investors respond to sustainability ratings when these are new and salient (Hartzmark &amp; Sussman, 2019).</w:t>
       </w:r>
     </w:p>
     <w:p>
@@ -148,7 +148,7 @@
       </w:pPr>
       <w:r>
         <w:rPr/>
-        <w:t>The evidence has four parts. First, scored firms had outgrown comparable never-scored firms before their first scored year (Fig. 1). From five years before the first score to the year before it, which we call the base year, their market capitalization grew 14.1 percent more (95% interval 3.1 to 25.3 percent) and their market-to-book (MTB) ratio 10.0 percent more (1.9 to 18.2 percent); the joint test of parallel pre-coverage trends rejects for market capitalization but not, at the 5% level, for MTB. Second, the run-up depends on how firms entered coverage (Fig. 2). It is large in the Thai and Singaporean cohorts of 2019 and 2020 and in the remaining smaller cohorts, but absent in the 289 Malaysian firms first scored in 2021 and 2022, a wave that extended coverage across a whole market. Third, under parallel trends from the base year, the average effect on log MTB over the first four years is 0.002 (95% interval −0.046 to 0.048), and it does not differ between firms with high and low initial scores, before or after the scores are purged of firm size. Fourth, a static two-way fixed effects regression on the same data attributes a 6.6 percent MTB increase to coverage.</w:t>
+        <w:t>The evidence has four parts. First, scored firms had outgrown never-scored firms of similar size, country, and industry before their first scored year (Fig. 1). From five years before the first score to the year before it, which we call the base year, their market capitalization grew 14.1 percent more (95% interval 3.1 to 25.3 percent) and their market-to-book (MTB) ratio 10.0 percent more (1.9 to 18.2 percent). The joint test of parallel pre-coverage trends rejects for market capitalization but not, at the 5% level, for MTB (p = 0.074), and the market capitalization run-up may partly reflect new shares. Second, the run-up differs across coverage waves (Fig. 2). It is large in the 108 Thai and Singaporean firms first scored in 2019 and 2020 and absent in the 289 Malaysian firms first scored in 2021 and 2022, the largest wave in the data. Third, under parallel trends from the base year, the average effect on log MTB over the first four years is 0.002 (95% interval −0.046 to 0.048). The difference between firms with high and low initial scores, the test of the preference channel, is −0.041 (p = 0.307), with a minimum detectable difference of 0.113, so we detect no difference but cannot exclude a moderate one. Fourth, a static two-way fixed effects regression on the same data attributes a 6.6 percent MTB increase to coverage.</w:t>
       </w:r>
     </w:p>
     <w:p>
@@ -159,7 +159,7 @@
       </w:pPr>
       <w:r>
         <w:rPr/>
-        <w:t>We do not claim that coverage has no effect on valuation. When we date coverage one year later, to the first year in which investors could have seen a score, MTB declines by about −6.6 percent relative to never-scored firms. This decline is measured from the end of the run-up, so it cannot separate a reversal of earlier growth from an effect of coverage. When post-coverage departures from parallel trends may reach a quarter of the largest pre-coverage year-to-year change (Rambachan &amp; Roth, 2023), the interval for the headline estimate widens to −0.071 to 0.073.</w:t>
+        <w:t>We do not claim that coverage has no effect on valuation. When we date coverage one year later, to the first year in which investors could have seen a score, the MTB ratio changes by −6.6 percent relative to never-scored firms (95% interval −10.9 to −2.0 percent). This decline is measured from the end of the run-up, so it cannot separate a reversal of earlier growth from an effect of coverage, and it loses significance if post-coverage trends may drift by about a quarter of the largest pre-coverage change. When post-coverage departures from parallel trends may reach a quarter of the largest pre-coverage year-to-year change (Rambachan &amp; Roth, 2023), the interval for the headline estimate widens to −0.071 to 0.073.</w:t>
       </w:r>
     </w:p>
     <w:p>
@@ -170,7 +170,7 @@
       </w:pPr>
       <w:r>
         <w:rPr/>
-        <w:t>The paper makes three contributions to sustainable finance. First, it adds valuation and an emerging-market setting to the rating-coverage literature (Bikmetova &amp; Pirinsky, 2026; Tsang et al., 2024, 2025) and documents which firms a major provider brought into the scored universe: in selective waves, firms that had just outgrown their peers. Second, it adds an extensive-margin event to the evidence on ratings and certification as price-relevant information: entering LSEG coverage, unlike a downgrade of an MSCI rating (Berg, Heeb, et al., 2022), was not followed by a detectable revaluation, whatever the score. Third, for empirical work on ESG premiums, it shows how selection into the scored universe can make scored firms look more valuable than they became because of the score.</w:t>
+        <w:t>The paper makes three contributions to sustainable finance. First, it adds valuation and an emerging-market setting to the rating-coverage literature (Bikmetova &amp; Pirinsky, 2026; Tsang et al., 2024, 2025) and documents which firms one provider brought into its scored universe: outside its largest wave, firms that had just outgrown their peers. Second, it adds the initiation of coverage to the evidence on ratings and certification as price-relevant information: entering LSEG coverage, unlike a downgrade of an MSCI rating (Berg, Heeb, et al., 2022), was not followed by a detectable revaluation for firms with high or low initial scores. Third, for empirical work on ESG premiums, it shows how selection into the scored universe can make scored firms look more valuable than the score itself made them.</w:t>
       </w:r>
     </w:p>
     <w:p>
@@ -417,7 +417,7 @@
       </w:pPr>
       <w:r>
         <w:rPr/>
-        <w:t>All five markets introduced sustainability reporting rules for listed firms during the sample period, at different times. Singapore requires every listed issuer to publish a comply-or-explain sustainability report for financial years ending on or after 31 December 2017 (Singapore Exchange, 2016). Bursa Malaysia required a sustainability statement in annual reports from financial years ending on or after 31 December 2016, starting with the largest companies and phasing in the others over the following two years (Bursa Malaysia, 2015). In the Philippines, listed companies have attached a sustainability report on a comply-or-explain basis to their annual reports since the reports for 2019, filed in 2020 (Securities and Exchange Commission Philippines, 2019). Indonesian listed companies must publish sustainability reports under a 2017 regulation whose obligation for listed companies began with 2020 (Otoritas Jasa Keuangan, 2017). Thai listed companies have reported sustainability information in the unified annual filing, the 56-1 One Report, since the fiscal year ending in 2021 (Tilleke &amp; Gibbins, 2020).</w:t>
+        <w:t>All five markets introduced sustainability reporting rules for listed firms during the sample period, at different times. Singapore requires every listed issuer to publish a comply-or-explain sustainability report for financial years ending on or after 31 December 2017 (Singapore Exchange, 2016). Bursa Malaysia required a sustainability statement in annual reports from financial years ending on or after 31 December 2016, starting with the largest companies and phasing in the others over the following two years (Bursa Malaysia, 2015). In the Philippines, listed companies have attached a sustainability report on a comply-or-explain basis to their annual reports since the reports for 2019, filed in 2020 (Securities and Exchange Commission Philippines, 2019). Indonesian listed companies must publish sustainability reports under a 2017 regulation whose obligation for listed companies began with 2020 (Otoritas Jasa Keuangan, 2017). Thai listed companies have had to report sustainability information in the unified annual filing, the 56-1 One Report, since the fiscal year ending in 2021 (Tilleke &amp; Gibbins, 2020); we could not confirm the dates of earlier Thai guidance.</w:t>
       </w:r>
     </w:p>
     <w:p>
@@ -439,7 +439,7 @@
       </w:pPr>
       <w:r>
         <w:rPr/>
-        <w:t>Table S2 and Fig. S1 of the Supplemental Appendix show that coverage arrived in waves: 108 first scores in Thailand and Singapore in 2019 and 2020, and 289 in Malaysia in 2021 and 2022. Of the 675 scored firms, 404, or 59.9 percent, are Malaysian, and Malaysian and Thai firms together make up 84.3 percent. The Malaysian wave began in fiscal 2021, before the November 2022 agreement, which concerned FTSE Russell scores. The waves do not line up with a single reporting rule: the Thai wave preceded the One Report, and the Malaysian wave began several years after Bursa Malaysia's rule was phased in. The data do not record why the provider expanded coverage when it did. The pooled estimates are weighted toward Malaysia and Thailand, and we report estimates by market and by wave.</w:t>
+        <w:t>Table S2 and Fig. S1 of the Supplemental Appendix show that coverage arrived in waves: 108 first scores in Thailand and Singapore in 2019 and 2020, and 289 in Malaysia in 2021 and 2022. Of the 675 scored firms, 404, or 59.9 percent, are Malaysian, and Malaysian and Thai firms together make up 84.3 percent. Because first scored fiscal years can precede publication (Section 3.2), the data cannot tell whether the Malaysian wave was linked to the November 2022 agreement, which concerned FTSE Russell scores. The waves do not line up with a single reporting rule: the Thai wave came before the One Report requirement, and the Malaysian wave came several years after Bursa Malaysia's rule was phased in. Singapore, Indonesia, and the Philippines have too few first scores per year (Table S2) to relate them to their rules. The data do not record why the provider expanded coverage when it did. The pooled estimates are weighted toward Malaysia and Thailand, and we report estimates by market and by wave.</w:t>
       </w:r>
     </w:p>
     <w:p>
@@ -475,7 +475,7 @@
       </w:pPr>
       <w:r>
         <w:rPr/>
-        <w:t>Dropping financial firms leaves 3,423 firms. A firm's first scored year, g, is its first fiscal year with an LSEG ESG score, and its base year is g − 1. Only 17 of the 675 scored firms have a later year without a score, so we treat coverage as permanent, the staggered-adoption setting of Callaway and Sant'Anna (2021). Excluding the 135 firms scored in 2014, which have no pre-coverage year, leaves 3,288 firms and 36,168 firm-years: 675 firms first scored between 2015 and 2024 and 2,613 never-scored firms. A firm-year enters an estimate only if its outcome is observed in both the base year and the comparison year. MTB ratios at or below zero, which reflect negative book equity, are set to missing; 28.0 percent of never-scored firm-years and 12.7 percent of scored firm-years lack a log MTB ratio. Table S4 of the Supplemental Appendix reports firm-years by outcome, and Table S6 reports scored firms by event year. Never-scored firms are smaller on average, and a check in Section 4.5 restricts scored firms to the size range of the controls.</w:t>
+        <w:t>We call firms without an LSEG score unscored, and the firms that never receive one in our sample never-scored; the latter form the comparison group. Dropping financial firms leaves 3,423 firms. A firm's first scored year, g, is its first fiscal year with an LSEG ESG score, and its base year is g − 1. Only 17 of the 675 scored firms have a later year without a score, so we treat coverage as permanent, the staggered-adoption setting of Callaway and Sant'Anna (2021). Excluding the 135 firms scored in 2014, which have no pre-coverage year, leaves 3,288 firms and 36,168 firm-years: 675 firms first scored between 2015 and 2024 and 2,613 never-scored firms. A firm-year enters an estimate only if its outcome is observed in both the base year and the comparison year. MTB ratios at or below zero, which reflect negative book equity, are set to missing; 28.0 percent of never-scored firm-years and 12.7 percent of scored firm-years lack a log MTB ratio. Table S4 of the Supplemental Appendix reports firm-years by outcome, and Table S6 reports scored firms by event year; counts differ slightly across tables because each counts the firms with the outcome observed in the base year and in the year concerned. Never-scored firms are smaller on average, and a check in Section 4.5 restricts scored firms to the size range of the controls.</w:t>
       </w:r>
     </w:p>
     <w:p>
@@ -2208,7 +2208,7 @@
       </w:pPr>
       <w:r>
         <w:rPr/>
-        <w:t>The design involves three choices. First, the baseline controls are never-scored firms; later-scored firms, which may also be growing toward the provider's universe, join them only in check R1 (Section 4.5). Second, all comparisons, including pre-coverage ones, use the base year, so a negative estimate θ̂(e) for e ≤ −2 means that scored firms grew faster than comparable never-scored firms from year g + e to the base year. Third, the covariates are measured in the base year, at the end of any run-up. Because the provider's scores rise with firm size (Dobrick et al., 2023), conditioning on base-year total assets matches scored firms to never-scored firms of similar size and can absorb part of the run-up. We therefore also report estimates without covariates, with total assets measured two years before the base year, and with indicators for quintiles of total assets instead of the quadratic.</w:t>
+        <w:t>The design involves three choices. First, the baseline controls are never-scored firms; later-scored firms, which may also be growing toward the provider's universe, join them only in check R1 (Section 4.5). Second, all comparisons, including pre-coverage ones, use the base year, so a negative estimate θ̂(e) for e ≤ −2 means that scored firms grew faster than never-scored firms with the same covariates from year g + e to the base year. Third, the covariates are measured in the base year, at the end of any run-up. Because the provider's scores rise with firm size (Dobrick et al., 2023), conditioning on base-year total assets matches scored firms to never-scored firms of similar size and can absorb part of the run-up. We therefore also report estimates without covariates, with total assets measured two years before the base year, and with indicators for quintiles of total assets instead of the quadratic.</w:t>
       </w:r>
     </w:p>
     <w:p>
@@ -3636,7 +3636,7 @@
       </w:pPr>
       <w:r>
         <w:rPr/>
-        <w:t>Fig. 1 plots the event-time estimates of Eq. (5) for all four outcomes. Before the first score, the estimates for market capitalization and MTB are negative and rise toward zero. In event years −5 and −4, the MTB estimates are −0.095 and −0.082 (p = 0.015 and p = 0.015). From event year −5 to the base year, scored firms' market capitalization grew 14.1 percent more than that of comparable never-scored firms, and their MTB ratio 10.0 percent more; with the cluster bootstrap, the 95% interval for the MTB run-up is 2.3 to 20.5 percent. We call this relative growth the run-up. The joint test of Eq. (8) rejects parallel pre-coverage trends for market capitalization (p = 0.022) but not at the 5% level for MTB (p = 0.074); with the cluster bootstrap, the tests give p = 0.001 and p = 0.225. As Roth (2022) cautions, a non-rejection is not evidence that pre-coverage trends are parallel. Log total assets follow a weaker version of the pattern, and leverage falls toward the base year (pre-trend p = 0.002).</w:t>
+        <w:t>Fig. 1 plots the event-time estimates of Eq. (5) for all four outcomes. Before the first score, the estimates for market capitalization and MTB are negative and rise toward zero. In event years −5 and −4, the MTB estimates are −0.095 and −0.082 (p = 0.015 and p = 0.015). From event year −5 to the base year, scored firms' market capitalization grew 14.1 percent more than that of never-scored firms, and their MTB ratio 10.0 percent more; with the cluster bootstrap, the 95% interval for the MTB run-up is 2.3 to 20.5 percent. We call this relative growth the run-up. The joint test of Eq. (8) rejects parallel pre-coverage trends for market capitalization (p = 0.022) but not at the 5% level for MTB (p = 0.074); with the cluster bootstrap, the tests give p = 0.001 and p = 0.225. As Roth (2022) cautions, a non-rejection is not evidence that pre-coverage trends are parallel. Log total assets follow a weaker version of the pattern, and leverage falls toward the base year (pre-trend p = 0.002).</w:t>
       </w:r>
     </w:p>
     <w:p>
@@ -3658,7 +3658,7 @@
       </w:pPr>
       <w:r>
         <w:rPr/>
-        <w:t>Fig. 2 separates the three coverage waves. The 108 Thai and Singaporean firms first scored in 2019 and 2020 show the largest run-up: from event year −5 to the base year, their MTB ratio grew 33.1 percent and their market capitalization 57.3 percent more than those of never-scored firms (pre-trend p = 0.006 and p &lt; 0.001). The 278 firms in all other cohorts, which entered coverage a few at a time, show the same pattern, with MTB growth of 10.8 percent (pre-trend p = 0.006). The 289 Malaysian firms first scored in 2021 and 2022 show no run-up: their pre-coverage MTB estimates range from −0.027 in event year −5 to 0.041 in event year −2 (pre-trend p = 0.549). Selection on prior growth therefore appears where the provider added firms selectively, not where it extended coverage across a market. After the first score, no wave shows an MTB gain: the estimates of Eq. (6) are 0.021 for the Malaysian wave, −0.009 for the Thai and Singaporean wave, and −0.016 for the other cohorts. Market capitalization fell after coverage in the Malaysian wave (−0.146, p = 0.005), which accounts for the negative pooled estimate.</w:t>
+        <w:t>Fig. 2 separates the two largest coverage waves from the remaining cohorts; we drew the wave boundaries from Table S2 after seeing the coverage counts, so this split is exploratory. The 108 Thai and Singaporean firms first scored in 2019 and 2020 show the largest run-up: from event year −5 to the base year, their MTB ratio grew 33.1 percent and their market capitalization 57.3 percent more than those of never-scored firms (pre-trend p = 0.006 and p &lt; 0.001). The 289 Malaysian firms first scored in 2021 and 2022 show no run-up: their pre-coverage MTB estimates range from −0.027 in event year −5 to 0.041 in event year −2 (pre-trend p = 0.549). The 278 firms in the remaining cohorts, which include 109 firms first scored in 2023, fall in between: their MTB ratio lies below that of never-scored firms by a similar amount in event years −5 and −2 (−0.103 and −0.108) and catches up in the base year (pre-trend p = 0.006), and their market capitalization shows no run-up (pre-trend p = 0.652). The Malaysian wave added 289 firms in two years, yet 565 Malaysian firms remained never-scored, so it was broad but not market-wide. After the first score, no group shows an MTB gain: the estimates of Eq. (6) are 0.021 for the Malaysian wave, −0.009 for the Thai and Singaporean wave, and −0.016 for the remaining cohorts. Market capitalization fell after coverage in the Malaysian wave (−0.146, p = 0.005), which accounts for the negative pooled estimate.</w:t>
       </w:r>
     </w:p>
     <w:p>
@@ -3683,7 +3683,7 @@
       </w:pPr>
       <w:r>
         <w:rPr/>
-        <w:t>Table 3 reports the robustness checks; rows R1 to R6 were pre-specified, and rows R7 to R11 are exploratory. Row R10 dates coverage one year after the first scored fiscal year, when a score could first have been published. Because scores were backfilled or revised (Berg et al., 2020; Sahin et al., 2023), this also moves the base year closer to the end of the run-up. The MTB effect is then −0.068, a change of about −6.6 percent (95% interval −0.116 to −0.020; p = 0.004), estimated from 646 scored and 2,412 control firms. With the cluster bootstrap, its interval is −0.125 to −0.018. Its joint pre-trend test gives p = 0.072, and with M̄ = 0.25 in Eq. (10) its interval, from −0.138 to 0.002, includes zero; the decline loses significance once M̄ reaches 0.23. Holding total assets at the original base year gives −0.074 (p = 0.002), and dating coverage two years later gives −0.048 (p = 0.057).</w:t>
+        <w:t>Table 3 reports the robustness checks; rows R1 to R6 were pre-specified, and rows R7 to R11 are exploratory. Row R10 dates coverage one year after the first scored fiscal year, when a score could first have been published. Because scores were backfilled or revised (Berg et al., 2020; Sahin et al., 2023), this also moves the base year closer to the end of the run-up. The MTB effect is then −0.068, a change of about −6.6 percent (95% interval −0.116 to −0.020; p = 0.004), estimated from 646 scored and 2,412 control firms. With the cluster bootstrap, its interval is −0.125 to −0.018. Its joint pre-trend test gives p = 0.072, and with M̄ = 0.25 in Eq. (10) its interval, from −0.138 to 0.002, includes zero; the decline loses significance once M̄ reaches 0.23. Holding total assets at the original base year gives −0.074 (p = 0.002), so the covariate timing does not drive R10. Dating coverage two years later gives −0.048 (95% interval −0.099 to 0.000), a smaller decline that is no longer significant at the 5% level.</w:t>
       </w:r>
     </w:p>
     <w:p>
@@ -3694,7 +3694,7 @@
       </w:pPr>
       <w:r>
         <w:rPr/>
-        <w:t>Fig. S2 of the Supplemental Appendix plots the event-time path under R10. The decline grows with time since coverage, from −0.039 in the re-dated event year 0 to −0.200 in event year 3. The baseline path in Fig. 1 does not show this because its later event years come from early cohorts while its first post-coverage years pool all cohorts. Re-based within each cohort to the first scored year, the baseline estimates for event years 3 and 4 are −0.083 and −0.167, much closer to the corresponding R10 estimates of −0.138 and −0.200 than the pooled baseline path suggests. Both specifications therefore show that early cohorts lost value relative to never-scored firms in their third and fourth years of coverage. If firms are selected at an unusually high valuation that later partly reverses, the decline measures the reversal and can hide an offsetting positive effect of coverage; if valuations would otherwise have stayed at their pre-coverage peak, coverage lowered them. The data cannot separate the two readings.</w:t>
+        <w:t>Fig. S2 of the Supplemental Appendix plots the event-time path under R10. The decline grows with time since coverage, from −0.039 in the re-dated event year 0 to −0.200 in event year 3. The baseline path in Fig. 1 does not show this because its later event years come from early cohorts while its first post-coverage years pool all cohorts. Re-based within each cohort to the first scored year, the baseline point estimates for event years 3 and 4 are −0.083 and −0.167, much closer to the corresponding R10 estimates of −0.138 and −0.200 than the pooled baseline path suggests; we report these re-based values without standard errors, as a reconciliation of the two paths rather than as a test. The long-horizon reading therefore rests on the R10 path and its interval, which come from the early cohorts only. If firms are selected at an unusually high valuation that later partly reverses, the decline measures the reversal and can hide an offsetting positive effect of coverage; if valuations would otherwise have stayed at their pre-coverage peak, coverage lowered them. The data cannot separate the two readings.</w:t>
       </w:r>
     </w:p>
     <w:p>
@@ -3752,7 +3752,7 @@
       </w:pPr>
       <w:r>
         <w:rPr/>
-        <w:t>Table S7 and Fig. S2 of the Supplemental Appendix vary the size covariate and the support. The MTB run-up is not an artifact of conditioning on base-year total assets: without covariates the MTB estimate for event year −5 is −0.064 (pre-trend p = 0.028), and with total assets measured two years before the base year it is −0.077, close to the baseline, although the joint test then gives p = 0.176. The post-coverage MTB effect is −0.008 with total assets measured two years earlier and −0.010 with quintile indicators. Restricting scored firms to those no larger than the 95th percentile of never-scored firms in their cell keeps 492 scored firms and gives −0.021 (p = 0.426). The post-coverage MTB estimate therefore does not depend on extrapolating the size adjustment to the largest firms.</w:t>
+        <w:t>Table S7 and Fig. S2 of the Supplemental Appendix vary the size covariate and the support. The run-up does not depend on conditioning on base-year total assets. Without covariates, the run-up from event year −5 to the base year is 6.6 percent for MTB (event year −5 p = 0.068; pre-trend p = 0.028), weaker than the baseline, and 24.0 percent for market capitalization. With total assets measured two years before the base year, it is 8.0 percent for MTB (pre-trend p = 0.176) and 20.3 percent for market capitalization. The post-coverage MTB effect is −0.008 with total assets measured two years earlier and −0.010 with quintile indicators. Restricting scored firms to those no larger than the 95th percentile of never-scored firms in their cell changes the estimand to the effect on scored firms within the controls' size range; it keeps 492 scored firms and gives −0.021 for MTB (p = 0.426; pre-trend p = 0.212) and −0.096 for market capitalization (p = 0.006). The post-coverage MTB estimate therefore does not depend on extrapolating the size adjustment to the largest firms, whereas the negative market capitalization effect is larger within the controls' size range.</w:t>
       </w:r>
     </w:p>
     <w:p>
@@ -3824,7 +3824,7 @@
       </w:pPr>
       <w:r>
         <w:rPr/>
-        <w:t>Under assumption (2), the largest increase compatible with the headline interval is of the same order as the announcement return of 4.86 percent that Demiroglu and Ryngaert (2010) report for the first analyst coverage of neglected stocks, and twice the one-year abnormal return that follows an MSCI downgrade (Berg, Heeb, et al., 2022). Annual year-end ratios would miss short-lived price pressure, so our estimates concern lasting revaluation of the kind a permanent rise in investor recognition would produce (Chen et al., 2004; Merton, 1987). A lasting effect half as large as the MTB run-up would lie at the upper end of the headline interval, so any such effect is small relative to the growth that precedes selective coverage.</w:t>
+        <w:t>Under assumption (2), the largest increase compatible with the headline interval is of the same order as the announcement return of 4.86 percent that Demiroglu and Ryngaert (2010) report for the first analyst coverage of neglected stocks, and twice the one-year abnormal return that follows an MSCI downgrade (Berg, Heeb, et al., 2022). Annual year-end ratios would miss short-lived price pressure, so our estimates concern lasting revaluation of the kind a permanent rise in investor recognition would produce (Chen et al., 2004; Merton, 1987). A lasting effect half as large as the MTB run-up would lie at the upper end of the headline interval, so any such effect is small relative to the growth that preceded coverage.</w:t>
       </w:r>
     </w:p>
     <w:p>
@@ -3862,7 +3862,7 @@
       </w:pPr>
       <w:r>
         <w:rPr/>
-        <w:t>The clearest result is an ordering of events. In selective coverage waves, firms entered the scored universe after their MTB ratio and market capitalization had grown faster than those of comparable unscored firms, and their MTB ratio stopped gaining afterwards. In the wholesale Malaysian expansion, there was no run-up and no later gain. Several mechanisms fit this ordering. The provider may have added firms once they had grown large and visible enough to matter to its clients (Section 2.3). Firms may have become scoreable by publishing a first sustainability report, joining an index, or issuing equity, any of which can coincide with rising value; the fall in leverage toward the base year is consistent with equity issuance. Firms may also have started or expanded sustainability reporting when they were doing well or planned to raise capital, a strategic-disclosure reading that our data cannot test. Each of these mechanisms implies the same lesson for empirical work: entry into a provider's coverage marks the end of a period of relative growth, not a random draw.</w:t>
+        <w:t>The clearest result is an ordering of events. On average, firms entered the scored universe after their MTB ratio and market capitalization had grown faster than those of never-scored firms, and their MTB ratio stopped gaining afterwards. The run-up was strongest in the Thai and Singaporean wave of 2019 and 2020 and absent in the large Malaysian wave of 2021 and 2022, which added many firms of one market within two years; in neither wave do we detect a later gain. Several mechanisms fit this ordering. The provider may have added firms once they had grown large and visible enough to matter to its clients (Section 2.3). Firms may have become scoreable by publishing a first sustainability report, joining an index, or issuing equity, any of which can coincide with rising value; the fall in leverage toward the base year is consistent with equity issuance. Firms may also have started or expanded sustainability reporting when they were doing well or planned to raise capital, a strategic-disclosure reading that our data cannot test. Each of these mechanisms implies the same lesson for empirical work: entry into a provider's coverage marks the end of a period of relative growth, not a random draw.</w:t>
       </w:r>
     </w:p>
     <w:p>
@@ -3873,7 +3873,7 @@
       </w:pPr>
       <w:r>
         <w:rPr/>
-        <w:t>The flat post-coverage MTB path in the baseline admits three readings, depending on the counterfactual trend (Rambachan &amp; Roth, 2023; Roth, 2022). With parallel paths from the base year, coverage had no effect within the interval of Section 5.2. With a continued run-up, coverage lowered valuations relative to trend. With a partly transitory run-up, the flat path is consistent with a positive coverage effect that offset a reversal. The awareness evidence on index additions predicts a permanent gain from recognition (Chen et al., 2004), so a recognition effect of that kind should have appeared as a lasting rise after coverage; we detect none under assumption (2). The publication-dated estimates and the within-cohort re-basing in Section 5.4 show a decline in the third and fourth years of coverage for early cohorts, which a reversal would produce and a positive coverage effect could partly offset. The evidence therefore does not show that coverage has no effect: no heterogeneity-robust specification detects a valuation gain, and the bounds do not exclude one.</w:t>
+        <w:t>The flat post-coverage MTB path in the baseline admits three readings, depending on the counterfactual trend (Rambachan &amp; Roth, 2023; Roth, 2022). With parallel paths from the base year, coverage had no effect within the interval of Section 5.2. With a continued run-up, coverage lowered valuations relative to trend. With a partly transitory run-up, the flat path is consistent with a positive coverage effect that offset a reversal. The awareness evidence on index additions predicts a permanent gain from recognition (Chen et al., 2004), so a recognition effect of that kind should have appeared as a lasting rise after coverage; we detect none under assumption (2). The publication-dated estimates in Section 5.4 show a decline in the third and fourth years of coverage for early cohorts, which a reversal would produce and a positive coverage effect could partly offset, but which could also reflect a negative effect of coverage. The evidence therefore does not show that coverage has no effect: no heterogeneity-robust specification detects a valuation gain, and the bounds do not exclude one.</w:t>
       </w:r>
     </w:p>
     <w:p>
@@ -3909,7 +3909,7 @@
       </w:pPr>
       <w:r>
         <w:rPr/>
-        <w:t>The pre-coverage run-up also bears on the evidence on ESG demand. Pástor et al. (2022) show that realized green returns can reflect unexpected shifts in demand. A run-up followed by a flat path is what a one-time demand shift, or selection after one, would produce. Without ownership data, we cannot tell whether ESG investors bought these firms before or after coverage.</w:t>
+        <w:t>The pre-coverage run-up also bears on the evidence on ESG demand. Pástor et al. (2022) show that realized green returns can reflect unexpected shifts in demand. A run-up followed by a flat path is what a one-time demand shift, or selection after one, would produce. Without ownership data, we cannot tell whether ESG investors bought these firms before or after coverage. In the Section 4.4 bound with M̄ = 0.25, the data admit MTB changes from −6.9 to 7.5 percent, so a demand shift of a few percent after coverage cannot be excluded.</w:t>
       </w:r>
     </w:p>
     <w:p>
@@ -3934,7 +3934,7 @@
       </w:pPr>
       <w:r>
         <w:rPr/>
-        <w:t>The results have implications for five groups, each bounded by the design: one provider, annual data, five markets, and no data on ownership, returns, or publication dates.</w:t>
+        <w:t>The results have implications for five groups, each bounded by the design: one provider whose score is not the rating shown to drive ESG fund holdings, annual data, five markets, and no data on ownership, returns, or publication dates.</w:t>
       </w:r>
     </w:p>
     <w:p>
@@ -3945,7 +3945,7 @@
       </w:pPr>
       <w:r>
         <w:rPr/>
-        <w:t>For rating providers and data users, the scored universe in these markets tilts toward large firms that have just outgrown their peers (Table 1, Figs. 1 and 2). Investors and researchers who use the provider's history should know that the first scored fiscal year can precede publication and that history may have been filled in, so backtests around coverage initiation may suffer from look-ahead bias (Berg et al., 2020; Sahin et al., 2023).</w:t>
+        <w:t>For rating providers and data users, the LSEG scored universe in these markets tilts toward large firms, and outside the Malaysian wave toward firms that have just outgrown their peers (Table 1, Figs. 1 and 2). Investors and researchers who use the provider's history should know that the first scored fiscal year can precede publication and that history may have been filled in, so backtests around coverage initiation may suffer from look-ahead bias (Berg et al., 2020; Sahin et al., 2023).</w:t>
       </w:r>
     </w:p>
     <w:p>
@@ -3956,7 +3956,7 @@
       </w:pPr>
       <w:r>
         <w:rPr/>
-        <w:t>For exchanges, the Malaysian wave shows that coverage extended across a whole market does not carry the selection on prior growth that selective coverage does (Fig. 2). Exchange-provider arrangements of this kind (Bernama, 2022) broaden the scored universe toward smaller firms. Our data do not show whether such arrangements raise the value of the firms they cover; in the Malaysian wave, we detect no MTB gain.</w:t>
+        <w:t>For exchanges, the large Malaysian wave carried no run-up (Fig. 2), which suggests that broad expansions of coverage within a market select less on prior growth than additions of individual firms. We do not observe what caused that wave, and we cannot attribute it to the November 2022 arrangement between Bursa Malaysia and LSEG (Bernama, 2022). Our data do not show whether broader coverage raises the value of the firms it reaches; in the Malaysian wave, we detect no MTB gain.</w:t>
       </w:r>
     </w:p>
     <w:p>
@@ -3978,7 +3978,7 @@
       </w:pPr>
       <w:r>
         <w:rPr/>
-        <w:t>For ESG investors and index builders, screens restricted to scored stocks admit firms after a valuation run-up, in selective waves. Our annual MTB data cannot speak to the returns of a strategy that buys newly scored firms.</w:t>
+        <w:t>For ESG investors and index builders who rely on this provider, screens restricted to scored stocks admitted many firms after a valuation run-up. Our annual MTB data cannot speak to the returns of a strategy that buys newly scored firms.</w:t>
       </w:r>
     </w:p>
     <w:p>
@@ -3989,7 +3989,7 @@
       </w:pPr>
       <w:r>
         <w:rPr/>
-        <w:t>For listed firms in the five markets, the estimates give no support, under assumption (2), to the expectation that a first LSEG score will raise their valuation through investor recognition or preferences (Merton, 1987; Pástor et al., 2021); the confidence interval excludes increases above 4.9 percent, but smaller effects remain possible. For empirical research, a cross-sectional valuation premium of scored firms, or a static TWFE estimate, can reflect selection into coverage rather than an effect of scores (Table S8). Studies comparing scored and unscored firms in these markets should model coverage timing and report pre-coverage dynamics. These data cannot show whether the ordering extends to other markets or providers.</w:t>
+        <w:t>For listed firms in the five markets, the estimates give no support, under assumption (2), to the expectation that a first LSEG score will raise their valuation through investor recognition or preferences (Merton, 1987; Pástor et al., 2021); the confidence interval excludes increases above 4.9 percent with the firm bootstrap and above 5.5 percent with the cluster bootstrap, but smaller effects remain possible. For empirical research, a cross-sectional valuation premium of scored firms, or a static TWFE estimate, can reflect selection into coverage rather than an effect of scores (Table S8). Studies comparing scored and unscored firms in these markets should model coverage timing and report pre-coverage dynamics. These data cannot show whether the ordering extends to other markets or providers.</w:t>
       </w:r>
     </w:p>
     <w:p>
@@ -4013,7 +4013,7 @@
       </w:pPr>
       <w:r>
         <w:rPr/>
-        <w:t>The study has eight limitations. First, the provider chooses when to cover a firm, and we have no coverage variation unrelated to firm performance. The post-coverage estimates rest on conditional parallel trends from the base year, which the pre-coverage estimates question, and our sensitivity analysis uses a linear trend and a simplified bound, not the confidence sets of Rambachan and Roth (2023). Second, the data are annual and may contain backfilled or revised scores, so we observe neither first-score publication dates nor announcement returns; later dating closes only part of this gap. Third, we observe only LSEG coverage; for firms with earlier scores from other providers, such as FTSE Russell scores for Malaysian index constituents (Bernama, 2022), the event is an additional score. Fourth, without stock returns, shares outstanding, ownership, foreign holdings, foreign-ownership limits, index membership, or firm-level sustainability report dates, we cannot separate price changes from share issuance, test the recognition channel directly, or link first scores to index entry or first sustainability reports. The reporting rules in Section 3.1 are dated at the market level from regulatory sources, not observed for each firm. Fifth, a few market capitalization values are implausibly large; pooled winsorization limits but does not correct them, and return on assets covers a minority of firm-years. Sixth, Malaysian and Thai firms make up 84.3 percent of scored firms and dominate the pooled estimates; resampling market-by-industry clusters addresses part of the dependence within coverage waves, but five markets are too few for market-level inference. Seventh, the minimum detectable effect on log MTB is 0.067, about 7.0 percent, so smaller effects would be detected with less than 80% probability. Eighth, the unrecorded download date leaves the vintage of revisable recent scores uncertain.</w:t>
+        <w:t>The study has eight limitations. First, the provider chooses when to cover a firm, and we have no coverage variation unrelated to firm performance. The post-coverage estimates rest on conditional parallel trends from the base year, which the pre-coverage estimates question, and our sensitivity analysis uses a linear trend and a simplified bound, not the confidence sets of Rambachan and Roth (2023). Second, the data are annual and may contain backfilled or revised scores, so we observe neither first-score publication dates nor announcement returns; later dating closes only part of this gap. Third, we observe only LSEG coverage. The LSEG score is not the rating that the cited evidence links to ESG fund holdings (Berg, Heeb, et al., 2022), and for firms with earlier scores from other providers, such as FTSE Russell scores for Malaysian index constituents (Bernama, 2022), the event is an additional score. We do not examine domestic ESG channels such as exchange sustainability indices or Shariah screens. Fourth, without stock returns, shares outstanding, ownership, foreign holdings, foreign-ownership limits, index membership, or firm-level sustainability report dates, we cannot separate price changes from share issuance, test the recognition channel directly, or link first scores to index entry or first sustainability reports. The reporting rules in Section 3.1 are dated at the market level from regulatory texts and, for Thailand and Malaysia, from secondary summaries, not observed for each firm. Fifth, a few market capitalization values are implausibly large; pooled winsorization limits but does not correct them, and return on assets covers a minority of firm-years. Sixth, Malaysian and Thai firms make up 84.3 percent of scored firms and dominate the pooled estimates; resampling market-by-industry clusters addresses part of the dependence within coverage waves, but five markets are too few for market-level inference. Seventh, the minimum detectable effect on log MTB is 0.067, about 7.0 percent, so smaller effects would be detected with less than 80% probability. Eighth, the unrecorded download date leaves the vintage of revisable recent scores uncertain.</w:t>
       </w:r>
     </w:p>
     <w:p>
@@ -4037,7 +4037,7 @@
       </w:pPr>
       <w:r>
         <w:rPr/>
-        <w:t>Entry into LSEG ESG coverage in five Southeast Asian markets followed relative growth when the provider added firms selectively, and it was not followed by a detected rise in market-to-book ratios. Scored firms grew faster than comparable never-scored firms before their first scored year, by 10.0 percent in MTB (1.9 to 18.2 percent), while the Malaysian firms covered in a wholesale expansion showed no such run-up. Under parallel trends, the headline effect is 0.002 (95% interval −0.046 to 0.048), with no difference by the level of the score, and dating coverage one year later gives a decline of about −6.6 percent that may reflect a reversal of the run-up. Departures from parallel trends like those before coverage would admit effects of several percent in either direction. Comparisons of scored and unscored firms that ignore coverage timing can attribute this selection to the score.</w:t>
+        <w:t>Entry into LSEG ESG coverage in five Southeast Asian markets followed relative growth on average, and it was not followed by a detected rise in market-to-book ratios. Scored firms grew faster than never-scored firms of similar size, country, and industry before their first scored year, by 10.0 percent in MTB (1.9 to 18.2 percent), while the Malaysian firms covered in the large 2021 and 2022 wave showed no such run-up. Under parallel trends, the headline effect is 0.002 (95% interval −0.046 to 0.048), and we detect no difference between firms with high and low initial scores. Dating coverage one year later gives an MTB change of −6.6 percent, which may reflect a reversal of the run-up or a negative effect of coverage. Departures from parallel trends like those before coverage would admit effects of several percent in either direction. Comparisons of scored and unscored firms that ignore coverage timing can attribute this selection to the score.</w:t>
       </w:r>
     </w:p>
     <w:p>

</xml_diff>